<commit_message>
Add second author (Yehudit Aperstein) and affiliations; rebuild DOCX
Co-Authored-By: Claude Opus 4.8 <noreply@anthropic.com>
</commit_message>
<xml_diff>
--- a/docs/paper.docx
+++ b/docs/paper.docx
@@ -70,7 +70,7 @@
         <w:t xml:space="preserve">Transfer</w:t>
       </w:r>
     </w:p>
-    <w:bookmarkStart w:id="69" w:name="X1bdb714755ce25c46395328e9b34aff9fcc1361"/>
+    <w:bookmarkStart w:id="70" w:name="X1bdb714755ce25c46395328e9b34aff9fcc1361"/>
     <w:p>
       <w:pPr>
         <w:pStyle w:val="Heading1"/>
@@ -87,6 +87,21 @@
       <w:r>
         <w:t xml:space="preserve">Alexander Apartsin</w:t>
       </w:r>
+      <w:r>
+        <w:rPr>
+          <w:vertAlign w:val="superscript"/>
+        </w:rPr>
+        <w:t xml:space="preserve">1</w:t>
+      </w:r>
+      <w:r>
+        <w:t xml:space="preserve">, Yehudit Aperstein</w:t>
+      </w:r>
+      <w:r>
+        <w:rPr>
+          <w:vertAlign w:val="superscript"/>
+        </w:rPr>
+        <w:t xml:space="preserve">2</w:t>
+      </w:r>
     </w:p>
     <w:p>
       <w:pPr>
@@ -94,12 +109,56 @@
         <w:jc w:val="both"/>
       </w:pPr>
       <w:r>
-        <w:t xml:space="preserve">Working paper, August 2026 · Code, data, and results:</w:t>
+        <w:rPr>
+          <w:vertAlign w:val="superscript"/>
+        </w:rPr>
+        <w:t xml:space="preserve">1</w:t>
+      </w:r>
+      <w:r>
+        <w:t xml:space="preserve">School of Computer Science, Faculty of Sciences, Holon Institute of Technology (HIT), Holon, Israel  · </w:t>
+      </w:r>
+      <w:r>
+        <w:t xml:space="preserve"> </w:t>
+      </w:r>
+      <w:r>
+        <w:rPr>
+          <w:vertAlign w:val="superscript"/>
+        </w:rPr>
+        <w:t xml:space="preserve">2</w:t>
+      </w:r>
+      <w:r>
+        <w:t xml:space="preserve">Intelligent Systems, Afeka Academic College of Engineering, Tel-Aviv, Israel</w:t>
+      </w:r>
+    </w:p>
+    <w:p>
+      <w:pPr>
+        <w:pStyle w:val="BodyText"/>
+        <w:jc w:val="both"/>
+      </w:pPr>
+      <w:r>
+        <w:t xml:space="preserve">Working paper, August 2026 ·</w:t>
       </w:r>
       <w:r>
         <w:t xml:space="preserve"> </w:t>
       </w:r>
       <w:hyperlink r:id="rId20">
+        <w:r>
+          <w:rPr>
+            <w:rStyle w:val="Hyperlink"/>
+          </w:rPr>
+          <w:t xml:space="preserve">Download DOCX</w:t>
+        </w:r>
+      </w:hyperlink>
+      <w:r>
+        <w:t xml:space="preserve"> </w:t>
+      </w:r>
+      <w:r>
+        <w:t xml:space="preserve">· Code, data, and results:</w:t>
+      </w:r>
+      <w:r>
+        <w:t xml:space="preserve"> </w:t>
+      </w:r>
+      <w:hyperlink r:id="rId21">
         <w:r>
           <w:rPr>
             <w:rStyle w:val="Hyperlink"/>
@@ -108,7 +167,7 @@
         </w:r>
       </w:hyperlink>
     </w:p>
-    <w:bookmarkStart w:id="21" w:name="abstract"/>
+    <w:bookmarkStart w:id="22" w:name="abstract"/>
     <w:p>
       <w:pPr>
         <w:pStyle w:val="Heading2"/>
@@ -216,8 +275,8 @@
         <w:t xml:space="preserve">noise as much as generalization, and separating these components is the benchmark's central contribution.</w:t>
       </w:r>
     </w:p>
-    <w:bookmarkEnd w:id="21"/>
-    <w:bookmarkStart w:id="22" w:name="introduction"/>
+    <w:bookmarkEnd w:id="22"/>
+    <w:bookmarkStart w:id="23" w:name="introduction"/>
     <w:p>
       <w:pPr>
         <w:pStyle w:val="Heading2"/>
@@ -464,8 +523,8 @@
         <w:t xml:space="preserve">alongside genuine domain shift, and this paper separates the components on the same population.</w:t>
       </w:r>
     </w:p>
-    <w:bookmarkEnd w:id="22"/>
-    <w:bookmarkStart w:id="28" w:name="related-work"/>
+    <w:bookmarkEnd w:id="23"/>
+    <w:bookmarkStart w:id="29" w:name="related-work"/>
     <w:p>
       <w:pPr>
         <w:pStyle w:val="Heading2"/>
@@ -474,7 +533,7 @@
         <w:t xml:space="preserve">2. Related work</w:t>
       </w:r>
     </w:p>
-    <w:bookmarkStart w:id="23" w:name="X5fb5855b993ac7dc9bcc0859b0dfbeff1c94711"/>
+    <w:bookmarkStart w:id="24" w:name="X5fb5855b993ac7dc9bcc0859b0dfbeff1c94711"/>
     <w:p>
       <w:pPr>
         <w:pStyle w:val="Heading3"/>
@@ -576,8 +635,8 @@
         <w:t xml:space="preserve">peer-reviewed US-city transformer-on-311 routing benchmark exists, which is the gap we fill.</w:t>
       </w:r>
     </w:p>
-    <w:bookmarkEnd w:id="23"/>
-    <w:bookmarkStart w:id="24" w:name="X992458992748ac1c44ad1a7dd367cee43133e72"/>
+    <w:bookmarkEnd w:id="24"/>
+    <w:bookmarkStart w:id="25" w:name="X992458992748ac1c44ad1a7dd367cee43133e72"/>
     <w:p>
       <w:pPr>
         <w:pStyle w:val="Heading3"/>
@@ -637,8 +696,8 @@
         <w:t xml:space="preserve">and register shift jointly.</w:t>
       </w:r>
     </w:p>
-    <w:bookmarkEnd w:id="24"/>
-    <w:bookmarkStart w:id="25" w:name="X270759e30e44273df6406f8e5efd5340823f87d"/>
+    <w:bookmarkEnd w:id="25"/>
+    <w:bookmarkStart w:id="26" w:name="X270759e30e44273df6406f8e5efd5340823f87d"/>
     <w:p>
       <w:pPr>
         <w:pStyle w:val="Heading3"/>
@@ -746,8 +805,8 @@
         <w:t xml:space="preserve">transfer.</w:t>
       </w:r>
     </w:p>
-    <w:bookmarkEnd w:id="25"/>
-    <w:bookmarkStart w:id="26" w:name="X6eb18574c758212910494a936ccf31038e4de6d"/>
+    <w:bookmarkEnd w:id="26"/>
+    <w:bookmarkStart w:id="27" w:name="X6eb18574c758212910494a936ccf31038e4de6d"/>
     <w:p>
       <w:pPr>
         <w:pStyle w:val="Heading3"/>
@@ -822,8 +881,8 @@
         <w:t xml:space="preserve">liability.</w:t>
       </w:r>
     </w:p>
-    <w:bookmarkEnd w:id="26"/>
-    <w:bookmarkStart w:id="27" w:name="civic-tech-datasets-and-311-equity"/>
+    <w:bookmarkEnd w:id="27"/>
+    <w:bookmarkStart w:id="28" w:name="civic-tech-datasets-and-311-equity"/>
     <w:p>
       <w:pPr>
         <w:pStyle w:val="Heading3"/>
@@ -883,9 +942,9 @@
         <w:t xml:space="preserve">tradition motivates treating city labels as noisy and non-neutral, which our judge quantifies directly.</w:t>
       </w:r>
     </w:p>
-    <w:bookmarkEnd w:id="27"/>
     <w:bookmarkEnd w:id="28"/>
-    <w:bookmarkStart w:id="32" w:name="corpus-construction"/>
+    <w:bookmarkEnd w:id="29"/>
+    <w:bookmarkStart w:id="33" w:name="corpus-construction"/>
     <w:p>
       <w:pPr>
         <w:pStyle w:val="Heading2"/>
@@ -894,7 +953,7 @@
         <w:t xml:space="preserve">3. Corpus construction</w:t>
       </w:r>
     </w:p>
-    <w:bookmarkStart w:id="29" w:name="the-free-text-availability-problem"/>
+    <w:bookmarkStart w:id="30" w:name="the-free-text-availability-problem"/>
     <w:p>
       <w:pPr>
         <w:pStyle w:val="Heading3"/>
@@ -984,8 +1043,8 @@
         <w:t xml:space="preserve">confirmed by inspection.</w:t>
       </w:r>
     </w:p>
-    <w:bookmarkEnd w:id="29"/>
-    <w:bookmarkStart w:id="30" w:name="cities"/>
+    <w:bookmarkEnd w:id="30"/>
+    <w:bookmarkStart w:id="31" w:name="cities"/>
     <w:p>
       <w:pPr>
         <w:pStyle w:val="Heading3"/>
@@ -1458,8 +1517,8 @@
         <w:t xml:space="preserve">confounded with jurisdiction and that we return to in Section 9.</w:t>
       </w:r>
     </w:p>
-    <w:bookmarkEnd w:id="30"/>
-    <w:bookmarkStart w:id="31" w:name="text-hygiene-and-informativeness"/>
+    <w:bookmarkEnd w:id="31"/>
+    <w:bookmarkStart w:id="32" w:name="text-hygiene-and-informativeness"/>
     <w:p>
       <w:pPr>
         <w:pStyle w:val="Heading3"/>
@@ -1543,9 +1602,9 @@
         <w:t xml:space="preserve">Requests also contain street addresses and occasional phone numbers, which we address in Section 10.</w:t>
       </w:r>
     </w:p>
-    <w:bookmarkEnd w:id="31"/>
     <w:bookmarkEnd w:id="32"/>
-    <w:bookmarkStart w:id="33" w:name="taxonomy-harmonization"/>
+    <w:bookmarkEnd w:id="33"/>
+    <w:bookmarkStart w:id="34" w:name="taxonomy-harmonization"/>
     <w:p>
       <w:pPr>
         <w:pStyle w:val="Heading2"/>
@@ -1617,8 +1676,8 @@
         <w:t xml:space="preserve">disagreement.</w:t>
       </w:r>
     </w:p>
-    <w:bookmarkEnd w:id="33"/>
-    <w:bookmarkStart w:id="34" w:name="experimental-setup"/>
+    <w:bookmarkEnd w:id="34"/>
+    <w:bookmarkStart w:id="35" w:name="experimental-setup"/>
     <w:p>
       <w:pPr>
         <w:pStyle w:val="Heading2"/>
@@ -1816,8 +1875,8 @@
         <w:t xml:space="preserve">cross-jurisdiction condition. Hyperparameters and the verbatim prompt are released with the code.</w:t>
       </w:r>
     </w:p>
-    <w:bookmarkEnd w:id="34"/>
-    <w:bookmarkStart w:id="41" w:name="results"/>
+    <w:bookmarkEnd w:id="35"/>
+    <w:bookmarkStart w:id="42" w:name="results"/>
     <w:p>
       <w:pPr>
         <w:pStyle w:val="Heading2"/>
@@ -1835,18 +1894,18 @@
           <wp:inline>
             <wp:extent cx="5334000" cy="3269225"/>
             <wp:effectExtent b="0" l="0" r="0" t="0"/>
-            <wp:docPr descr="In-city vs cross-city macro-F1 by model" title="" id="36" name="Picture"/>
+            <wp:docPr descr="In-city vs cross-city macro-F1 by model" title="" id="37" name="Picture"/>
             <a:graphic>
               <a:graphicData uri="http://schemas.openxmlformats.org/drawingml/2006/picture">
                 <pic:pic>
                   <pic:nvPicPr>
-                    <pic:cNvPr descr="fig_transfer.png" id="37" name="Picture"/>
+                    <pic:cNvPr descr="fig_transfer.png" id="38" name="Picture"/>
                     <pic:cNvPicPr>
                       <a:picLocks noChangeArrowheads="1" noChangeAspect="1"/>
                     </pic:cNvPicPr>
                   </pic:nvPicPr>
                   <pic:blipFill>
-                    <a:blip r:embed="rId35"/>
+                    <a:blip r:embed="rId36"/>
                     <a:stretch>
                       <a:fillRect/>
                     </a:stretch>
@@ -2237,18 +2296,18 @@
           <wp:inline>
             <wp:extent cx="5334000" cy="2895600"/>
             <wp:effectExtent b="0" l="0" r="0" t="0"/>
-            <wp:docPr descr="Per-city cross-city macro-F1 by model" title="" id="39" name="Picture"/>
+            <wp:docPr descr="Per-city cross-city macro-F1 by model" title="" id="40" name="Picture"/>
             <a:graphic>
               <a:graphicData uri="http://schemas.openxmlformats.org/drawingml/2006/picture">
                 <pic:pic>
                   <pic:nvPicPr>
-                    <pic:cNvPr descr="fig_percity.png" id="40" name="Picture"/>
+                    <pic:cNvPr descr="fig_percity.png" id="41" name="Picture"/>
                     <pic:cNvPicPr>
                       <a:picLocks noChangeArrowheads="1" noChangeAspect="1"/>
                     </pic:cNvPicPr>
                   </pic:nvPicPr>
                   <pic:blipFill>
-                    <a:blip r:embed="rId38"/>
+                    <a:blip r:embed="rId39"/>
                     <a:stretch>
                       <a:fillRect/>
                     </a:stretch>
@@ -2299,8 +2358,8 @@
         <w:t xml:space="preserve">city, and San Francisco (two content classes only) is degenerate; we handle it explicitly in Section 9.</w:t>
       </w:r>
     </w:p>
-    <w:bookmarkEnd w:id="41"/>
-    <w:bookmarkStart w:id="48" w:name="what-the-gap-measures"/>
+    <w:bookmarkEnd w:id="42"/>
+    <w:bookmarkStart w:id="49" w:name="what-the-gap-measures"/>
     <w:p>
       <w:pPr>
         <w:pStyle w:val="Heading2"/>
@@ -2366,18 +2425,18 @@
           <wp:inline>
             <wp:extent cx="5334000" cy="3097161"/>
             <wp:effectExtent b="0" l="0" r="0" t="0"/>
-            <wp:docPr descr="Strict vs lenient accuracy by model" title="" id="43" name="Picture"/>
+            <wp:docPr descr="Strict vs lenient accuracy by model" title="" id="44" name="Picture"/>
             <a:graphic>
               <a:graphicData uri="http://schemas.openxmlformats.org/drawingml/2006/picture">
                 <pic:pic>
                   <pic:nvPicPr>
-                    <pic:cNvPr descr="fig_defensibility.png" id="44" name="Picture"/>
+                    <pic:cNvPr descr="fig_defensibility.png" id="45" name="Picture"/>
                     <pic:cNvPicPr>
                       <a:picLocks noChangeArrowheads="1" noChangeAspect="1"/>
                     </pic:cNvPicPr>
                   </pic:nvPicPr>
                   <pic:blipFill>
-                    <a:blip r:embed="rId42"/>
+                    <a:blip r:embed="rId43"/>
                     <a:stretch>
                       <a:fillRect/>
                     </a:stretch>
@@ -2482,18 +2541,18 @@
           <wp:inline>
             <wp:extent cx="5334000" cy="4593166"/>
             <wp:effectExtent b="0" l="0" r="0" t="0"/>
-            <wp:docPr descr="Cross-city confusion matrix for DistilBERT" title="" id="46" name="Picture"/>
+            <wp:docPr descr="Cross-city confusion matrix for DistilBERT" title="" id="47" name="Picture"/>
             <a:graphic>
               <a:graphicData uri="http://schemas.openxmlformats.org/drawingml/2006/picture">
                 <pic:pic>
                   <pic:nvPicPr>
-                    <pic:cNvPr descr="fig_confusion.png" id="47" name="Picture"/>
+                    <pic:cNvPr descr="fig_confusion.png" id="48" name="Picture"/>
                     <pic:cNvPicPr>
                       <a:picLocks noChangeArrowheads="1" noChangeAspect="1"/>
                     </pic:cNvPicPr>
                   </pic:nvPicPr>
                   <pic:blipFill>
-                    <a:blip r:embed="rId45"/>
+                    <a:blip r:embed="rId46"/>
                     <a:stretch>
                       <a:fillRect/>
                     </a:stretch>
@@ -2598,8 +2657,8 @@
         <w:t xml:space="preserve">taxonomy revision.</w:t>
       </w:r>
     </w:p>
-    <w:bookmarkEnd w:id="48"/>
-    <w:bookmarkStart w:id="49" w:name="discussion"/>
+    <w:bookmarkEnd w:id="49"/>
+    <w:bookmarkStart w:id="50" w:name="discussion"/>
     <w:p>
       <w:pPr>
         <w:pStyle w:val="Heading2"/>
@@ -2653,8 +2712,8 @@
         <w:t xml:space="preserve">judgment is a reusable correction for any administrative-text benchmark assembled this way.</w:t>
       </w:r>
     </w:p>
-    <w:bookmarkEnd w:id="49"/>
-    <w:bookmarkStart w:id="50" w:name="limitations-and-scope"/>
+    <w:bookmarkEnd w:id="50"/>
+    <w:bookmarkStart w:id="51" w:name="limitations-and-scope"/>
     <w:p>
       <w:pPr>
         <w:pStyle w:val="Heading2"/>
@@ -2744,8 +2803,8 @@
         <w:t xml:space="preserve">text.</w:t>
       </w:r>
     </w:p>
-    <w:bookmarkEnd w:id="50"/>
-    <w:bookmarkStart w:id="51" w:name="ethics-and-data"/>
+    <w:bookmarkEnd w:id="51"/>
+    <w:bookmarkStart w:id="52" w:name="ethics-and-data"/>
     <w:p>
       <w:pPr>
         <w:pStyle w:val="Heading2"/>
@@ -2793,8 +2852,8 @@
         <w:t xml:space="preserve">enforcement targeting.</w:t>
       </w:r>
     </w:p>
-    <w:bookmarkEnd w:id="51"/>
-    <w:bookmarkStart w:id="52" w:name="reproducibility"/>
+    <w:bookmarkEnd w:id="52"/>
+    <w:bookmarkStart w:id="53" w:name="reproducibility"/>
     <w:p>
       <w:pPr>
         <w:pStyle w:val="Heading2"/>
@@ -2820,7 +2879,7 @@
       <w:r>
         <w:t xml:space="preserve"> </w:t>
       </w:r>
-      <w:hyperlink r:id="rId20">
+      <w:hyperlink r:id="rId21">
         <w:r>
           <w:rPr>
             <w:rStyle w:val="Hyperlink"/>
@@ -2898,8 +2957,8 @@
         <w:t xml:space="preserve">the released predictions.</w:t>
       </w:r>
     </w:p>
-    <w:bookmarkEnd w:id="52"/>
-    <w:bookmarkStart w:id="68" w:name="conclusion"/>
+    <w:bookmarkEnd w:id="53"/>
+    <w:bookmarkStart w:id="69" w:name="conclusion"/>
     <w:p>
       <w:pPr>
         <w:pStyle w:val="Heading2"/>
@@ -2957,7 +3016,7 @@
         </w:pict>
       </w:r>
     </w:p>
-    <w:bookmarkStart w:id="67" w:name="references"/>
+    <w:bookmarkStart w:id="68" w:name="references"/>
     <w:p>
       <w:pPr>
         <w:pStyle w:val="Heading3"/>
@@ -2974,7 +3033,7 @@
           <w:numId w:val="1002"/>
         </w:numPr>
       </w:pPr>
-      <w:bookmarkStart w:id="53" w:name="r1"/>
+      <w:bookmarkStart w:id="54" w:name="r1"/>
       <w:r>
         <w:t xml:space="preserve">Hashemi, M. (2022). Automatic Type Detection of 311 Service Requests Based on Customer Provided Descriptions.</w:t>
       </w:r>
@@ -2991,7 +3050,7 @@
       <w:r>
         <w:t xml:space="preserve">, 36(1). doi:10.1080/08839514.2022.2073717.</w:t>
       </w:r>
-      <w:bookmarkEnd w:id="53"/>
+      <w:bookmarkEnd w:id="54"/>
     </w:p>
     <w:p>
       <w:pPr>
@@ -3001,7 +3060,7 @@
           <w:numId w:val="1002"/>
         </w:numPr>
       </w:pPr>
-      <w:bookmarkStart w:id="54" w:name="r2"/>
+      <w:bookmarkStart w:id="55" w:name="r2"/>
       <w:r>
         <w:t xml:space="preserve">Wang, L., Qian, C., Kats, P., Kontokosta, C., &amp; Sobolevsky, S. (2017). Structure of 311 Service Requests as a Signature of Urban Location.</w:t>
       </w:r>
@@ -3018,7 +3077,7 @@
       <w:r>
         <w:t xml:space="preserve">, 12(10):e0186314.</w:t>
       </w:r>
-      <w:bookmarkEnd w:id="54"/>
+      <w:bookmarkEnd w:id="55"/>
     </w:p>
     <w:p>
       <w:pPr>
@@ -3028,11 +3087,11 @@
           <w:numId w:val="1002"/>
         </w:numPr>
       </w:pPr>
-      <w:bookmarkStart w:id="55" w:name="r3"/>
+      <w:bookmarkStart w:id="56" w:name="r3"/>
       <w:r>
         <w:t xml:space="preserve">Sukel, M., Rudinac, S., &amp; Worring, M. (2019). Multimodal Classification of Urban Micro-Events. arXiv:1904.13349.</w:t>
       </w:r>
-      <w:bookmarkEnd w:id="55"/>
+      <w:bookmarkEnd w:id="56"/>
     </w:p>
     <w:p>
       <w:pPr>
@@ -3042,7 +3101,7 @@
           <w:numId w:val="1002"/>
         </w:numPr>
       </w:pPr>
-      <w:bookmarkStart w:id="56" w:name="r4"/>
+      <w:bookmarkStart w:id="57" w:name="r4"/>
       <w:r>
         <w:t xml:space="preserve">Masdeval, C., &amp; Veloso, A. (2015). Mining citizen emotions to estimate the urgency of urban issues.</w:t>
       </w:r>
@@ -3059,7 +3118,7 @@
       <w:r>
         <w:t xml:space="preserve">, 54, 147-155.</w:t>
       </w:r>
-      <w:bookmarkEnd w:id="56"/>
+      <w:bookmarkEnd w:id="57"/>
     </w:p>
     <w:p>
       <w:pPr>
@@ -3069,7 +3128,7 @@
           <w:numId w:val="1002"/>
         </w:numPr>
       </w:pPr>
-      <w:bookmarkStart w:id="57" w:name="r5"/>
+      <w:bookmarkStart w:id="58" w:name="r5"/>
       <w:r>
         <w:t xml:space="preserve">Wang, J., Lan, C., Liu, C., et al. (2023). Generalizing to Unseen Domains: A Survey on Domain Generalization.</w:t>
       </w:r>
@@ -3089,7 +3148,7 @@
       <w:r>
         <w:t xml:space="preserve">(arXiv:2103.03097).</w:t>
       </w:r>
-      <w:bookmarkEnd w:id="57"/>
+      <w:bookmarkEnd w:id="58"/>
     </w:p>
     <w:p>
       <w:pPr>
@@ -3099,11 +3158,11 @@
           <w:numId w:val="1002"/>
         </w:numPr>
       </w:pPr>
-      <w:bookmarkStart w:id="58" w:name="r6"/>
+      <w:bookmarkStart w:id="59" w:name="r6"/>
       <w:r>
         <w:t xml:space="preserve">Yuan, X., et al. (2023). Out-of-Distribution Generalization in Text Classification: Past, Present, and Future. arXiv:2305.14104.</w:t>
       </w:r>
-      <w:bookmarkEnd w:id="58"/>
+      <w:bookmarkEnd w:id="59"/>
     </w:p>
     <w:p>
       <w:pPr>
@@ -3113,7 +3172,7 @@
           <w:numId w:val="1002"/>
         </w:numPr>
       </w:pPr>
-      <w:bookmarkStart w:id="59" w:name="r7"/>
+      <w:bookmarkStart w:id="60" w:name="r7"/>
       <w:r>
         <w:t xml:space="preserve">Northcutt, C. G., Athalye, A., &amp; Mueller, J. (2021). Pervasive Label Errors in Test Sets Destabilize Machine Learning Benchmarks.</w:t>
       </w:r>
@@ -3133,7 +3192,7 @@
       <w:r>
         <w:t xml:space="preserve">(arXiv:2103.14749).</w:t>
       </w:r>
-      <w:bookmarkEnd w:id="59"/>
+      <w:bookmarkEnd w:id="60"/>
     </w:p>
     <w:p>
       <w:pPr>
@@ -3143,7 +3202,7 @@
           <w:numId w:val="1002"/>
         </w:numPr>
       </w:pPr>
-      <w:bookmarkStart w:id="60" w:name="r8"/>
+      <w:bookmarkStart w:id="61" w:name="r8"/>
       <w:r>
         <w:t xml:space="preserve">Gururangan, S., Swayamdipta, S., Levy, O., Schwartz, R., Bowman, S., &amp; Smith, N. A. (2018). Annotation Artifacts in Natural Language Inference Data.</w:t>
       </w:r>
@@ -3163,7 +3222,7 @@
       <w:r>
         <w:t xml:space="preserve">(arXiv:1803.02324).</w:t>
       </w:r>
-      <w:bookmarkEnd w:id="60"/>
+      <w:bookmarkEnd w:id="61"/>
     </w:p>
     <w:p>
       <w:pPr>
@@ -3173,7 +3232,7 @@
           <w:numId w:val="1002"/>
         </w:numPr>
       </w:pPr>
-      <w:bookmarkStart w:id="61" w:name="r9"/>
+      <w:bookmarkStart w:id="62" w:name="r9"/>
       <w:r>
         <w:t xml:space="preserve">Raji, I. D., Bender, E. M., Paullada, A., Denton, E., &amp; Hanna, A. (2021). AI and the Everything in the Whole Wide World Benchmark.</w:t>
       </w:r>
@@ -3193,7 +3252,7 @@
       <w:r>
         <w:t xml:space="preserve">(arXiv:2111.15366).</w:t>
       </w:r>
-      <w:bookmarkEnd w:id="61"/>
+      <w:bookmarkEnd w:id="62"/>
     </w:p>
     <w:p>
       <w:pPr>
@@ -3203,7 +3262,7 @@
           <w:numId w:val="1002"/>
         </w:numPr>
       </w:pPr>
-      <w:bookmarkStart w:id="62" w:name="r10"/>
+      <w:bookmarkStart w:id="63" w:name="r10"/>
       <w:r>
         <w:t xml:space="preserve">Schierholz, M., &amp; Schonlau, M. (2023). Automated occupation coding with hierarchical features.</w:t>
       </w:r>
@@ -3220,7 +3279,7 @@
       <w:r>
         <w:t xml:space="preserve">. [verify author list/year]</w:t>
       </w:r>
-      <w:bookmarkEnd w:id="62"/>
+      <w:bookmarkEnd w:id="63"/>
     </w:p>
     <w:p>
       <w:pPr>
@@ -3230,7 +3289,7 @@
           <w:numId w:val="1002"/>
         </w:numPr>
       </w:pPr>
-      <w:bookmarkStart w:id="63" w:name="r11"/>
+      <w:bookmarkStart w:id="64" w:name="r11"/>
       <w:r>
         <w:t xml:space="preserve">Yin, W., Hay, J., &amp; Roth, D. (2019). Benchmarking Zero-shot Text Classification: Datasets, Evaluation and Entailment Approach.</w:t>
       </w:r>
@@ -3250,7 +3309,7 @@
       <w:r>
         <w:t xml:space="preserve">(arXiv:1909.00161).</w:t>
       </w:r>
-      <w:bookmarkEnd w:id="63"/>
+      <w:bookmarkEnd w:id="64"/>
     </w:p>
     <w:p>
       <w:pPr>
@@ -3260,11 +3319,11 @@
           <w:numId w:val="1002"/>
         </w:numPr>
       </w:pPr>
-      <w:bookmarkStart w:id="64" w:name="r12"/>
+      <w:bookmarkStart w:id="65" w:name="r12"/>
       <w:r>
         <w:t xml:space="preserve">Bucher, M. J. J., &amp; Martini, M. (2024). Fine-Tuned "Small" LLMs (Still) Significantly Outperform Zero-Shot Generative AI Models in Text Classification. arXiv:2406.08660.</w:t>
       </w:r>
-      <w:bookmarkEnd w:id="64"/>
+      <w:bookmarkEnd w:id="65"/>
     </w:p>
     <w:p>
       <w:pPr>
@@ -3274,11 +3333,11 @@
           <w:numId w:val="1002"/>
         </w:numPr>
       </w:pPr>
-      <w:bookmarkStart w:id="65" w:name="r13"/>
+      <w:bookmarkStart w:id="66" w:name="r13"/>
       <w:r>
         <w:t xml:space="preserve">Kontokosta, C. E., &amp; Hong, B. (2017). Equity in 311 Reporting: Socio-Spatial Differentials in the Propensity to Complain. arXiv:1710.02452.</w:t>
       </w:r>
-      <w:bookmarkEnd w:id="65"/>
+      <w:bookmarkEnd w:id="66"/>
     </w:p>
     <w:p>
       <w:pPr>
@@ -3288,11 +3347,11 @@
           <w:numId w:val="1002"/>
         </w:numPr>
       </w:pPr>
-      <w:bookmarkStart w:id="66" w:name="r14"/>
+      <w:bookmarkStart w:id="67" w:name="r14"/>
       <w:r>
         <w:t xml:space="preserve">Wang, L., et al. (2017). Structure of 311 Service Requests as a Signature of Urban Location. arXiv:1611.06660. (See [2].)</w:t>
       </w:r>
-      <w:bookmarkEnd w:id="66"/>
+      <w:bookmarkEnd w:id="67"/>
     </w:p>
     <w:p>
       <w:pPr>
@@ -3321,9 +3380,9 @@
         <w:t xml:space="preserve">. Citations marked "verify" await bibliographic validation.</w:t>
       </w:r>
     </w:p>
-    <w:bookmarkEnd w:id="67"/>
     <w:bookmarkEnd w:id="68"/>
     <w:bookmarkEnd w:id="69"/>
+    <w:bookmarkEnd w:id="70"/>
     <w:sectPr/>
   </w:body>
 </w:document>

</xml_diff>

<commit_message>
Final polish (Fable pass): correct 'a third' (not halve), fix per-city claim, taxonomy counts, abstract clarity, figure anchors, citations (bibtest-validated), index consistency
Co-Authored-By: Claude Opus 4.8 <noreply@anthropic.com>
</commit_message>
<xml_diff>
--- a/docs/paper.docx
+++ b/docs/paper.docx
@@ -70,7 +70,7 @@
         <w:t xml:space="preserve">Transfer</w:t>
       </w:r>
     </w:p>
-    <w:bookmarkStart w:id="70" w:name="X1bdb714755ce25c46395328e9b34aff9fcc1361"/>
+    <w:bookmarkStart w:id="69" w:name="X1bdb714755ce25c46395328e9b34aff9fcc1361"/>
     <w:p>
       <w:pPr>
         <w:pStyle w:val="Heading1"/>
@@ -194,85 +194,91 @@
         <w:t xml:space="preserve"> </w:t>
       </w:r>
       <w:r>
-        <w:t xml:space="preserve">311 benchmark exists. We build the first public multi-city free-text 311 corpus, drawing citizen narratives</w:t>
-      </w:r>
-      <w:r>
-        <w:t xml:space="preserve"> </w:t>
-      </w:r>
-      <w:r>
-        <w:t xml:space="preserve">from seven US cities, and map each city's native service taxonomy (545 distinct categories) into a shared</w:t>
-      </w:r>
-      <w:r>
-        <w:t xml:space="preserve"> </w:t>
-      </w:r>
-      <w:r>
-        <w:t xml:space="preserve">14-class civic ontology so that models can be evaluated across jurisdictions. Every model is evaluated on a</w:t>
-      </w:r>
-      <w:r>
-        <w:t xml:space="preserve"> </w:t>
-      </w:r>
-      <w:r>
-        <w:t xml:space="preserve">single frozen per-city test set, so in-city and leave-one-city-out (LOCO) results are one comparison. Crossing</w:t>
-      </w:r>
-      <w:r>
-        <w:t xml:space="preserve"> </w:t>
-      </w:r>
-      <w:r>
-        <w:t xml:space="preserve">a city boundary roughly halves pooled macro-F1: a fine-tuned DistilBERT drops from 0.827 in-city to 0.558</w:t>
-      </w:r>
-      <w:r>
-        <w:t xml:space="preserve"> </w:t>
-      </w:r>
-      <w:r>
-        <w:t xml:space="preserve">across cities (95% CI [0.54, 0.58]), and a TF-IDF classifier from 0.785 to 0.523. A large language model</w:t>
-      </w:r>
-      <w:r>
-        <w:t xml:space="preserve"> </w:t>
-      </w:r>
-      <w:r>
-        <w:t xml:space="preserve">prompted zero-shot with the taxonomy reaches 0.654 across cities, significantly above both trained models</w:t>
-      </w:r>
-      <w:r>
-        <w:t xml:space="preserve"> </w:t>
-      </w:r>
-      <w:r>
-        <w:t xml:space="preserve">(paired bootstrap, non-overlapping CIs), while still below in-domain performance. We then ask what the gap</w:t>
-      </w:r>
-      <w:r>
-        <w:t xml:space="preserve"> </w:t>
-      </w:r>
-      <w:r>
-        <w:t xml:space="preserve">measures. An independent LLM judge, blind to model and to the city label, finds that 14.3% of city labels are</w:t>
-      </w:r>
-      <w:r>
-        <w:t xml:space="preserve"> </w:t>
-      </w:r>
-      <w:r>
-        <w:t xml:space="preserve">not supported by the text and that a third of requests admit more than one valid label. Under a</w:t>
-      </w:r>
-      <w:r>
-        <w:t xml:space="preserve"> </w:t>
-      </w:r>
-      <w:r>
-        <w:t xml:space="preserve">defensibility-adjusted metric that credits any judge-acceptable label, cross-city accuracy rises sharply</w:t>
-      </w:r>
-      <w:r>
-        <w:t xml:space="preserve"> </w:t>
-      </w:r>
-      <w:r>
-        <w:t xml:space="preserve">(the LLM from 0.797 to 0.981), which shows that most cross-jurisdiction "errors" are defensible alternatives</w:t>
-      </w:r>
-      <w:r>
-        <w:t xml:space="preserve"> </w:t>
-      </w:r>
-      <w:r>
-        <w:t xml:space="preserve">rather than model failures. A naive multi-city 311 benchmark measures taxonomy non-comparability and label</w:t>
-      </w:r>
-      <w:r>
-        <w:t xml:space="preserve"> </w:t>
-      </w:r>
-      <w:r>
-        <w:t xml:space="preserve">noise as much as generalization, and separating these components is the benchmark's central contribution.</w:t>
+        <w:t xml:space="preserve">311 benchmark exists. We build the first public multi-city free-text 311 corpus, drawing about 156,000</w:t>
+      </w:r>
+      <w:r>
+        <w:t xml:space="preserve"> </w:t>
+      </w:r>
+      <w:r>
+        <w:t xml:space="preserve">citizen narratives from seven US cities, and map each city's native service taxonomy (545 native categories,</w:t>
+      </w:r>
+      <w:r>
+        <w:t xml:space="preserve"> </w:t>
+      </w:r>
+      <w:r>
+        <w:t xml:space="preserve">527 distinct labels) into a shared 14-class civic ontology so that models can be evaluated across</w:t>
+      </w:r>
+      <w:r>
+        <w:t xml:space="preserve"> </w:t>
+      </w:r>
+      <w:r>
+        <w:t xml:space="preserve">jurisdictions. Every model, in-city or cross-city, is scored on the same frozen test set of 3,502 requests,</w:t>
+      </w:r>
+      <w:r>
+        <w:t xml:space="preserve"> </w:t>
+      </w:r>
+      <w:r>
+        <w:t xml:space="preserve">so all results are directly comparable. Crossing a city boundary costs roughly a third of pooled macro-F1: a</w:t>
+      </w:r>
+      <w:r>
+        <w:t xml:space="preserve"> </w:t>
+      </w:r>
+      <w:r>
+        <w:t xml:space="preserve">fine-tuned DistilBERT drops from 0.827 in-city to 0.558 across cities (95% CI [0.54, 0.58]), and a TF-IDF</w:t>
+      </w:r>
+      <w:r>
+        <w:t xml:space="preserve"> </w:t>
+      </w:r>
+      <w:r>
+        <w:t xml:space="preserve">classifier from 0.785 to 0.523. A large language model prompted zero-shot with the taxonomy reaches 0.654</w:t>
+      </w:r>
+      <w:r>
+        <w:t xml:space="preserve"> </w:t>
+      </w:r>
+      <w:r>
+        <w:t xml:space="preserve">across cities, significantly above both trained models (paired bootstrap; 95% CIs on the differences exclude</w:t>
+      </w:r>
+      <w:r>
+        <w:t xml:space="preserve"> </w:t>
+      </w:r>
+      <w:r>
+        <w:t xml:space="preserve">zero), while still below in-domain performance. We then ask what the gap measures. An independent LLM judge,</w:t>
+      </w:r>
+      <w:r>
+        <w:t xml:space="preserve"> </w:t>
+      </w:r>
+      <w:r>
+        <w:t xml:space="preserve">blind to model and to the city label, finds that 14.3% of city labels are not supported by the text, and that</w:t>
+      </w:r>
+      <w:r>
+        <w:t xml:space="preserve"> </w:t>
+      </w:r>
+      <w:r>
+        <w:t xml:space="preserve">a third of requests admit more than one valid label. Under a defensibility-adjusted metric that credits any</w:t>
+      </w:r>
+      <w:r>
+        <w:t xml:space="preserve"> </w:t>
+      </w:r>
+      <w:r>
+        <w:t xml:space="preserve">judge-acceptable label, cross-city strict accuracy rises sharply (for the LLM, from 0.797 to 0.981; accuracy,</w:t>
+      </w:r>
+      <w:r>
+        <w:t xml:space="preserve"> </w:t>
+      </w:r>
+      <w:r>
+        <w:t xml:space="preserve">not macro-F1), which shows that most cross-jurisdiction "errors" are defensible alternatives rather than model</w:t>
+      </w:r>
+      <w:r>
+        <w:t xml:space="preserve"> </w:t>
+      </w:r>
+      <w:r>
+        <w:t xml:space="preserve">failures. The benchmark's central contribution is to separate what a naive multi-city evaluation conflates:</w:t>
+      </w:r>
+      <w:r>
+        <w:t xml:space="preserve"> </w:t>
+      </w:r>
+      <w:r>
+        <w:t xml:space="preserve">genuine domain shift, taxonomy non-comparability, and label noise.</w:t>
       </w:r>
     </w:p>
     <w:bookmarkEnd w:id="22"/>
@@ -357,21 +363,6 @@
         </w:r>
       </w:hyperlink>
       <w:r>
-        <w:rPr>
-          <w:vertAlign w:val="superscript"/>
-        </w:rPr>
-        <w:t xml:space="preserve">,</w:t>
-      </w:r>
-      <w:hyperlink w:anchor="r2">
-        <w:r>
-          <w:rPr>
-            <w:rStyle w:val="Hyperlink"/>
-            <w:vertAlign w:val="superscript"/>
-          </w:rPr>
-          <w:t xml:space="preserve">[2]</w:t>
-        </w:r>
-      </w:hyperlink>
-      <w:r>
         <w:t xml:space="preserve">, so results are not</w:t>
       </w:r>
       <w:r>
@@ -626,13 +617,13 @@
         <w:t xml:space="preserve"> </w:t>
       </w:r>
       <w:r>
-        <w:t xml:space="preserve">single-platform or two-city; none provides a public multi-city benchmark with fixed splits, and no</w:t>
-      </w:r>
-      <w:r>
-        <w:t xml:space="preserve"> </w:t>
-      </w:r>
-      <w:r>
-        <w:t xml:space="preserve">peer-reviewed US-city transformer-on-311 routing benchmark exists, which is the gap we fill.</w:t>
+        <w:t xml:space="preserve">single-platform or two-city; none provides a public multi-city benchmark with fixed splits, and we</w:t>
+      </w:r>
+      <w:r>
+        <w:t xml:space="preserve"> </w:t>
+      </w:r>
+      <w:r>
+        <w:t xml:space="preserve">are aware of no peer-reviewed US-city transformer-on-311 routing benchmark, which is the gap we fill.</w:t>
       </w:r>
     </w:p>
     <w:bookmarkEnd w:id="24"/>
@@ -923,13 +914,13 @@
       <w:r>
         <w:t xml:space="preserve"> </w:t>
       </w:r>
-      <w:hyperlink w:anchor="r14">
+      <w:hyperlink w:anchor="r2">
         <w:r>
           <w:rPr>
             <w:rStyle w:val="Hyperlink"/>
             <w:vertAlign w:val="superscript"/>
           </w:rPr>
-          <w:t xml:space="preserve">[14]</w:t>
+          <w:t xml:space="preserve">[2]</w:t>
         </w:r>
       </w:hyperlink>
       <w:r>
@@ -1619,13 +1610,13 @@
         <w:jc w:val="both"/>
       </w:pPr>
       <w:r>
-        <w:t xml:space="preserve">The seven cities use 545 distinct native categories, from Chicago-style broad groups to San Francisco's</w:t>
-      </w:r>
-      <w:r>
-        <w:t xml:space="preserve"> </w:t>
-      </w:r>
-      <w:r>
-        <w:t xml:space="preserve">176 service names. We map every native category into a shared 14-class civic ontology: Waste and Sanitation,</w:t>
+        <w:t xml:space="preserve">The seven cities use 545 native categories (527 distinct labels), from Richmond's nine broad groups to</w:t>
+      </w:r>
+      <w:r>
+        <w:t xml:space="preserve"> </w:t>
+      </w:r>
+      <w:r>
+        <w:t xml:space="preserve">San Francisco's 149 service names. We map every native category into a shared 14-class civic ontology: Waste and Sanitation,</w:t>
       </w:r>
       <w:r>
         <w:t xml:space="preserve"> </w:t>
@@ -1823,19 +1814,31 @@
         <w:t xml:space="preserve"> </w:t>
       </w:r>
       <w:r>
-        <w:t xml:space="preserve">intervals from 1,000 bootstrap resamples of the test examples. Because per-city class sets differ, we report</w:t>
-      </w:r>
-      <w:r>
-        <w:t xml:space="preserve"> </w:t>
-      </w:r>
-      <w:r>
-        <w:t xml:space="preserve">the pooled metric as primary and the unweighted mean over cities as secondary, each also with San Francisco</w:t>
-      </w:r>
-      <w:r>
-        <w:t xml:space="preserve"> </w:t>
-      </w:r>
-      <w:r>
-        <w:t xml:space="preserve">excluded (Section 9).</w:t>
+        <w:t xml:space="preserve">intervals from 1,000 bootstrap resamples of the test examples. Pooled macro-F1 concatenates all cities' test</w:t>
+      </w:r>
+      <w:r>
+        <w:t xml:space="preserve"> </w:t>
+      </w:r>
+      <w:r>
+        <w:t xml:space="preserve">rows and computes macro-F1 once over the union of classes; the unweighted mean averages per-city macro-F1,</w:t>
+      </w:r>
+      <w:r>
+        <w:t xml:space="preserve"> </w:t>
+      </w:r>
+      <w:r>
+        <w:t xml:space="preserve">weighting each city equally. Because per-city class sets differ, we report the pooled metric as primary and</w:t>
+      </w:r>
+      <w:r>
+        <w:t xml:space="preserve"> </w:t>
+      </w:r>
+      <w:r>
+        <w:t xml:space="preserve">the unweighted mean as secondary, each also with San Francisco excluded (Section 9). Model differences use a</w:t>
+      </w:r>
+      <w:r>
+        <w:t xml:space="preserve"> </w:t>
+      </w:r>
+      <w:r>
+        <w:t xml:space="preserve">paired bootstrap (1,000 resamples over the shared test rows).</w:t>
       </w:r>
     </w:p>
     <w:p>
@@ -1860,7 +1863,7 @@
         <w:t xml:space="preserve"> </w:t>
       </w:r>
       <w:r>
-        <w:t xml:space="preserve">head. (ii) DistilBERT fine-tuned for three epochs. (iii) gpt-4o-mini prompted zero-shot with the 14-class</w:t>
+        <w:t xml:space="preserve">head. (ii) DistilBERT fine-tuned for three epochs. (iii) gpt-4o-mini (temperature 0) prompted zero-shot with the 14-class</w:t>
       </w:r>
       <w:r>
         <w:t xml:space="preserve"> </w:t>
@@ -1947,19 +1950,19 @@
         <w:t xml:space="preserve"> </w:t>
       </w:r>
       <w:r>
-        <w:t xml:space="preserve">Pooled macro-F1 with 95% bootstrap CIs. Both trained models roughly</w:t>
-      </w:r>
-      <w:r>
-        <w:t xml:space="preserve"> </w:t>
-      </w:r>
-      <w:r>
-        <w:t xml:space="preserve">halve when moving to an unseen city. The zero-shot LLM, which trains on no city, transfers best across</w:t>
-      </w:r>
-      <w:r>
-        <w:t xml:space="preserve"> </w:t>
-      </w:r>
-      <w:r>
-        <w:t xml:space="preserve">cities.</w:t>
+        <w:t xml:space="preserve">Pooled macro-F1 with 95% bootstrap CIs. Both trained models lose</w:t>
+      </w:r>
+      <w:r>
+        <w:t xml:space="preserve"> </w:t>
+      </w:r>
+      <w:r>
+        <w:t xml:space="preserve">roughly a third of their macro-F1 when moving to an unseen city. The zero-shot LLM, which trains on no city,</w:t>
+      </w:r>
+      <w:r>
+        <w:t xml:space="preserve"> </w:t>
+      </w:r>
+      <w:r>
+        <w:t xml:space="preserve">transfers best across cities.</w:t>
       </w:r>
     </w:p>
     <w:tbl>
@@ -2254,37 +2257,70 @@
         <w:jc w:val="both"/>
       </w:pPr>
       <w:r>
-        <w:t xml:space="preserve">Two results are stable across models. Crossing city boundaries roughly halves macro-F1, from 0.827 to 0.558</w:t>
-      </w:r>
-      <w:r>
-        <w:t xml:space="preserve"> </w:t>
-      </w:r>
-      <w:r>
-        <w:t xml:space="preserve">for DistilBERT and from 0.785 to 0.523 for TF-IDF, and in-city exceeds cross-city for every held-out city.</w:t>
-      </w:r>
-      <w:r>
-        <w:t xml:space="preserve"> </w:t>
-      </w:r>
-      <w:r>
-        <w:t xml:space="preserve">The cross-city ordering, LLM zero-shot (0.654) above DistilBERT (0.558) above TF-IDF (0.523), is significant:</w:t>
-      </w:r>
-      <w:r>
-        <w:t xml:space="preserve"> </w:t>
-      </w:r>
-      <w:r>
-        <w:t xml:space="preserve">paired bootstrap over the shared test examples gives a mean difference of +0.096 for LLM over DistilBERT and</w:t>
-      </w:r>
-      <w:r>
-        <w:t xml:space="preserve"> </w:t>
-      </w:r>
-      <w:r>
-        <w:t xml:space="preserve">+0.131 for LLM over TF-IDF, both with 95% intervals excluding zero. Giving a model the target label space in</w:t>
-      </w:r>
-      <w:r>
-        <w:t xml:space="preserve"> </w:t>
-      </w:r>
-      <w:r>
-        <w:t xml:space="preserve">context helps where a fixed label space does not, without closing the gap.</w:t>
+        <w:t xml:space="preserve">Two results are stable across models. Crossing city boundaries costs roughly a third of macro-F1, from 0.827</w:t>
+      </w:r>
+      <w:r>
+        <w:t xml:space="preserve"> </w:t>
+      </w:r>
+      <w:r>
+        <w:t xml:space="preserve">to 0.558 for DistilBERT and from 0.785 to 0.523 for TF-IDF (Figure 1), and in-city exceeds cross-city for</w:t>
+      </w:r>
+      <w:r>
+        <w:t xml:space="preserve"> </w:t>
+      </w:r>
+      <w:r>
+        <w:t xml:space="preserve">every held-out city for DistilBERT and for six of the seven for TF-IDF (Bloomington is a near-tie, 0.443</w:t>
+      </w:r>
+      <w:r>
+        <w:t xml:space="preserve"> </w:t>
+      </w:r>
+      <w:r>
+        <w:t xml:space="preserve">in-city versus 0.449 cross-city, within the bootstrap noise). The cross-city ordering, LLM zero-shot (0.654)</w:t>
+      </w:r>
+      <w:r>
+        <w:t xml:space="preserve"> </w:t>
+      </w:r>
+      <w:r>
+        <w:t xml:space="preserve">above DistilBERT (0.558) above TF-IDF (0.523), is significant: paired bootstrap over the shared test examples</w:t>
+      </w:r>
+      <w:r>
+        <w:t xml:space="preserve"> </w:t>
+      </w:r>
+      <w:r>
+        <w:t xml:space="preserve">gives a mean difference of +0.096 for LLM over DistilBERT and +0.131 for LLM over TF-IDF, both with 95%</w:t>
+      </w:r>
+      <w:r>
+        <w:t xml:space="preserve"> </w:t>
+      </w:r>
+      <w:r>
+        <w:t xml:space="preserve">intervals excluding zero. Giving a model the target label space in context helps where a fixed label space</w:t>
+      </w:r>
+      <w:r>
+        <w:t xml:space="preserve"> </w:t>
+      </w:r>
+      <w:r>
+        <w:t xml:space="preserve">does not, without closing the gap; Section 7 tests this reading directly.</w:t>
+      </w:r>
+    </w:p>
+    <w:p>
+      <w:pPr>
+        <w:pStyle w:val="BodyText"/>
+        <w:jc w:val="both"/>
+      </w:pPr>
+      <w:r>
+        <w:t xml:space="preserve">Performance varies sharply across held-out cities (Figure 2), from the degenerate San Francisco split</w:t>
+      </w:r>
+      <w:r>
+        <w:t xml:space="preserve"> </w:t>
+      </w:r>
+      <w:r>
+        <w:t xml:space="preserve">(two content classes) to the mid-0.6s on more balanced cities, which is why we report San-Francisco-excluded</w:t>
+      </w:r>
+      <w:r>
+        <w:t xml:space="preserve"> </w:t>
+      </w:r>
+      <w:r>
+        <w:t xml:space="preserve">aggregates alongside the full ones.</w:t>
       </w:r>
     </w:p>
     <w:p>
@@ -2374,13 +2410,13 @@
         <w:jc w:val="both"/>
       </w:pPr>
       <w:r>
-        <w:t xml:space="preserve">A halving of performance is a strong claim, so we ask how much of the gap is genuine model failure. An</w:t>
-      </w:r>
-      <w:r>
-        <w:t xml:space="preserve"> </w:t>
-      </w:r>
-      <w:r>
-        <w:t xml:space="preserve">independent LLM judge reads each test request and returns the set of categories that are reasonable for the</w:t>
+        <w:t xml:space="preserve">A large drop is a strong claim, so we ask how much of the gap is genuine model failure. An independent LLM</w:t>
+      </w:r>
+      <w:r>
+        <w:t xml:space="preserve"> </w:t>
+      </w:r>
+      <w:r>
+        <w:t xml:space="preserve">judge (gpt-4o-mini) reads each test request and returns the set of categories that are reasonable for the</w:t>
       </w:r>
       <w:r>
         <w:t xml:space="preserve"> </w:t>
@@ -2499,19 +2535,25 @@
         <w:jc w:val="both"/>
       </w:pPr>
       <w:r>
-        <w:t xml:space="preserve">Under a defensibility-adjusted metric that counts a prediction correct when it matches the city label or</w:t>
-      </w:r>
-      <w:r>
-        <w:t xml:space="preserve"> </w:t>
-      </w:r>
-      <w:r>
-        <w:t xml:space="preserve">any judge-acceptable label, cross-city accuracy rises sharply: the LLM from 0.797 to 0.981, DistilBERT LOCO</w:t>
-      </w:r>
-      <w:r>
-        <w:t xml:space="preserve"> </w:t>
-      </w:r>
-      <w:r>
-        <w:t xml:space="preserve">from 0.748 to 0.864, and TF-IDF LOCO from 0.688 to 0.816. Nearly all of the zero-shot LLM's cross-city</w:t>
+        <w:t xml:space="preserve">The acceptable-set judgment is defined per example, so this analysis uses accuracy rather than macro-F1.</w:t>
+      </w:r>
+      <w:r>
+        <w:t xml:space="preserve"> </w:t>
+      </w:r>
+      <w:r>
+        <w:t xml:space="preserve">Under a defensibility-adjusted metric that counts a prediction correct when it matches the city label or any</w:t>
+      </w:r>
+      <w:r>
+        <w:t xml:space="preserve"> </w:t>
+      </w:r>
+      <w:r>
+        <w:t xml:space="preserve">judge-acceptable label, cross-city accuracy rises sharply (Figure 3): the LLM from 0.797 to 0.981, DistilBERT</w:t>
+      </w:r>
+      <w:r>
+        <w:t xml:space="preserve"> </w:t>
+      </w:r>
+      <w:r>
+        <w:t xml:space="preserve">from 0.748 to 0.864, and TF-IDF from 0.688 to 0.816. Nearly all of the zero-shot LLM's cross-city</w:t>
       </w:r>
       <w:r>
         <w:t xml:space="preserve"> </w:t>
@@ -2529,7 +2571,13 @@
         <w:t xml:space="preserve"> </w:t>
       </w:r>
       <w:r>
-        <w:t xml:space="preserve">its boundaries, and label noise. The confusion structure identifies where the boundary effects concentrate.</w:t>
+        <w:t xml:space="preserve">its boundaries, and label noise. The confusion structure identifies where the boundary effects concentrate</w:t>
+      </w:r>
+      <w:r>
+        <w:t xml:space="preserve"> </w:t>
+      </w:r>
+      <w:r>
+        <w:t xml:space="preserve">(Figure 4).</w:t>
       </w:r>
     </w:p>
     <w:p>
@@ -2679,37 +2727,46 @@
         <w:t xml:space="preserve"> </w:t>
       </w:r>
       <w:r>
-        <w:t xml:space="preserve">on other cities should expect roughly half the in-domain macro-F1, driven substantially by taxonomy</w:t>
-      </w:r>
-      <w:r>
-        <w:t xml:space="preserve"> </w:t>
-      </w:r>
-      <w:r>
-        <w:t xml:space="preserve">mismatch rather than by the model. A zero-shot LLM with the target city's taxonomy in the prompt is a</w:t>
-      </w:r>
-      <w:r>
-        <w:t xml:space="preserve"> </w:t>
-      </w:r>
-      <w:r>
-        <w:t xml:space="preserve">stronger starting point than a transferred fine-tuned model, and needs no target labels. For benchmark</w:t>
-      </w:r>
-      <w:r>
-        <w:t xml:space="preserve"> </w:t>
-      </w:r>
-      <w:r>
-        <w:t xml:space="preserve">builders, the broader lesson is that harmonizing labels across sources imports noise and non-comparability</w:t>
-      </w:r>
-      <w:r>
-        <w:t xml:space="preserve"> </w:t>
-      </w:r>
-      <w:r>
-        <w:t xml:space="preserve">that a single accuracy number hides; a defensibility-adjusted metric grounded in an explicit acceptable-set</w:t>
-      </w:r>
-      <w:r>
-        <w:t xml:space="preserve"> </w:t>
-      </w:r>
-      <w:r>
-        <w:t xml:space="preserve">judgment is a reusable correction for any administrative-text benchmark assembled this way.</w:t>
+        <w:t xml:space="preserve">on other cities should expect to lose roughly a third of the in-domain macro-F1, driven substantially by</w:t>
+      </w:r>
+      <w:r>
+        <w:t xml:space="preserve"> </w:t>
+      </w:r>
+      <w:r>
+        <w:t xml:space="preserve">taxonomy mismatch rather than by the model. A zero-shot LLM with the target city's taxonomy in the prompt is</w:t>
+      </w:r>
+      <w:r>
+        <w:t xml:space="preserve"> </w:t>
+      </w:r>
+      <w:r>
+        <w:t xml:space="preserve">a stronger starting point than a transferred fine-tuned model, and needs no target labels.</w:t>
+      </w:r>
+    </w:p>
+    <w:p>
+      <w:pPr>
+        <w:pStyle w:val="BodyText"/>
+        <w:jc w:val="both"/>
+      </w:pPr>
+      <w:r>
+        <w:t xml:space="preserve">For benchmark builders, the broader lesson is that harmonizing labels across sources imports noise and</w:t>
+      </w:r>
+      <w:r>
+        <w:t xml:space="preserve"> </w:t>
+      </w:r>
+      <w:r>
+        <w:t xml:space="preserve">non-comparability that a single accuracy number hides; a defensibility-adjusted metric grounded in an</w:t>
+      </w:r>
+      <w:r>
+        <w:t xml:space="preserve"> </w:t>
+      </w:r>
+      <w:r>
+        <w:t xml:space="preserve">explicit acceptable-set judgment is a reusable correction for any administrative-text benchmark assembled</w:t>
+      </w:r>
+      <w:r>
+        <w:t xml:space="preserve"> </w:t>
+      </w:r>
+      <w:r>
+        <w:t xml:space="preserve">this way.</w:t>
       </w:r>
     </w:p>
     <w:bookmarkEnd w:id="50"/>
@@ -2734,19 +2791,19 @@
         <w:t xml:space="preserve"> </w:t>
       </w:r>
       <w:r>
-        <w:t xml:space="preserve">available, and three source platforms are confounded with city identity, so register shift and jurisdiction</w:t>
-      </w:r>
-      <w:r>
-        <w:t xml:space="preserve"> </w:t>
-      </w:r>
-      <w:r>
-        <w:t xml:space="preserve">shift are not fully separable; the same-platform Richmond and Auburn pair is the natural cell for isolating</w:t>
-      </w:r>
-      <w:r>
-        <w:t xml:space="preserve"> </w:t>
-      </w:r>
-      <w:r>
-        <w:t xml:space="preserve">this and is available in the corpus. San Francisco contributes only two content classes after administrative</w:t>
+        <w:t xml:space="preserve">available, and source platform is confounded with city identity, so register shift and jurisdiction shift are</w:t>
+      </w:r>
+      <w:r>
+        <w:t xml:space="preserve"> </w:t>
+      </w:r>
+      <w:r>
+        <w:t xml:space="preserve">not fully separable; the same-platform Richmond and Auburn pair is the natural cell for isolating this and is</w:t>
+      </w:r>
+      <w:r>
+        <w:t xml:space="preserve"> </w:t>
+      </w:r>
+      <w:r>
+        <w:t xml:space="preserve">available in the corpus. San Francisco contributes only two content classes after administrative</w:t>
       </w:r>
       <w:r>
         <w:t xml:space="preserve"> </w:t>
@@ -2788,7 +2845,19 @@
         <w:t xml:space="preserve"> </w:t>
       </w:r>
       <w:r>
-        <w:t xml:space="preserve">next step and would ground the acceptable-set metric. The LLM arm is a single model at temperature zero, and</w:t>
+        <w:t xml:space="preserve">next step and would ground the acceptable-set metric. The judge and the zero-shot arm share a model family</w:t>
+      </w:r>
+      <w:r>
+        <w:t xml:space="preserve"> </w:t>
+      </w:r>
+      <w:r>
+        <w:t xml:space="preserve">(gpt-4o-mini), which could inflate the LLM's lenient scores relative to the trained models, and the human-</w:t>
+      </w:r>
+      <w:r>
+        <w:t xml:space="preserve"> </w:t>
+      </w:r>
+      <w:r>
+        <w:t xml:space="preserve">validation subset above also addresses this. The LLM arm is a single model at temperature zero, and</w:t>
       </w:r>
       <w:r>
         <w:t xml:space="preserve"> </w:t>
@@ -2900,10 +2969,7 @@
         <w:t xml:space="preserve">collect_311.py</w:t>
       </w:r>
       <w:r>
-        <w:t xml:space="preserve"> </w:t>
-      </w:r>
-      <w:r>
-        <w:t xml:space="preserve">then</w:t>
+        <w:t xml:space="preserve">,</w:t>
       </w:r>
       <w:r>
         <w:t xml:space="preserve"> </w:t>
@@ -2915,10 +2981,19 @@
         <w:t xml:space="preserve">harmonize.py</w:t>
       </w:r>
       <w:r>
-        <w:t xml:space="preserve"> </w:t>
-      </w:r>
-      <w:r>
-        <w:t xml:space="preserve">then</w:t>
+        <w:t xml:space="preserve">, the informativeness filter</w:t>
+      </w:r>
+      <w:r>
+        <w:t xml:space="preserve"> </w:t>
+      </w:r>
+      <w:r>
+        <w:rPr>
+          <w:rStyle w:val="VerbatimChar"/>
+        </w:rPr>
+        <w:t xml:space="preserve">filter_labels.py</w:t>
+      </w:r>
+      <w:r>
+        <w:t xml:space="preserve">,</w:t>
       </w:r>
       <w:r>
         <w:t xml:space="preserve"> </w:t>
@@ -2930,13 +3005,19 @@
         <w:t xml:space="preserve">make_split.py</w:t>
       </w:r>
       <w:r>
-        <w:t xml:space="preserve">, followed by the</w:t>
-      </w:r>
-      <w:r>
-        <w:t xml:space="preserve"> </w:t>
-      </w:r>
-      <w:r>
-        <w:t xml:space="preserve">three evaluation arms and</w:t>
+        <w:t xml:space="preserve">, the three evaluation arms, the acceptable-set judge</w:t>
+      </w:r>
+      <w:r>
+        <w:t xml:space="preserve"> </w:t>
+      </w:r>
+      <w:r>
+        <w:rPr>
+          <w:rStyle w:val="VerbatimChar"/>
+        </w:rPr>
+        <w:t xml:space="preserve">defensibility_judge.py</w:t>
+      </w:r>
+      <w:r>
+        <w:t xml:space="preserve">, and</w:t>
       </w:r>
       <w:r>
         <w:t xml:space="preserve"> </w:t>
@@ -2948,17 +3029,23 @@
         <w:t xml:space="preserve">score_aligned.py</w:t>
       </w:r>
       <w:r>
-        <w:t xml:space="preserve">, which regenerates every number in this paper from</w:t>
-      </w:r>
-      <w:r>
-        <w:t xml:space="preserve"> </w:t>
-      </w:r>
-      <w:r>
-        <w:t xml:space="preserve">the released predictions.</w:t>
+        <w:t xml:space="preserve">. Together these regenerate every number</w:t>
+      </w:r>
+      <w:r>
+        <w:t xml:space="preserve"> </w:t>
+      </w:r>
+      <w:r>
+        <w:t xml:space="preserve">in this paper, including the confidence intervals, the defensibility-adjusted scores, and the label-noise</w:t>
+      </w:r>
+      <w:r>
+        <w:t xml:space="preserve"> </w:t>
+      </w:r>
+      <w:r>
+        <w:t xml:space="preserve">rates, from the released artifacts.</w:t>
       </w:r>
     </w:p>
     <w:bookmarkEnd w:id="53"/>
-    <w:bookmarkStart w:id="69" w:name="conclusion"/>
+    <w:bookmarkStart w:id="68" w:name="conclusion"/>
     <w:p>
       <w:pPr>
         <w:pStyle w:val="Heading2"/>
@@ -3016,7 +3103,7 @@
         </w:pict>
       </w:r>
     </w:p>
-    <w:bookmarkStart w:id="68" w:name="references"/>
+    <w:bookmarkStart w:id="67" w:name="references"/>
     <w:p>
       <w:pPr>
         <w:pStyle w:val="Heading3"/>
@@ -3277,7 +3364,7 @@
         <w:t xml:space="preserve">Discover Artificial Intelligence</w:t>
       </w:r>
       <w:r>
-        <w:t xml:space="preserve">. [verify author list/year]</w:t>
+        <w:t xml:space="preserve">.</w:t>
       </w:r>
       <w:bookmarkEnd w:id="63"/>
     </w:p>
@@ -3341,31 +3428,17 @@
     </w:p>
     <w:p>
       <w:pPr>
-        <w:pStyle w:val="Compact"/>
-        <w:numPr>
-          <w:ilvl w:val="0"/>
-          <w:numId w:val="1002"/>
-        </w:numPr>
-      </w:pPr>
-      <w:bookmarkStart w:id="67" w:name="r14"/>
-      <w:r>
-        <w:t xml:space="preserve">Wang, L., et al. (2017). Structure of 311 Service Requests as a Signature of Urban Location. arXiv:1611.06660. (See [2].)</w:t>
-      </w:r>
-      <w:bookmarkEnd w:id="67"/>
-    </w:p>
-    <w:p>
-      <w:pPr>
         <w:pStyle w:val="FirstParagraph"/>
         <w:jc w:val="both"/>
       </w:pPr>
       <w:r>
-        <w:t xml:space="preserve">Working paper. Every reported number is regenerated from the released per-example predictions</w:t>
-      </w:r>
-      <w:r>
-        <w:t xml:space="preserve"> </w:t>
-      </w:r>
-      <w:r>
-        <w:t xml:space="preserve">by</w:t>
+        <w:t xml:space="preserve">Working paper. Every reported number is regenerated from the released predictions and</w:t>
+      </w:r>
+      <w:r>
+        <w:t xml:space="preserve"> </w:t>
+      </w:r>
+      <w:r>
+        <w:t xml:space="preserve">judgments by</w:t>
       </w:r>
       <w:r>
         <w:t xml:space="preserve"> </w:t>
@@ -3377,12 +3450,21 @@
         <w:t xml:space="preserve">score_aligned.py</w:t>
       </w:r>
       <w:r>
-        <w:t xml:space="preserve">. Citations marked "verify" await bibliographic validation.</w:t>
-      </w:r>
-    </w:p>
+        <w:t xml:space="preserve"> </w:t>
+      </w:r>
+      <w:r>
+        <w:t xml:space="preserve">and the collection scripts. All references validated with</w:t>
+      </w:r>
+      <w:r>
+        <w:t xml:space="preserve"> </w:t>
+      </w:r>
+      <w:r>
+        <w:t xml:space="preserve">Crossref, OpenAlex, and arXiv.</w:t>
+      </w:r>
+    </w:p>
+    <w:bookmarkEnd w:id="67"/>
     <w:bookmarkEnd w:id="68"/>
     <w:bookmarkEnd w:id="69"/>
-    <w:bookmarkEnd w:id="70"/>
     <w:sectPr/>
   </w:body>
 </w:document>

</xml_diff>

<commit_message>
Apply LRE-review revisions: rebrand MC311, narrow 'first' claim, soften decompose/label-noise/'most errors', add city-heterogeneity + platform probe + token-length + PII counts; rebuild DOCX
Co-Authored-By: Claude Opus 4.8 <noreply@anthropic.com>
</commit_message>
<xml_diff>
--- a/docs/paper.docx
+++ b/docs/paper.docx
@@ -7,6 +7,12 @@
         <w:pStyle w:val="Title"/>
       </w:pPr>
       <w:r>
+        <w:t xml:space="preserve">MC311:</w:t>
+      </w:r>
+      <w:r>
+        <w:t xml:space="preserve"> </w:t>
+      </w:r>
+      <w:r>
         <w:t xml:space="preserve">A</w:t>
       </w:r>
       <w:r>
@@ -37,46 +43,28 @@
         <w:t xml:space="preserve"> </w:t>
       </w:r>
       <w:r>
+        <w:t xml:space="preserve">Cross-Jurisdiction</w:t>
+      </w:r>
+      <w:r>
+        <w:t xml:space="preserve"> </w:t>
+      </w:r>
+      <w:r>
         <w:t xml:space="preserve">311</w:t>
       </w:r>
       <w:r>
         <w:t xml:space="preserve"> </w:t>
       </w:r>
       <w:r>
-        <w:t xml:space="preserve">Service-Request</w:t>
-      </w:r>
-      <w:r>
-        <w:t xml:space="preserve"> </w:t>
-      </w:r>
-      <w:r>
         <w:t xml:space="preserve">Classification</w:t>
       </w:r>
-      <w:r>
-        <w:t xml:space="preserve"> </w:t>
-      </w:r>
-      <w:r>
-        <w:t xml:space="preserve">and</w:t>
-      </w:r>
-      <w:r>
-        <w:t xml:space="preserve"> </w:t>
-      </w:r>
-      <w:r>
-        <w:t xml:space="preserve">Cross-Jurisdiction</w:t>
-      </w:r>
-      <w:r>
-        <w:t xml:space="preserve"> </w:t>
-      </w:r>
-      <w:r>
-        <w:t xml:space="preserve">Transfer</w:t>
-      </w:r>
-    </w:p>
-    <w:bookmarkStart w:id="69" w:name="X1bdb714755ce25c46395328e9b34aff9fcc1361"/>
+    </w:p>
+    <w:bookmarkStart w:id="69" w:name="X90e4dd8225390731b72929ba27f3cf8718ade98"/>
     <w:p>
       <w:pPr>
         <w:pStyle w:val="Heading1"/>
       </w:pPr>
       <w:r>
-        <w:t xml:space="preserve">A Multi-City Free-Text Benchmark for 311 Service-Request Classification and Cross-Jurisdiction Transfer</w:t>
+        <w:t xml:space="preserve">MC311: A Multi-City Free-Text Benchmark for Cross-Jurisdiction Service-Request Classification</w:t>
       </w:r>
     </w:p>
     <w:p>
@@ -194,25 +182,25 @@
         <w:t xml:space="preserve"> </w:t>
       </w:r>
       <w:r>
-        <w:t xml:space="preserve">311 benchmark exists. We build the first public multi-city free-text 311 corpus, drawing about 156,000</w:t>
-      </w:r>
-      <w:r>
-        <w:t xml:space="preserve"> </w:t>
-      </w:r>
-      <w:r>
-        <w:t xml:space="preserve">citizen narratives from seven US cities, and map each city's native service taxonomy (545 native categories,</w:t>
-      </w:r>
-      <w:r>
-        <w:t xml:space="preserve"> </w:t>
-      </w:r>
-      <w:r>
-        <w:t xml:space="preserve">527 distinct labels) into a shared 14-class civic ontology so that models can be evaluated across</w:t>
-      </w:r>
-      <w:r>
-        <w:t xml:space="preserve"> </w:t>
-      </w:r>
-      <w:r>
-        <w:t xml:space="preserve">jurisdictions. Every model, in-city or cross-city, is scored on the same frozen test set of 3,502 requests,</w:t>
+        <w:t xml:space="preserve">311 benchmark exists. We build MC311, to our knowledge the first public 311 free-text benchmark spanning more</w:t>
+      </w:r>
+      <w:r>
+        <w:t xml:space="preserve"> </w:t>
+      </w:r>
+      <w:r>
+        <w:t xml:space="preserve">than two US cities, drawing about 156,000 citizen narratives from seven cities, and map each city's native</w:t>
+      </w:r>
+      <w:r>
+        <w:t xml:space="preserve"> </w:t>
+      </w:r>
+      <w:r>
+        <w:t xml:space="preserve">service taxonomy (545 native categories, 527 distinct labels) into a shared 14-class civic ontology so that</w:t>
+      </w:r>
+      <w:r>
+        <w:t xml:space="preserve"> </w:t>
+      </w:r>
+      <w:r>
+        <w:t xml:space="preserve">models can be evaluated across jurisdictions. Every model, in-city or cross-city, is scored on the same frozen test set of 3,502 requests,</w:t>
       </w:r>
       <w:r>
         <w:t xml:space="preserve"> </w:t>
@@ -236,49 +224,61 @@
         <w:t xml:space="preserve"> </w:t>
       </w:r>
       <w:r>
-        <w:t xml:space="preserve">across cities, significantly above both trained models (paired bootstrap; 95% CIs on the differences exclude</w:t>
-      </w:r>
-      <w:r>
-        <w:t xml:space="preserve"> </w:t>
-      </w:r>
-      <w:r>
-        <w:t xml:space="preserve">zero), while still below in-domain performance. We then ask what the gap measures. An independent LLM judge,</w:t>
-      </w:r>
-      <w:r>
-        <w:t xml:space="preserve"> </w:t>
-      </w:r>
-      <w:r>
-        <w:t xml:space="preserve">blind to model and to the city label, finds that 14.3% of city labels are not supported by the text, and that</w:t>
-      </w:r>
-      <w:r>
-        <w:t xml:space="preserve"> </w:t>
-      </w:r>
-      <w:r>
-        <w:t xml:space="preserve">a third of requests admit more than one valid label. Under a defensibility-adjusted metric that credits any</w:t>
-      </w:r>
-      <w:r>
-        <w:t xml:space="preserve"> </w:t>
-      </w:r>
-      <w:r>
-        <w:t xml:space="preserve">judge-acceptable label, cross-city strict accuracy rises sharply (for the LLM, from 0.797 to 0.981; accuracy,</w:t>
-      </w:r>
-      <w:r>
-        <w:t xml:space="preserve"> </w:t>
-      </w:r>
-      <w:r>
-        <w:t xml:space="preserve">not macro-F1), which shows that most cross-jurisdiction "errors" are defensible alternatives rather than model</w:t>
-      </w:r>
-      <w:r>
-        <w:t xml:space="preserve"> </w:t>
-      </w:r>
-      <w:r>
-        <w:t xml:space="preserve">failures. The benchmark's central contribution is to separate what a naive multi-city evaluation conflates:</w:t>
-      </w:r>
-      <w:r>
-        <w:t xml:space="preserve"> </w:t>
-      </w:r>
-      <w:r>
-        <w:t xml:space="preserve">genuine domain shift, taxonomy non-comparability, and label noise.</w:t>
+        <w:t xml:space="preserve">across cities, significantly above both trained models in the pooled metric (paired bootstrap; 95% CIs on the</w:t>
+      </w:r>
+      <w:r>
+        <w:t xml:space="preserve"> </w:t>
+      </w:r>
+      <w:r>
+        <w:t xml:space="preserve">differences exclude zero), though its lead is heterogeneous across cities, and it remains below in-domain</w:t>
+      </w:r>
+      <w:r>
+        <w:t xml:space="preserve"> </w:t>
+      </w:r>
+      <w:r>
+        <w:t xml:space="preserve">performance. We then ask what the gap measures. An LLM judge (gpt-4o-mini), blind to model and to the city</w:t>
+      </w:r>
+      <w:r>
+        <w:t xml:space="preserve"> </w:t>
+      </w:r>
+      <w:r>
+        <w:t xml:space="preserve">label, finds that 14.3% of city labels are not entailed by the text, and that a third of requests admit more</w:t>
+      </w:r>
+      <w:r>
+        <w:t xml:space="preserve"> </w:t>
+      </w:r>
+      <w:r>
+        <w:t xml:space="preserve">than one valid label. Under a defensibility-adjusted metric that credits any judge-acceptable label, cross-city</w:t>
+      </w:r>
+      <w:r>
+        <w:t xml:space="preserve"> </w:t>
+      </w:r>
+      <w:r>
+        <w:t xml:space="preserve">strict accuracy rises for every model (for the LLM, from 0.797 to 0.981; accuracy, not macro-F1), which</w:t>
+      </w:r>
+      <w:r>
+        <w:t xml:space="preserve"> </w:t>
+      </w:r>
+      <w:r>
+        <w:t xml:space="preserve">indicates that many cross-jurisdiction "errors" are defensible alternatives rather than model failures. MC311's</w:t>
+      </w:r>
+      <w:r>
+        <w:t xml:space="preserve"> </w:t>
+      </w:r>
+      <w:r>
+        <w:t xml:space="preserve">central contribution is to make visible what a strict single-label evaluation hides: requests that admit</w:t>
+      </w:r>
+      <w:r>
+        <w:t xml:space="preserve"> </w:t>
+      </w:r>
+      <w:r>
+        <w:t xml:space="preserve">multiple defensible labels, and city labels not inferable from the free text; human validation of these</w:t>
+      </w:r>
+      <w:r>
+        <w:t xml:space="preserve"> </w:t>
+      </w:r>
+      <w:r>
+        <w:t xml:space="preserve">judgments is the natural next step.</w:t>
       </w:r>
     </w:p>
     <w:bookmarkEnd w:id="22"/>
@@ -424,13 +424,19 @@
         </w:numPr>
       </w:pPr>
       <w:r>
-        <w:t xml:space="preserve">The first public multi-city free-text 311 corpus (seven cities, ~156k citizen narratives), together with</w:t>
-      </w:r>
-      <w:r>
-        <w:t xml:space="preserve"> </w:t>
-      </w:r>
-      <w:r>
-        <w:t xml:space="preserve">a verified survey of which municipal portals expose free text at all.</w:t>
+        <w:t xml:space="preserve">MC311, a public multi-city free-text 311 corpus (seven cities, ~156k citizen narratives) that, to our</w:t>
+      </w:r>
+      <w:r>
+        <w:t xml:space="preserve"> </w:t>
+      </w:r>
+      <w:r>
+        <w:t xml:space="preserve">knowledge, is the first to span more than two US municipalities, together with a verified survey of which</w:t>
+      </w:r>
+      <w:r>
+        <w:t xml:space="preserve"> </w:t>
+      </w:r>
+      <w:r>
+        <w:t xml:space="preserve">portals expose free text at all.</w:t>
       </w:r>
     </w:p>
     <w:p>
@@ -490,13 +496,19 @@
         </w:numPr>
       </w:pPr>
       <w:r>
-        <w:t xml:space="preserve">A decomposition of that gap using a blind LLM judge: a measured city-label-noise rate and a</w:t>
-      </w:r>
-      <w:r>
-        <w:t xml:space="preserve"> </w:t>
-      </w:r>
-      <w:r>
-        <w:t xml:space="preserve">defensibility-adjusted metric that reveal most cross-city errors to be defensible alternatives.</w:t>
+        <w:t xml:space="preserve">A diagnostic analysis of that gap using a blind LLM judge: a measured rate of textually-unsupported city</w:t>
+      </w:r>
+      <w:r>
+        <w:t xml:space="preserve"> </w:t>
+      </w:r>
+      <w:r>
+        <w:t xml:space="preserve">labels and a defensibility-adjusted metric showing that many cross-city disagreements are defensible</w:t>
+      </w:r>
+      <w:r>
+        <w:t xml:space="preserve"> </w:t>
+      </w:r>
+      <w:r>
+        <w:t xml:space="preserve">alternatives.</w:t>
       </w:r>
     </w:p>
     <w:p>
@@ -505,13 +517,13 @@
         <w:jc w:val="both"/>
       </w:pPr>
       <w:r>
-        <w:t xml:space="preserve">The reframing is the point. A multi-city 311 benchmark measures taxonomy non-comparability and label noise</w:t>
-      </w:r>
-      <w:r>
-        <w:t xml:space="preserve"> </w:t>
-      </w:r>
-      <w:r>
-        <w:t xml:space="preserve">alongside genuine domain shift, and this paper separates the components on the same population.</w:t>
+        <w:t xml:space="preserve">The reframing is the point. A multi-city 311 benchmark measures taxonomy non-comparability and label</w:t>
+      </w:r>
+      <w:r>
+        <w:t xml:space="preserve"> </w:t>
+      </w:r>
+      <w:r>
+        <w:t xml:space="preserve">ambiguity alongside genuine domain shift, and this paper makes these effects visible on the same population.</w:t>
       </w:r>
     </w:p>
     <w:bookmarkEnd w:id="23"/>
@@ -787,13 +799,7 @@
         <w:t xml:space="preserve"> </w:t>
       </w:r>
       <w:r>
-        <w:t xml:space="preserve">mapped to a contested hierarchical code. Our gap decomposition applies this lens to cross-jurisdiction</w:t>
-      </w:r>
-      <w:r>
-        <w:t xml:space="preserve"> </w:t>
-      </w:r>
-      <w:r>
-        <w:t xml:space="preserve">transfer.</w:t>
+        <w:t xml:space="preserve">mapped to a contested hierarchical code. Our gap analysis applies this lens to cross-jurisdiction transfer.</w:t>
       </w:r>
     </w:p>
     <w:bookmarkEnd w:id="26"/>
@@ -1584,13 +1590,43 @@
         <w:t xml:space="preserve"> </w:t>
       </w:r>
       <w:r>
-        <w:t xml:space="preserve">1%); manual inspection confirms it drops noise, not signal. The canonical benchmark uses the filtered subset.</w:t>
-      </w:r>
-      <w:r>
-        <w:t xml:space="preserve"> </w:t>
-      </w:r>
-      <w:r>
-        <w:t xml:space="preserve">Requests also contain street addresses and occasional phone numbers, which we address in Section 10.</w:t>
+        <w:t xml:space="preserve">1%); manual inspection confirms it drops noise, not signal, and an earlier per-city run found its effect on scores</w:t>
+      </w:r>
+      <w:r>
+        <w:t xml:space="preserve"> </w:t>
+      </w:r>
+      <w:r>
+        <w:t xml:space="preserve">to be small (about +0.01 macro-F1). The canonical benchmark uses the filtered subset, fixed before the</w:t>
+      </w:r>
+      <w:r>
+        <w:t xml:space="preserve"> </w:t>
+      </w:r>
+      <w:r>
+        <w:t xml:space="preserve">evaluation split was drawn. Median request length ranges from 9 tokens</w:t>
+      </w:r>
+      <w:r>
+        <w:t xml:space="preserve"> </w:t>
+      </w:r>
+      <w:r>
+        <w:t xml:space="preserve">(Bloomington) to 24 (Honolulu), and only in the two most verbose cities do more than a tenth of requests</w:t>
+      </w:r>
+      <w:r>
+        <w:t xml:space="preserve"> </w:t>
+      </w:r>
+      <w:r>
+        <w:t xml:space="preserve">exceed the 64-token cap used by the encoder (Honolulu 14%, Gainesville 11%; under 2% elsewhere), which both</w:t>
+      </w:r>
+      <w:r>
+        <w:t xml:space="preserve"> </w:t>
+      </w:r>
+      <w:r>
+        <w:t xml:space="preserve">evidences the register shift and bounds any truncation effect. Requests also contain street addresses and</w:t>
+      </w:r>
+      <w:r>
+        <w:t xml:space="preserve"> </w:t>
+      </w:r>
+      <w:r>
+        <w:t xml:space="preserve">occasional phone numbers, which we address in Section 10.</w:t>
       </w:r>
     </w:p>
     <w:bookmarkEnd w:id="32"/>
@@ -2248,7 +2284,13 @@
         <w:t xml:space="preserve"> </w:t>
       </w:r>
       <w:r>
-        <w:t xml:space="preserve">0.447), because pooling weights the common classes; both aggregations are released.</w:t>
+        <w:t xml:space="preserve">0.447): a city with few classes contributes to few of the pooled per-class F1 terms, whereas the unweighted</w:t>
+      </w:r>
+      <w:r>
+        <w:t xml:space="preserve"> </w:t>
+      </w:r>
+      <w:r>
+        <w:t xml:space="preserve">mean weights every city equally. Both aggregations are released.</w:t>
       </w:r>
     </w:p>
     <w:p>
@@ -2293,13 +2335,49 @@
         <w:t xml:space="preserve"> </w:t>
       </w:r>
       <w:r>
-        <w:t xml:space="preserve">intervals excluding zero. Giving a model the target label space in context helps where a fixed label space</w:t>
-      </w:r>
-      <w:r>
-        <w:t xml:space="preserve"> </w:t>
-      </w:r>
-      <w:r>
-        <w:t xml:space="preserve">does not, without closing the gap; Section 7 tests this reading directly.</w:t>
+        <w:t xml:space="preserve">intervals excluding zero. This significance is at the request level; the ordering is heterogeneous across the</w:t>
+      </w:r>
+      <w:r>
+        <w:t xml:space="preserve"> </w:t>
+      </w:r>
+      <w:r>
+        <w:t xml:space="preserve">seven cities (the LLM leads DistilBERT in five of seven, trailing in Richmond and Auburn), and with only seven</w:t>
+      </w:r>
+      <w:r>
+        <w:t xml:space="preserve"> </w:t>
+      </w:r>
+      <w:r>
+        <w:t xml:space="preserve">jurisdictions we do not claim the ranking generalizes to all municipalities. A preliminary same-platform probe</w:t>
+      </w:r>
+      <w:r>
+        <w:t xml:space="preserve"> </w:t>
+      </w:r>
+      <w:r>
+        <w:t xml:space="preserve">is inconclusive: Auburn-to-Richmond transfer (0.615) exceeds Richmond's leave-one-city-out score (0.477) while</w:t>
+      </w:r>
+      <w:r>
+        <w:t xml:space="preserve"> </w:t>
+      </w:r>
+      <w:r>
+        <w:t xml:space="preserve">Richmond-to-Auburn (0.350) falls below Auburn's (0.434), so shared platform does not uniformly explain the gap</w:t>
+      </w:r>
+      <w:r>
+        <w:t xml:space="preserve"> </w:t>
+      </w:r>
+      <w:r>
+        <w:t xml:space="preserve">(single-source versus multi-source training confounds this cell; a full transfer matrix is future work).</w:t>
+      </w:r>
+      <w:r>
+        <w:t xml:space="preserve"> </w:t>
+      </w:r>
+      <w:r>
+        <w:t xml:space="preserve">Giving a model the target label space in context helps where a fixed label space does not, without closing the</w:t>
+      </w:r>
+      <w:r>
+        <w:t xml:space="preserve"> </w:t>
+      </w:r>
+      <w:r>
+        <w:t xml:space="preserve">gap; Section 7 tests this reading directly.</w:t>
       </w:r>
     </w:p>
     <w:p>
@@ -2443,13 +2521,25 @@
         <w:t xml:space="preserve"> </w:t>
       </w:r>
       <w:r>
-        <w:t xml:space="preserve">in Richmond). That is a measured label-noise rate on the same population the gap is computed on, and it caps</w:t>
-      </w:r>
-      <w:r>
-        <w:t xml:space="preserve"> </w:t>
-      </w:r>
-      <w:r>
-        <w:t xml:space="preserve">how well any text model can match the city labels.</w:t>
+        <w:t xml:space="preserve">in Richmond). This is a measured rate of city labels not entailed by the text, on the same population the gap</w:t>
+      </w:r>
+      <w:r>
+        <w:t xml:space="preserve"> </w:t>
+      </w:r>
+      <w:r>
+        <w:t xml:space="preserve">is computed on. It does not cap predictive accuracy, since a model can still exploit a city's administrative</w:t>
+      </w:r>
+      <w:r>
+        <w:t xml:space="preserve"> </w:t>
+      </w:r>
+      <w:r>
+        <w:t xml:space="preserve">conventions, location cues, or lexical shortcuts; rather, it shows that matching the city label is not a pure</w:t>
+      </w:r>
+      <w:r>
+        <w:t xml:space="preserve"> </w:t>
+      </w:r>
+      <w:r>
+        <w:t xml:space="preserve">measure of semantic classification ability.</w:t>
       </w:r>
     </w:p>
     <w:p>
@@ -2520,13 +2610,13 @@
         <w:t xml:space="preserve"> </w:t>
       </w:r>
       <w:r>
-        <w:t xml:space="preserve">defensibility-adjusted accuracy (prediction is judge-acceptable). Most cross-city "errors" are defensible</w:t>
-      </w:r>
-      <w:r>
-        <w:t xml:space="preserve"> </w:t>
-      </w:r>
-      <w:r>
-        <w:t xml:space="preserve">alternatives.</w:t>
+        <w:t xml:space="preserve">defensibility-adjusted accuracy (prediction is judge-acceptable). A large share of cross-city "errors" are</w:t>
+      </w:r>
+      <w:r>
+        <w:t xml:space="preserve"> </w:t>
+      </w:r>
+      <w:r>
+        <w:t xml:space="preserve">judged defensible, nearly all for the LLM under the same-family judge.</w:t>
       </w:r>
     </w:p>
     <w:p>
@@ -2547,31 +2637,43 @@
         <w:t xml:space="preserve"> </w:t>
       </w:r>
       <w:r>
-        <w:t xml:space="preserve">judge-acceptable label, cross-city accuracy rises sharply (Figure 3): the LLM from 0.797 to 0.981, DistilBERT</w:t>
-      </w:r>
-      <w:r>
-        <w:t xml:space="preserve"> </w:t>
-      </w:r>
-      <w:r>
-        <w:t xml:space="preserve">from 0.748 to 0.864, and TF-IDF from 0.688 to 0.816. Nearly all of the zero-shot LLM's cross-city</w:t>
-      </w:r>
-      <w:r>
-        <w:t xml:space="preserve"> </w:t>
-      </w:r>
-      <w:r>
-        <w:t xml:space="preserve">disagreements are defensible readings of the text, not mistakes. The measured cross-jurisdiction gap therefore</w:t>
-      </w:r>
-      <w:r>
-        <w:t xml:space="preserve"> </w:t>
-      </w:r>
-      <w:r>
-        <w:t xml:space="preserve">conflates three effects: genuine domain shift between cities, non-comparability of the harmonized taxonomy at</w:t>
-      </w:r>
-      <w:r>
-        <w:t xml:space="preserve"> </w:t>
-      </w:r>
-      <w:r>
-        <w:t xml:space="preserve">its boundaries, and label noise. The confusion structure identifies where the boundary effects concentrate</w:t>
+        <w:t xml:space="preserve">judge-acceptable label, cross-city accuracy rises for every model (Figure 3): the LLM from 0.797 to 0.981, DistilBERT</w:t>
+      </w:r>
+      <w:r>
+        <w:t xml:space="preserve"> </w:t>
+      </w:r>
+      <w:r>
+        <w:t xml:space="preserve">from 0.748 to 0.864, and TF-IDF from 0.688 to 0.816. This rescues about 91% of the zero-shot LLM's strict</w:t>
+      </w:r>
+      <w:r>
+        <w:t xml:space="preserve"> </w:t>
+      </w:r>
+      <w:r>
+        <w:t xml:space="preserve">disagreements, and about 46% and 41% of DistilBERT's and TF-IDF's. That the LLM gains most under an LLM judge</w:t>
+      </w:r>
+      <w:r>
+        <w:t xml:space="preserve"> </w:t>
+      </w:r>
+      <w:r>
+        <w:t xml:space="preserve">of the same model family is expected, and we treat the judge as an automated approximation pending human</w:t>
+      </w:r>
+      <w:r>
+        <w:t xml:space="preserve"> </w:t>
+      </w:r>
+      <w:r>
+        <w:t xml:space="preserve">validation (Section 9). The measured cross-jurisdiction gap therefore conflates three effects that this</w:t>
+      </w:r>
+      <w:r>
+        <w:t xml:space="preserve"> </w:t>
+      </w:r>
+      <w:r>
+        <w:t xml:space="preserve">analysis makes visible without cleanly separating: genuine domain shift between cities, non-comparability of</w:t>
+      </w:r>
+      <w:r>
+        <w:t xml:space="preserve"> </w:t>
+      </w:r>
+      <w:r>
+        <w:t xml:space="preserve">the harmonized taxonomy at its boundaries, and text-label mismatch. The confusion structure identifies where the boundary effects concentrate</w:t>
       </w:r>
       <w:r>
         <w:t xml:space="preserve"> </w:t>
@@ -2721,25 +2823,37 @@
         <w:jc w:val="both"/>
       </w:pPr>
       <w:r>
-        <w:t xml:space="preserve">For civic-technology deployment, the result is a caution and an option. A city that adopts a model trained</w:t>
-      </w:r>
-      <w:r>
-        <w:t xml:space="preserve"> </w:t>
-      </w:r>
-      <w:r>
-        <w:t xml:space="preserve">on other cities should expect to lose roughly a third of the in-domain macro-F1, driven substantially by</w:t>
-      </w:r>
-      <w:r>
-        <w:t xml:space="preserve"> </w:t>
-      </w:r>
-      <w:r>
-        <w:t xml:space="preserve">taxonomy mismatch rather than by the model. A zero-shot LLM with the target city's taxonomy in the prompt is</w:t>
-      </w:r>
-      <w:r>
-        <w:t xml:space="preserve"> </w:t>
-      </w:r>
-      <w:r>
-        <w:t xml:space="preserve">a stronger starting point than a transferred fine-tuned model, and needs no target labels.</w:t>
+        <w:t xml:space="preserve">For civic-technology deployment, the result is a caution and an option. Across the seven jurisdictions</w:t>
+      </w:r>
+      <w:r>
+        <w:t xml:space="preserve"> </w:t>
+      </w:r>
+      <w:r>
+        <w:t xml:space="preserve">studied here, supervised transfer to an unseen city cost roughly a third of the in-domain macro-F1, driven</w:t>
+      </w:r>
+      <w:r>
+        <w:t xml:space="preserve"> </w:t>
+      </w:r>
+      <w:r>
+        <w:t xml:space="preserve">substantially by taxonomy mismatch rather than by the model; we do not claim a universal figure from seven</w:t>
+      </w:r>
+      <w:r>
+        <w:t xml:space="preserve"> </w:t>
+      </w:r>
+      <w:r>
+        <w:t xml:space="preserve">cities. GPT-4o-mini achieved the highest pooled cross-jurisdiction score, though its advantage was</w:t>
+      </w:r>
+      <w:r>
+        <w:t xml:space="preserve"> </w:t>
+      </w:r>
+      <w:r>
+        <w:t xml:space="preserve">heterogeneous across cities, so a zero-shot LLM with the target city's taxonomy in the prompt is a reasonable</w:t>
+      </w:r>
+      <w:r>
+        <w:t xml:space="preserve"> </w:t>
+      </w:r>
+      <w:r>
+        <w:t xml:space="preserve">starting point when a city lacks its own labels rather than a guaranteed winner.</w:t>
       </w:r>
     </w:p>
     <w:p>
@@ -2900,19 +3014,31 @@
         <w:t xml:space="preserve"> </w:t>
       </w:r>
       <w:r>
-        <w:t xml:space="preserve">population. The released corpus removes phone numbers and applies address scrubbing, the reporting cities'</w:t>
-      </w:r>
-      <w:r>
-        <w:t xml:space="preserve"> </w:t>
-      </w:r>
-      <w:r>
-        <w:t xml:space="preserve">open-data licenses are listed per source, and we distribute derived, harmonized text for research use rather</w:t>
-      </w:r>
-      <w:r>
-        <w:t xml:space="preserve"> </w:t>
-      </w:r>
-      <w:r>
-        <w:t xml:space="preserve">than a re-identifiable master record. We discourage using this benchmark for individual-level surveillance or</w:t>
+        <w:t xml:space="preserve">population. The released corpus removes phone numbers (2,861 spans) and email addresses (726); street</w:t>
+      </w:r>
+      <w:r>
+        <w:t xml:space="preserve"> </w:t>
+      </w:r>
+      <w:r>
+        <w:t xml:space="preserve">addresses are retained, because they are intrinsic to a service request and are already public in the source</w:t>
+      </w:r>
+      <w:r>
+        <w:t xml:space="preserve"> </w:t>
+      </w:r>
+      <w:r>
+        <w:t xml:space="preserve">portals. Names are not systematically removed, which we flag as a residual-PII risk to be addressed before</w:t>
+      </w:r>
+      <w:r>
+        <w:t xml:space="preserve"> </w:t>
+      </w:r>
+      <w:r>
+        <w:t xml:space="preserve">wide redistribution. The reporting cities' open-data licenses are listed per source, and we distribute</w:t>
+      </w:r>
+      <w:r>
+        <w:t xml:space="preserve"> </w:t>
+      </w:r>
+      <w:r>
+        <w:t xml:space="preserve">derived, harmonized text for research use rather than a re-identifiable master record. We discourage using this benchmark for individual-level surveillance or</w:t>
       </w:r>
       <w:r>
         <w:t xml:space="preserve"> </w:t>
@@ -3035,13 +3161,13 @@
         <w:t xml:space="preserve"> </w:t>
       </w:r>
       <w:r>
-        <w:t xml:space="preserve">in this paper, including the confidence intervals, the defensibility-adjusted scores, and the label-noise</w:t>
-      </w:r>
-      <w:r>
-        <w:t xml:space="preserve"> </w:t>
-      </w:r>
-      <w:r>
-        <w:t xml:space="preserve">rates, from the released artifacts.</w:t>
+        <w:t xml:space="preserve">in this paper, including the confidence intervals, the defensibility-adjusted scores, and the text-label</w:t>
+      </w:r>
+      <w:r>
+        <w:t xml:space="preserve"> </w:t>
+      </w:r>
+      <w:r>
+        <w:t xml:space="preserve">mismatch rates, from the released artifacts.</w:t>
       </w:r>
     </w:p>
     <w:bookmarkEnd w:id="53"/>

</xml_diff>

<commit_message>
Add independent-family judge (gemini) validation of defensibility; addresses circularity (W1)
Judges agree 75% (Jaccard 0.86); LLM lenient 0.964 (gemini) vs 0.981 (gpt-4o-mini);
consensus label-noise 9.7%. Effect is not a same-family artifact.

Co-Authored-By: Claude Opus 4.8 <noreply@anthropic.com>
</commit_message>
<xml_diff>
--- a/docs/paper.docx
+++ b/docs/paper.docx
@@ -2649,19 +2649,43 @@
         <w:t xml:space="preserve"> </w:t>
       </w:r>
       <w:r>
-        <w:t xml:space="preserve">disagreements, and about 46% and 41% of DistilBERT's and TF-IDF's. That the LLM gains most under an LLM judge</w:t>
-      </w:r>
-      <w:r>
-        <w:t xml:space="preserve"> </w:t>
-      </w:r>
-      <w:r>
-        <w:t xml:space="preserve">of the same model family is expected, and we treat the judge as an automated approximation pending human</w:t>
-      </w:r>
-      <w:r>
-        <w:t xml:space="preserve"> </w:t>
-      </w:r>
-      <w:r>
-        <w:t xml:space="preserve">validation (Section 9). The measured cross-jurisdiction gap therefore conflates three effects that this</w:t>
+        <w:t xml:space="preserve">disagreements, and about 46% and 41% of DistilBERT's and TF-IDF's. To test whether this reflects same-family</w:t>
+      </w:r>
+      <w:r>
+        <w:t xml:space="preserve"> </w:t>
+      </w:r>
+      <w:r>
+        <w:t xml:space="preserve">self-agreement, we repeated the acceptable-set judgment with an independent judge from a different model</w:t>
+      </w:r>
+      <w:r>
+        <w:t xml:space="preserve"> </w:t>
+      </w:r>
+      <w:r>
+        <w:t xml:space="preserve">family (gemini-2.5-flash). The two judges agree on the acceptable set for 75% of requests (mean Jaccard 0.86),</w:t>
+      </w:r>
+      <w:r>
+        <w:t xml:space="preserve"> </w:t>
+      </w:r>
+      <w:r>
+        <w:t xml:space="preserve">and the lenient scores barely move: the LLM's cross-city accuracy is 0.964 under the independent judge versus</w:t>
+      </w:r>
+      <w:r>
+        <w:t xml:space="preserve"> </w:t>
+      </w:r>
+      <w:r>
+        <w:t xml:space="preserve">0.981 under gpt-4o-mini, and DistilBERT's and TF-IDF's shift by under 0.01. Even the two-judge consensus, where</w:t>
+      </w:r>
+      <w:r>
+        <w:t xml:space="preserve"> </w:t>
+      </w:r>
+      <w:r>
+        <w:t xml:space="preserve">both judges reject the city label, finds 9.7% of city labels textually unsupported. The effect is therefore</w:t>
+      </w:r>
+      <w:r>
+        <w:t xml:space="preserve"> </w:t>
+      </w:r>
+      <w:r>
+        <w:t xml:space="preserve">not an artifact of same-family judging; human validation of a subset remains the natural next step (Section 9). The measured cross-jurisdiction gap therefore conflates three effects that this</w:t>
       </w:r>
       <w:r>
         <w:t xml:space="preserve"> </w:t>
@@ -2959,19 +2983,19 @@
         <w:t xml:space="preserve"> </w:t>
       </w:r>
       <w:r>
-        <w:t xml:space="preserve">next step and would ground the acceptable-set metric. The judge and the zero-shot arm share a model family</w:t>
-      </w:r>
-      <w:r>
-        <w:t xml:space="preserve"> </w:t>
-      </w:r>
-      <w:r>
-        <w:t xml:space="preserve">(gpt-4o-mini), which could inflate the LLM's lenient scores relative to the trained models, and the human-</w:t>
-      </w:r>
-      <w:r>
-        <w:t xml:space="preserve"> </w:t>
-      </w:r>
-      <w:r>
-        <w:t xml:space="preserve">validation subset above also addresses this. The LLM arm is a single model at temperature zero, and</w:t>
+        <w:t xml:space="preserve">next step and would ground the acceptable-set metric. We mitigate same-family bias between the judge and the</w:t>
+      </w:r>
+      <w:r>
+        <w:t xml:space="preserve"> </w:t>
+      </w:r>
+      <w:r>
+        <w:t xml:space="preserve">zero-shot arm by confirming the defensibility effect with an independent-family judge (Section 7), which</w:t>
+      </w:r>
+      <w:r>
+        <w:t xml:space="preserve"> </w:t>
+      </w:r>
+      <w:r>
+        <w:t xml:space="preserve">leaves the lenient scores nearly unchanged; a multi-annotator human study remains the definitive check. The LLM arm is a single model at temperature zero, and</w:t>
       </w:r>
       <w:r>
         <w:t xml:space="preserve"> </w:t>

</xml_diff>

<commit_message>
Add frontier gpt-4o arm (0.704) + few-shot ablation (0.650=zero-shot); LLM advantage is from label semantics + scale, not examples
Batch API (50% off) used for all LLM runs. gpt-4o significantly > gpt-4o-mini (P>0.99);
few-shot indistinguishable from zero-shot (P=0.44). Batch reproduces sync (n.s.).

Co-Authored-By: Claude Opus 4.8 <noreply@anthropic.com>
</commit_message>
<xml_diff>
--- a/docs/paper.docx
+++ b/docs/paper.docx
@@ -1911,7 +1911,25 @@
         <w:t xml:space="preserve"> </w:t>
       </w:r>
       <w:r>
-        <w:t xml:space="preserve">cross-jurisdiction condition. Hyperparameters and the verbatim prompt are released with the code.</w:t>
+        <w:t xml:space="preserve">cross-jurisdiction condition. As LLM ablations we also report gpt-4o (a stronger model) and a few-shot variant</w:t>
+      </w:r>
+      <w:r>
+        <w:t xml:space="preserve"> </w:t>
+      </w:r>
+      <w:r>
+        <w:t xml:space="preserve">that adds one labeled exemplar per class drawn from the training cities. LLM inference runs through the</w:t>
+      </w:r>
+      <w:r>
+        <w:t xml:space="preserve"> </w:t>
+      </w:r>
+      <w:r>
+        <w:t xml:space="preserve">provider batch APIs at half the standard token price. Hyperparameters and the verbatim prompt are released</w:t>
+      </w:r>
+      <w:r>
+        <w:t xml:space="preserve"> </w:t>
+      </w:r>
+      <w:r>
+        <w:t xml:space="preserve">with the code.</w:t>
       </w:r>
     </w:p>
     <w:bookmarkEnd w:id="35"/>
@@ -2212,7 +2230,7 @@
               <w:jc w:val="left"/>
             </w:pPr>
             <w:r>
-              <w:t xml:space="preserve">LLM zero-shot (taxonomy in prompt)</w:t>
+              <w:t xml:space="preserve">LLM zero-shot, gpt-4o-mini (taxonomy in prompt)</w:t>
             </w:r>
           </w:p>
         </w:tc>
@@ -2261,6 +2279,68 @@
             </w:pPr>
             <w:r>
               <w:t xml:space="preserve">0.622</w:t>
+            </w:r>
+          </w:p>
+        </w:tc>
+      </w:tr>
+      <w:tr>
+        <w:tc>
+          <w:tcPr/>
+          <w:p>
+            <w:pPr>
+              <w:pStyle w:val="Compact"/>
+              <w:jc w:val="left"/>
+            </w:pPr>
+            <w:r>
+              <w:t xml:space="preserve">LLM zero-shot, gpt-4o</w:t>
+            </w:r>
+          </w:p>
+        </w:tc>
+        <w:tc>
+          <w:tcPr/>
+          <w:p>
+            <w:pPr>
+              <w:pStyle w:val="Compact"/>
+              <w:jc w:val="left"/>
+            </w:pPr>
+            <w:r>
+              <w:t xml:space="preserve">—</w:t>
+            </w:r>
+          </w:p>
+        </w:tc>
+        <w:tc>
+          <w:tcPr/>
+          <w:p>
+            <w:pPr>
+              <w:pStyle w:val="Compact"/>
+              <w:jc w:val="left"/>
+            </w:pPr>
+            <w:r>
+              <w:t xml:space="preserve">0.704 [.67,.73]</w:t>
+            </w:r>
+          </w:p>
+        </w:tc>
+        <w:tc>
+          <w:tcPr/>
+          <w:p>
+            <w:pPr>
+              <w:pStyle w:val="Compact"/>
+              <w:jc w:val="left"/>
+            </w:pPr>
+            <w:r>
+              <w:t xml:space="preserve">—</w:t>
+            </w:r>
+          </w:p>
+        </w:tc>
+        <w:tc>
+          <w:tcPr/>
+          <w:p>
+            <w:pPr>
+              <w:pStyle w:val="Compact"/>
+              <w:jc w:val="left"/>
+            </w:pPr>
+            <w:r>
+              <w:t xml:space="preserve">0.668</w:t>
             </w:r>
           </w:p>
         </w:tc>
@@ -2378,6 +2458,51 @@
       </w:r>
       <w:r>
         <w:t xml:space="preserve">gap; Section 7 tests this reading directly.</w:t>
+      </w:r>
+    </w:p>
+    <w:p>
+      <w:pPr>
+        <w:pStyle w:val="BodyText"/>
+        <w:jc w:val="both"/>
+      </w:pPr>
+      <w:r>
+        <w:t xml:space="preserve">To ask what drives the LLM's cross-jurisdiction advantage, we vary the model and the prompt. A stronger</w:t>
+      </w:r>
+      <w:r>
+        <w:t xml:space="preserve"> </w:t>
+      </w:r>
+      <w:r>
+        <w:t xml:space="preserve">model widens it: gpt-4o reaches 0.704, significantly above gpt-4o-mini (0.654; paired bootstrap P&gt;0.99).</w:t>
+      </w:r>
+      <w:r>
+        <w:t xml:space="preserve"> </w:t>
+      </w:r>
+      <w:r>
+        <w:t xml:space="preserve">Adding in-context examples does not: gpt-4o-mini given one labeled exemplar per class drawn from the training</w:t>
+      </w:r>
+      <w:r>
+        <w:t xml:space="preserve"> </w:t>
+      </w:r>
+      <w:r>
+        <w:t xml:space="preserve">cities scores 0.650, statistically indistinguishable from its zero-shot result (P=0.44). The advantage</w:t>
+      </w:r>
+      <w:r>
+        <w:t xml:space="preserve"> </w:t>
+      </w:r>
+      <w:r>
+        <w:t xml:space="preserve">therefore comes from the target-label semantics that the taxonomy places in the prompt, and grows with model</w:t>
+      </w:r>
+      <w:r>
+        <w:t xml:space="preserve"> </w:t>
+      </w:r>
+      <w:r>
+        <w:t xml:space="preserve">capacity, rather than from few-shot demonstrations. As a pipeline check, running gpt-4o-mini through the batch</w:t>
+      </w:r>
+      <w:r>
+        <w:t xml:space="preserve"> </w:t>
+      </w:r>
+      <w:r>
+        <w:t xml:space="preserve">API reproduces the synchronous result (0.644 versus 0.654, not significant).</w:t>
       </w:r>
     </w:p>
     <w:p>

</xml_diff>

<commit_message>
LRE-review experiments: encoder breadth (RoBERTa), label-semantic baselines (sbert/NLI), dedup + taxonomy robustness; expand related work to 24 refs (bibtest-valid)
Gap survives dedup (0.279 vs 0.269) + coarsening; RoBERTa doesn't help transfer;
label semantics alone insufficient (sbert 0.51, NLI 0.48 < LLM 0.65).

Co-Authored-By: Claude Opus 4.8 <noreply@anthropic.com>
</commit_message>
<xml_diff>
--- a/docs/paper.docx
+++ b/docs/paper.docx
@@ -58,7 +58,7 @@
         <w:t xml:space="preserve">Classification</w:t>
       </w:r>
     </w:p>
-    <w:bookmarkStart w:id="69" w:name="X90e4dd8225390731b72929ba27f3cf8718ade98"/>
+    <w:bookmarkStart w:id="81" w:name="X90e4dd8225390731b72929ba27f3cf8718ade98"/>
     <w:p>
       <w:pPr>
         <w:pStyle w:val="Heading1"/>
@@ -629,13 +629,61 @@
         <w:t xml:space="preserve"> </w:t>
       </w:r>
       <w:r>
-        <w:t xml:space="preserve">single-platform or two-city; none provides a public multi-city benchmark with fixed splits, and we</w:t>
-      </w:r>
-      <w:r>
-        <w:t xml:space="preserve"> </w:t>
-      </w:r>
-      <w:r>
-        <w:t xml:space="preserve">are aware of no peer-reviewed US-city transformer-on-311 routing benchmark, which is the gap we fill.</w:t>
+        <w:t xml:space="preserve">single-platform or two-city; none provides a public multi-city benchmark with fixed splits. Nalchigar and Fox</w:t>
+      </w:r>
+      <w:r>
+        <w:t xml:space="preserve"> </w:t>
+      </w:r>
+      <w:r>
+        <w:t xml:space="preserve">build a 311 reference ontology to align service codes across cities</w:t>
+      </w:r>
+      <w:r>
+        <w:t xml:space="preserve"> </w:t>
+      </w:r>
+      <w:hyperlink w:anchor="r18">
+        <w:r>
+          <w:rPr>
+            <w:rStyle w:val="Hyperlink"/>
+            <w:vertAlign w:val="superscript"/>
+          </w:rPr>
+          <w:t xml:space="preserve">[18]</w:t>
+        </w:r>
+      </w:hyperlink>
+      <w:r>
+        <w:t xml:space="preserve">, the</w:t>
+      </w:r>
+      <w:r>
+        <w:t xml:space="preserve"> </w:t>
+      </w:r>
+      <w:r>
+        <w:t xml:space="preserve">closest precedent to our harmonization, but release no public benchmark or evaluation splits, and White and</w:t>
+      </w:r>
+      <w:r>
+        <w:t xml:space="preserve"> </w:t>
+      </w:r>
+      <w:r>
+        <w:t xml:space="preserve">Trump caution that 311 reporting is a noisy, biased signal of citizen need</w:t>
+      </w:r>
+      <w:r>
+        <w:t xml:space="preserve"> </w:t>
+      </w:r>
+      <w:hyperlink w:anchor="r24">
+        <w:r>
+          <w:rPr>
+            <w:rStyle w:val="Hyperlink"/>
+            <w:vertAlign w:val="superscript"/>
+          </w:rPr>
+          <w:t xml:space="preserve">[24]</w:t>
+        </w:r>
+      </w:hyperlink>
+      <w:r>
+        <w:t xml:space="preserve">.</w:t>
+      </w:r>
+      <w:r>
+        <w:t xml:space="preserve"> </w:t>
+      </w:r>
+      <w:r>
+        <w:t xml:space="preserve">We are aware of no peer-reviewed US-city transformer-on-311 routing benchmark, which is the gap we fill.</w:t>
       </w:r>
     </w:p>
     <w:bookmarkEnd w:id="24"/>
@@ -690,13 +738,43 @@
         </w:r>
       </w:hyperlink>
       <w:r>
-        <w:t xml:space="preserve">. We treat each city as a domain whose taxonomy</w:t>
-      </w:r>
-      <w:r>
-        <w:t xml:space="preserve"> </w:t>
-      </w:r>
-      <w:r>
-        <w:t xml:space="preserve">and register shift jointly.</w:t>
+        <w:t xml:space="preserve">; surveys of NLP domain adaptation</w:t>
+      </w:r>
+      <w:r>
+        <w:t xml:space="preserve"> </w:t>
+      </w:r>
+      <w:hyperlink w:anchor="r14">
+        <w:r>
+          <w:rPr>
+            <w:rStyle w:val="Hyperlink"/>
+            <w:vertAlign w:val="superscript"/>
+          </w:rPr>
+          <w:t xml:space="preserve">[14]</w:t>
+        </w:r>
+      </w:hyperlink>
+      <w:r>
+        <w:t xml:space="preserve"> </w:t>
+      </w:r>
+      <w:r>
+        <w:t xml:space="preserve">and the strong-baseline lessons of DomainBed</w:t>
+      </w:r>
+      <w:r>
+        <w:t xml:space="preserve"> </w:t>
+      </w:r>
+      <w:hyperlink w:anchor="r21">
+        <w:r>
+          <w:rPr>
+            <w:rStyle w:val="Hyperlink"/>
+            <w:vertAlign w:val="superscript"/>
+          </w:rPr>
+          <w:t xml:space="preserve">[21]</w:t>
+        </w:r>
+      </w:hyperlink>
+      <w:r>
+        <w:t xml:space="preserve"> </w:t>
+      </w:r>
+      <w:r>
+        <w:t xml:space="preserve">inform our setup. We treat each city as a domain whose taxonomy and register shift jointly.</w:t>
       </w:r>
     </w:p>
     <w:bookmarkEnd w:id="25"/>
@@ -772,13 +850,91 @@
         </w:r>
       </w:hyperlink>
       <w:r>
-        <w:t xml:space="preserve">. Administrative-code</w:t>
-      </w:r>
-      <w:r>
-        <w:t xml:space="preserve"> </w:t>
-      </w:r>
-      <w:r>
-        <w:t xml:space="preserve">harmonization, such as occupation coding</w:t>
+        <w:t xml:space="preserve">. A parallel</w:t>
+      </w:r>
+      <w:r>
+        <w:t xml:space="preserve"> </w:t>
+      </w:r>
+      <w:r>
+        <w:t xml:space="preserve">line in perspectivist NLP argues that human label variation is often legitimate rather than error, and that</w:t>
+      </w:r>
+      <w:r>
+        <w:t xml:space="preserve"> </w:t>
+      </w:r>
+      <w:r>
+        <w:t xml:space="preserve">evaluation should credit multiple valid labels</w:t>
+      </w:r>
+      <w:r>
+        <w:t xml:space="preserve"> </w:t>
+      </w:r>
+      <w:hyperlink w:anchor="r15">
+        <w:r>
+          <w:rPr>
+            <w:rStyle w:val="Hyperlink"/>
+            <w:vertAlign w:val="superscript"/>
+          </w:rPr>
+          <w:t xml:space="preserve">[15]</w:t>
+        </w:r>
+      </w:hyperlink>
+      <w:r>
+        <w:rPr>
+          <w:vertAlign w:val="superscript"/>
+        </w:rPr>
+        <w:t xml:space="preserve">,</w:t>
+      </w:r>
+      <w:hyperlink w:anchor="r16">
+        <w:r>
+          <w:rPr>
+            <w:rStyle w:val="Hyperlink"/>
+            <w:vertAlign w:val="superscript"/>
+          </w:rPr>
+          <w:t xml:space="preserve">[16]</w:t>
+        </w:r>
+      </w:hyperlink>
+      <w:r>
+        <w:rPr>
+          <w:vertAlign w:val="superscript"/>
+        </w:rPr>
+        <w:t xml:space="preserve">,</w:t>
+      </w:r>
+      <w:hyperlink w:anchor="r17">
+        <w:r>
+          <w:rPr>
+            <w:rStyle w:val="Hyperlink"/>
+            <w:vertAlign w:val="superscript"/>
+          </w:rPr>
+          <w:t xml:space="preserve">[17]</w:t>
+        </w:r>
+      </w:hyperlink>
+      <w:r>
+        <w:rPr>
+          <w:vertAlign w:val="superscript"/>
+        </w:rPr>
+        <w:t xml:space="preserve">,</w:t>
+      </w:r>
+      <w:hyperlink w:anchor="r23">
+        <w:r>
+          <w:rPr>
+            <w:rStyle w:val="Hyperlink"/>
+            <w:vertAlign w:val="superscript"/>
+          </w:rPr>
+          <w:t xml:space="preserve">[23]</w:t>
+        </w:r>
+      </w:hyperlink>
+      <w:r>
+        <w:t xml:space="preserve">;</w:t>
+      </w:r>
+      <w:r>
+        <w:t xml:space="preserve"> </w:t>
+      </w:r>
+      <w:r>
+        <w:t xml:space="preserve">our acceptable-set metric is an instance of this ambiguity-aware evaluation. Administrative-code harmonization,</w:t>
+      </w:r>
+      <w:r>
+        <w:t xml:space="preserve"> </w:t>
+      </w:r>
+      <w:r>
+        <w:t xml:space="preserve">such as occupation coding</w:t>
       </w:r>
       <w:r>
         <w:t xml:space="preserve"> </w:t>
@@ -792,14 +948,47 @@
           <w:t xml:space="preserve">[10]</w:t>
         </w:r>
       </w:hyperlink>
-      <w:r>
-        <w:t xml:space="preserve">, is a direct analogue: short text</w:t>
-      </w:r>
-      <w:r>
-        <w:t xml:space="preserve"> </w:t>
-      </w:r>
-      <w:r>
-        <w:t xml:space="preserve">mapped to a contested hierarchical code. Our gap analysis applies this lens to cross-jurisdiction transfer.</w:t>
+      <w:hyperlink w:anchor="r20">
+        <w:r>
+          <w:rPr>
+            <w:rStyle w:val="Hyperlink"/>
+            <w:vertAlign w:val="superscript"/>
+          </w:rPr>
+          <w:t xml:space="preserve">,[20]</w:t>
+        </w:r>
+      </w:hyperlink>
+      <w:r>
+        <w:t xml:space="preserve"> </w:t>
+      </w:r>
+      <w:r>
+        <w:t xml:space="preserve">and medical coding from</w:t>
+      </w:r>
+      <w:r>
+        <w:t xml:space="preserve"> </w:t>
+      </w:r>
+      <w:r>
+        <w:t xml:space="preserve">clinical text</w:t>
+      </w:r>
+      <w:r>
+        <w:t xml:space="preserve"> </w:t>
+      </w:r>
+      <w:hyperlink w:anchor="r19">
+        <w:r>
+          <w:rPr>
+            <w:rStyle w:val="Hyperlink"/>
+            <w:vertAlign w:val="superscript"/>
+          </w:rPr>
+          <w:t xml:space="preserve">[19]</w:t>
+        </w:r>
+      </w:hyperlink>
+      <w:r>
+        <w:t xml:space="preserve">, is a direct analogue: short text mapped to a contested</w:t>
+      </w:r>
+      <w:r>
+        <w:t xml:space="preserve"> </w:t>
+      </w:r>
+      <w:r>
+        <w:t xml:space="preserve">hierarchical code. Our gap analysis applies this lens to cross-jurisdiction transfer.</w:t>
       </w:r>
     </w:p>
     <w:bookmarkEnd w:id="26"/>
@@ -875,7 +1064,28 @@
         <w:t xml:space="preserve"> </w:t>
       </w:r>
       <w:r>
-        <w:t xml:space="preserve">liability.</w:t>
+        <w:t xml:space="preserve">liability. Label-semantic pretraining injects label descriptions into the model</w:t>
+      </w:r>
+      <w:r>
+        <w:t xml:space="preserve"> </w:t>
+      </w:r>
+      <w:hyperlink w:anchor="r22">
+        <w:r>
+          <w:rPr>
+            <w:rStyle w:val="Hyperlink"/>
+            <w:vertAlign w:val="superscript"/>
+          </w:rPr>
+          <w:t xml:space="preserve">[22]</w:t>
+        </w:r>
+      </w:hyperlink>
+      <w:r>
+        <w:t xml:space="preserve">,</w:t>
+      </w:r>
+      <w:r>
+        <w:t xml:space="preserve"> </w:t>
+      </w:r>
+      <w:r>
+        <w:t xml:space="preserve">which our sentence-transformer and NLI baselines approximate at inference time.</w:t>
       </w:r>
     </w:p>
     <w:bookmarkEnd w:id="27"/>
@@ -1923,17 +2133,29 @@
         <w:t xml:space="preserve"> </w:t>
       </w:r>
       <w:r>
-        <w:t xml:space="preserve">provider batch APIs at half the standard token price. Hyperparameters and the verbatim prompt are released</w:t>
-      </w:r>
-      <w:r>
-        <w:t xml:space="preserve"> </w:t>
-      </w:r>
-      <w:r>
-        <w:t xml:space="preserve">with the code.</w:t>
+        <w:t xml:space="preserve">provider batch APIs at half the standard token price. As additional baselines we report (iv) a fine-tuned</w:t>
+      </w:r>
+      <w:r>
+        <w:t xml:space="preserve"> </w:t>
+      </w:r>
+      <w:r>
+        <w:t xml:space="preserve">RoBERTa-base encoder, and two zero-shot label-semantic methods that use the class descriptions but no training:</w:t>
+      </w:r>
+      <w:r>
+        <w:t xml:space="preserve"> </w:t>
+      </w:r>
+      <w:r>
+        <w:t xml:space="preserve">a sentence-transformer that assigns the nearest class-description embedding, and an NLI entailment classifier.</w:t>
+      </w:r>
+      <w:r>
+        <w:t xml:space="preserve"> </w:t>
+      </w:r>
+      <w:r>
+        <w:t xml:space="preserve">Hyperparameters and the verbatim prompt are released with the code.</w:t>
       </w:r>
     </w:p>
     <w:bookmarkEnd w:id="35"/>
-    <w:bookmarkStart w:id="42" w:name="results"/>
+    <w:bookmarkStart w:id="43" w:name="results"/>
     <w:p>
       <w:pPr>
         <w:pStyle w:val="Heading2"/>
@@ -2511,6 +2733,167 @@
         <w:jc w:val="both"/>
       </w:pPr>
       <w:r>
+        <w:t xml:space="preserve">We also widen the model families. A stronger encoder does not help transfer: fine-tuned RoBERTa reaches</w:t>
+      </w:r>
+      <w:r>
+        <w:t xml:space="preserve"> </w:t>
+      </w:r>
+      <w:r>
+        <w:t xml:space="preserve">0.840 in-city, above DistilBERT, but only 0.519 across cities, so the gap is not a weakness of the DistilBERT</w:t>
+      </w:r>
+      <w:r>
+        <w:t xml:space="preserve"> </w:t>
+      </w:r>
+      <w:r>
+        <w:t xml:space="preserve">baseline. Two zero-shot label-semantic methods that receive the class descriptions but no strong reasoning, a</w:t>
+      </w:r>
+      <w:r>
+        <w:t xml:space="preserve"> </w:t>
+      </w:r>
+      <w:r>
+        <w:t xml:space="preserve">sentence-transformer that matches each request to the nearest class-description embedding (0.510) and an NLI</w:t>
+      </w:r>
+      <w:r>
+        <w:t xml:space="preserve"> </w:t>
+      </w:r>
+      <w:r>
+        <w:t xml:space="preserve">entailment classifier (0.478), land at or below the classical TF-IDF baseline and far below the LLM. Access to</w:t>
+      </w:r>
+      <w:r>
+        <w:t xml:space="preserve"> </w:t>
+      </w:r>
+      <w:r>
+        <w:t xml:space="preserve">label semantics is therefore necessary but not sufficient: the zero-shot LLM's advantage combines the label</w:t>
+      </w:r>
+      <w:r>
+        <w:t xml:space="preserve"> </w:t>
+      </w:r>
+      <w:r>
+        <w:t xml:space="preserve">semantics in its prompt with its own capability, and neither a stronger encoder nor a simple label-matching</w:t>
+      </w:r>
+      <w:r>
+        <w:t xml:space="preserve"> </w:t>
+      </w:r>
+      <w:r>
+        <w:t xml:space="preserve">model reproduces it.</w:t>
+      </w:r>
+    </w:p>
+    <w:bookmarkStart w:id="42" w:name="robustness"/>
+    <w:p>
+      <w:pPr>
+        <w:pStyle w:val="Heading3"/>
+      </w:pPr>
+      <w:r>
+        <w:t xml:space="preserve">Robustness</w:t>
+      </w:r>
+    </w:p>
+    <w:p>
+      <w:pPr>
+        <w:pStyle w:val="FirstParagraph"/>
+        <w:jc w:val="both"/>
+      </w:pPr>
+      <w:r>
+        <w:t xml:space="preserve">Three checks indicate the gap is genuine domain shift rather than an artifact of the split or the taxonomy.</w:t>
+      </w:r>
+      <w:r>
+        <w:t xml:space="preserve"> </w:t>
+      </w:r>
+      <w:r>
+        <w:rPr>
+          <w:i/>
+          <w:iCs/>
+        </w:rPr>
+        <w:t xml:space="preserve">Deduplication:</w:t>
+      </w:r>
+      <w:r>
+        <w:t xml:space="preserve"> </w:t>
+      </w:r>
+      <w:r>
+        <w:t xml:space="preserve">18,265 training rows shared their exact text with a test request in the same city;</w:t>
+      </w:r>
+      <w:r>
+        <w:t xml:space="preserve"> </w:t>
+      </w:r>
+      <w:r>
+        <w:t xml:space="preserve">removing them, together with corpus-wide exact duplicates, barely changes the picture (DistilBERT in-city</w:t>
+      </w:r>
+      <w:r>
+        <w:t xml:space="preserve"> </w:t>
+      </w:r>
+      <w:r>
+        <w:t xml:space="preserve">0.818, cross-city 0.539), so the roughly one-third drop is not produced by train-test overlap.</w:t>
+      </w:r>
+      <w:r>
+        <w:t xml:space="preserve"> </w:t>
+      </w:r>
+      <w:r>
+        <w:rPr>
+          <w:i/>
+          <w:iCs/>
+        </w:rPr>
+        <w:t xml:space="preserve">Taxonomy</w:t>
+      </w:r>
+      <w:r>
+        <w:rPr>
+          <w:i/>
+          <w:iCs/>
+        </w:rPr>
+        <w:t xml:space="preserve"> </w:t>
+      </w:r>
+      <w:r>
+        <w:rPr>
+          <w:i/>
+          <w:iCs/>
+        </w:rPr>
+        <w:t xml:space="preserve">coarsening:</w:t>
+      </w:r>
+      <w:r>
+        <w:t xml:space="preserve"> </w:t>
+      </w:r>
+      <w:r>
+        <w:t xml:space="preserve">merging the confusable neighboring classes into an eight-class ontology recovers four to seven</w:t>
+      </w:r>
+      <w:r>
+        <w:t xml:space="preserve"> </w:t>
+      </w:r>
+      <w:r>
+        <w:t xml:space="preserve">macro-F1 points for the trained models (TF-IDF cross-city 0.523 to 0.590, DistilBERT 0.558 to 0.601), which</w:t>
+      </w:r>
+      <w:r>
+        <w:t xml:space="preserve"> </w:t>
+      </w:r>
+      <w:r>
+        <w:t xml:space="preserve">quantifies the taxonomy-boundary share of the difficulty, yet the gap to in-city persists.</w:t>
+      </w:r>
+      <w:r>
+        <w:t xml:space="preserve"> </w:t>
+      </w:r>
+      <w:r>
+        <w:rPr>
+          <w:i/>
+          <w:iCs/>
+        </w:rPr>
+        <w:t xml:space="preserve">Model family:</w:t>
+      </w:r>
+      <w:r>
+        <w:t xml:space="preserve"> </w:t>
+      </w:r>
+      <w:r>
+        <w:t xml:space="preserve">a stronger encoder and simple label-semantic classifiers, above, do not close it either. The gap is not</w:t>
+      </w:r>
+      <w:r>
+        <w:t xml:space="preserve"> </w:t>
+      </w:r>
+      <w:r>
+        <w:t xml:space="preserve">specific to one architecture, split, or taxonomy granularity.</w:t>
+      </w:r>
+    </w:p>
+    <w:p>
+      <w:pPr>
+        <w:pStyle w:val="BodyText"/>
+        <w:jc w:val="both"/>
+      </w:pPr>
+      <w:r>
         <w:t xml:space="preserve">Performance varies sharply across held-out cities (Figure 2), from the degenerate San Francisco split</w:t>
       </w:r>
       <w:r>
@@ -2598,7 +2981,8 @@
       </w:r>
     </w:p>
     <w:bookmarkEnd w:id="42"/>
-    <w:bookmarkStart w:id="49" w:name="what-the-gap-measures"/>
+    <w:bookmarkEnd w:id="43"/>
+    <w:bookmarkStart w:id="50" w:name="what-the-gap-measures"/>
     <w:p>
       <w:pPr>
         <w:pStyle w:val="Heading2"/>
@@ -2676,18 +3060,18 @@
           <wp:inline>
             <wp:extent cx="5334000" cy="3097161"/>
             <wp:effectExtent b="0" l="0" r="0" t="0"/>
-            <wp:docPr descr="Strict vs lenient accuracy by model" title="" id="44" name="Picture"/>
+            <wp:docPr descr="Strict vs lenient accuracy by model" title="" id="45" name="Picture"/>
             <a:graphic>
               <a:graphicData uri="http://schemas.openxmlformats.org/drawingml/2006/picture">
                 <pic:pic>
                   <pic:nvPicPr>
-                    <pic:cNvPr descr="fig_defensibility.png" id="45" name="Picture"/>
+                    <pic:cNvPr descr="fig_defensibility.png" id="46" name="Picture"/>
                     <pic:cNvPicPr>
                       <a:picLocks noChangeArrowheads="1" noChangeAspect="1"/>
                     </pic:cNvPicPr>
                   </pic:nvPicPr>
                   <pic:blipFill>
-                    <a:blip r:embed="rId43"/>
+                    <a:blip r:embed="rId44"/>
                     <a:stretch>
                       <a:fillRect/>
                     </a:stretch>
@@ -2840,18 +3224,18 @@
           <wp:inline>
             <wp:extent cx="5334000" cy="4593166"/>
             <wp:effectExtent b="0" l="0" r="0" t="0"/>
-            <wp:docPr descr="Cross-city confusion matrix for DistilBERT" title="" id="47" name="Picture"/>
+            <wp:docPr descr="Cross-city confusion matrix for DistilBERT" title="" id="48" name="Picture"/>
             <a:graphic>
               <a:graphicData uri="http://schemas.openxmlformats.org/drawingml/2006/picture">
                 <pic:pic>
                   <pic:nvPicPr>
-                    <pic:cNvPr descr="fig_confusion.png" id="48" name="Picture"/>
+                    <pic:cNvPr descr="fig_confusion.png" id="49" name="Picture"/>
                     <pic:cNvPicPr>
                       <a:picLocks noChangeArrowheads="1" noChangeAspect="1"/>
                     </pic:cNvPicPr>
                   </pic:nvPicPr>
                   <pic:blipFill>
-                    <a:blip r:embed="rId46"/>
+                    <a:blip r:embed="rId47"/>
                     <a:stretch>
                       <a:fillRect/>
                     </a:stretch>
@@ -2956,8 +3340,8 @@
         <w:t xml:space="preserve">taxonomy revision.</w:t>
       </w:r>
     </w:p>
-    <w:bookmarkEnd w:id="49"/>
-    <w:bookmarkStart w:id="50" w:name="discussion"/>
+    <w:bookmarkEnd w:id="50"/>
+    <w:bookmarkStart w:id="51" w:name="discussion"/>
     <w:p>
       <w:pPr>
         <w:pStyle w:val="Heading2"/>
@@ -3032,8 +3416,8 @@
         <w:t xml:space="preserve">this way.</w:t>
       </w:r>
     </w:p>
-    <w:bookmarkEnd w:id="50"/>
-    <w:bookmarkStart w:id="51" w:name="limitations-and-scope"/>
+    <w:bookmarkEnd w:id="51"/>
+    <w:bookmarkStart w:id="52" w:name="limitations-and-scope"/>
     <w:p>
       <w:pPr>
         <w:pStyle w:val="Heading2"/>
@@ -3135,8 +3519,8 @@
         <w:t xml:space="preserve">text.</w:t>
       </w:r>
     </w:p>
-    <w:bookmarkEnd w:id="51"/>
-    <w:bookmarkStart w:id="52" w:name="ethics-and-data"/>
+    <w:bookmarkEnd w:id="52"/>
+    <w:bookmarkStart w:id="53" w:name="ethics-and-data"/>
     <w:p>
       <w:pPr>
         <w:pStyle w:val="Heading2"/>
@@ -3196,8 +3580,8 @@
         <w:t xml:space="preserve">enforcement targeting.</w:t>
       </w:r>
     </w:p>
-    <w:bookmarkEnd w:id="52"/>
-    <w:bookmarkStart w:id="53" w:name="reproducibility"/>
+    <w:bookmarkEnd w:id="53"/>
+    <w:bookmarkStart w:id="54" w:name="reproducibility"/>
     <w:p>
       <w:pPr>
         <w:pStyle w:val="Heading2"/>
@@ -3319,8 +3703,8 @@
         <w:t xml:space="preserve">mismatch rates, from the released artifacts.</w:t>
       </w:r>
     </w:p>
-    <w:bookmarkEnd w:id="53"/>
-    <w:bookmarkStart w:id="68" w:name="conclusion"/>
+    <w:bookmarkEnd w:id="54"/>
+    <w:bookmarkStart w:id="80" w:name="conclusion"/>
     <w:p>
       <w:pPr>
         <w:pStyle w:val="Heading2"/>
@@ -3378,7 +3762,7 @@
         </w:pict>
       </w:r>
     </w:p>
-    <w:bookmarkStart w:id="67" w:name="references"/>
+    <w:bookmarkStart w:id="79" w:name="references"/>
     <w:p>
       <w:pPr>
         <w:pStyle w:val="Heading3"/>
@@ -3395,7 +3779,7 @@
           <w:numId w:val="1002"/>
         </w:numPr>
       </w:pPr>
-      <w:bookmarkStart w:id="54" w:name="r1"/>
+      <w:bookmarkStart w:id="55" w:name="r1"/>
       <w:r>
         <w:t xml:space="preserve">Hashemi, M. (2022). Automatic Type Detection of 311 Service Requests Based on Customer Provided Descriptions.</w:t>
       </w:r>
@@ -3412,7 +3796,7 @@
       <w:r>
         <w:t xml:space="preserve">, 36(1). doi:10.1080/08839514.2022.2073717.</w:t>
       </w:r>
-      <w:bookmarkEnd w:id="54"/>
+      <w:bookmarkEnd w:id="55"/>
     </w:p>
     <w:p>
       <w:pPr>
@@ -3422,7 +3806,7 @@
           <w:numId w:val="1002"/>
         </w:numPr>
       </w:pPr>
-      <w:bookmarkStart w:id="55" w:name="r2"/>
+      <w:bookmarkStart w:id="56" w:name="r2"/>
       <w:r>
         <w:t xml:space="preserve">Wang, L., Qian, C., Kats, P., Kontokosta, C., &amp; Sobolevsky, S. (2017). Structure of 311 Service Requests as a Signature of Urban Location.</w:t>
       </w:r>
@@ -3439,7 +3823,7 @@
       <w:r>
         <w:t xml:space="preserve">, 12(10):e0186314.</w:t>
       </w:r>
-      <w:bookmarkEnd w:id="55"/>
+      <w:bookmarkEnd w:id="56"/>
     </w:p>
     <w:p>
       <w:pPr>
@@ -3449,11 +3833,11 @@
           <w:numId w:val="1002"/>
         </w:numPr>
       </w:pPr>
-      <w:bookmarkStart w:id="56" w:name="r3"/>
+      <w:bookmarkStart w:id="57" w:name="r3"/>
       <w:r>
         <w:t xml:space="preserve">Sukel, M., Rudinac, S., &amp; Worring, M. (2019). Multimodal Classification of Urban Micro-Events. arXiv:1904.13349.</w:t>
       </w:r>
-      <w:bookmarkEnd w:id="56"/>
+      <w:bookmarkEnd w:id="57"/>
     </w:p>
     <w:p>
       <w:pPr>
@@ -3463,7 +3847,7 @@
           <w:numId w:val="1002"/>
         </w:numPr>
       </w:pPr>
-      <w:bookmarkStart w:id="57" w:name="r4"/>
+      <w:bookmarkStart w:id="58" w:name="r4"/>
       <w:r>
         <w:t xml:space="preserve">Masdeval, C., &amp; Veloso, A. (2015). Mining citizen emotions to estimate the urgency of urban issues.</w:t>
       </w:r>
@@ -3480,7 +3864,7 @@
       <w:r>
         <w:t xml:space="preserve">, 54, 147-155.</w:t>
       </w:r>
-      <w:bookmarkEnd w:id="57"/>
+      <w:bookmarkEnd w:id="58"/>
     </w:p>
     <w:p>
       <w:pPr>
@@ -3490,7 +3874,7 @@
           <w:numId w:val="1002"/>
         </w:numPr>
       </w:pPr>
-      <w:bookmarkStart w:id="58" w:name="r5"/>
+      <w:bookmarkStart w:id="59" w:name="r5"/>
       <w:r>
         <w:t xml:space="preserve">Wang, J., Lan, C., Liu, C., et al. (2023). Generalizing to Unseen Domains: A Survey on Domain Generalization.</w:t>
       </w:r>
@@ -3510,7 +3894,7 @@
       <w:r>
         <w:t xml:space="preserve">(arXiv:2103.03097).</w:t>
       </w:r>
-      <w:bookmarkEnd w:id="58"/>
+      <w:bookmarkEnd w:id="59"/>
     </w:p>
     <w:p>
       <w:pPr>
@@ -3520,11 +3904,11 @@
           <w:numId w:val="1002"/>
         </w:numPr>
       </w:pPr>
-      <w:bookmarkStart w:id="59" w:name="r6"/>
+      <w:bookmarkStart w:id="60" w:name="r6"/>
       <w:r>
         <w:t xml:space="preserve">Yuan, X., et al. (2023). Out-of-Distribution Generalization in Text Classification: Past, Present, and Future. arXiv:2305.14104.</w:t>
       </w:r>
-      <w:bookmarkEnd w:id="59"/>
+      <w:bookmarkEnd w:id="60"/>
     </w:p>
     <w:p>
       <w:pPr>
@@ -3534,7 +3918,7 @@
           <w:numId w:val="1002"/>
         </w:numPr>
       </w:pPr>
-      <w:bookmarkStart w:id="60" w:name="r7"/>
+      <w:bookmarkStart w:id="61" w:name="r7"/>
       <w:r>
         <w:t xml:space="preserve">Northcutt, C. G., Athalye, A., &amp; Mueller, J. (2021). Pervasive Label Errors in Test Sets Destabilize Machine Learning Benchmarks.</w:t>
       </w:r>
@@ -3554,7 +3938,7 @@
       <w:r>
         <w:t xml:space="preserve">(arXiv:2103.14749).</w:t>
       </w:r>
-      <w:bookmarkEnd w:id="60"/>
+      <w:bookmarkEnd w:id="61"/>
     </w:p>
     <w:p>
       <w:pPr>
@@ -3564,7 +3948,7 @@
           <w:numId w:val="1002"/>
         </w:numPr>
       </w:pPr>
-      <w:bookmarkStart w:id="61" w:name="r8"/>
+      <w:bookmarkStart w:id="62" w:name="r8"/>
       <w:r>
         <w:t xml:space="preserve">Gururangan, S., Swayamdipta, S., Levy, O., Schwartz, R., Bowman, S., &amp; Smith, N. A. (2018). Annotation Artifacts in Natural Language Inference Data.</w:t>
       </w:r>
@@ -3584,7 +3968,7 @@
       <w:r>
         <w:t xml:space="preserve">(arXiv:1803.02324).</w:t>
       </w:r>
-      <w:bookmarkEnd w:id="61"/>
+      <w:bookmarkEnd w:id="62"/>
     </w:p>
     <w:p>
       <w:pPr>
@@ -3594,7 +3978,7 @@
           <w:numId w:val="1002"/>
         </w:numPr>
       </w:pPr>
-      <w:bookmarkStart w:id="62" w:name="r9"/>
+      <w:bookmarkStart w:id="63" w:name="r9"/>
       <w:r>
         <w:t xml:space="preserve">Raji, I. D., Bender, E. M., Paullada, A., Denton, E., &amp; Hanna, A. (2021). AI and the Everything in the Whole Wide World Benchmark.</w:t>
       </w:r>
@@ -3614,7 +3998,7 @@
       <w:r>
         <w:t xml:space="preserve">(arXiv:2111.15366).</w:t>
       </w:r>
-      <w:bookmarkEnd w:id="62"/>
+      <w:bookmarkEnd w:id="63"/>
     </w:p>
     <w:p>
       <w:pPr>
@@ -3624,7 +4008,7 @@
           <w:numId w:val="1002"/>
         </w:numPr>
       </w:pPr>
-      <w:bookmarkStart w:id="63" w:name="r10"/>
+      <w:bookmarkStart w:id="64" w:name="r10"/>
       <w:r>
         <w:t xml:space="preserve">Schierholz, M., &amp; Schonlau, M. (2023). Automated occupation coding with hierarchical features.</w:t>
       </w:r>
@@ -3641,7 +4025,7 @@
       <w:r>
         <w:t xml:space="preserve">.</w:t>
       </w:r>
-      <w:bookmarkEnd w:id="63"/>
+      <w:bookmarkEnd w:id="64"/>
     </w:p>
     <w:p>
       <w:pPr>
@@ -3651,7 +4035,7 @@
           <w:numId w:val="1002"/>
         </w:numPr>
       </w:pPr>
-      <w:bookmarkStart w:id="64" w:name="r11"/>
+      <w:bookmarkStart w:id="65" w:name="r11"/>
       <w:r>
         <w:t xml:space="preserve">Yin, W., Hay, J., &amp; Roth, D. (2019). Benchmarking Zero-shot Text Classification: Datasets, Evaluation and Entailment Approach.</w:t>
       </w:r>
@@ -3671,7 +4055,7 @@
       <w:r>
         <w:t xml:space="preserve">(arXiv:1909.00161).</w:t>
       </w:r>
-      <w:bookmarkEnd w:id="64"/>
+      <w:bookmarkEnd w:id="65"/>
     </w:p>
     <w:p>
       <w:pPr>
@@ -3681,11 +4065,11 @@
           <w:numId w:val="1002"/>
         </w:numPr>
       </w:pPr>
-      <w:bookmarkStart w:id="65" w:name="r12"/>
+      <w:bookmarkStart w:id="66" w:name="r12"/>
       <w:r>
         <w:t xml:space="preserve">Bucher, M. J. J., &amp; Martini, M. (2024). Fine-Tuned "Small" LLMs (Still) Significantly Outperform Zero-Shot Generative AI Models in Text Classification. arXiv:2406.08660.</w:t>
       </w:r>
-      <w:bookmarkEnd w:id="65"/>
+      <w:bookmarkEnd w:id="66"/>
     </w:p>
     <w:p>
       <w:pPr>
@@ -3695,11 +4079,308 @@
           <w:numId w:val="1002"/>
         </w:numPr>
       </w:pPr>
-      <w:bookmarkStart w:id="66" w:name="r13"/>
+      <w:bookmarkStart w:id="67" w:name="r13"/>
       <w:r>
         <w:t xml:space="preserve">Kontokosta, C. E., &amp; Hong, B. (2017). Equity in 311 Reporting: Socio-Spatial Differentials in the Propensity to Complain. arXiv:1710.02452.</w:t>
       </w:r>
-      <w:bookmarkEnd w:id="66"/>
+      <w:bookmarkEnd w:id="67"/>
+    </w:p>
+    <w:p>
+      <w:pPr>
+        <w:pStyle w:val="Compact"/>
+        <w:numPr>
+          <w:ilvl w:val="0"/>
+          <w:numId w:val="1002"/>
+        </w:numPr>
+      </w:pPr>
+      <w:bookmarkStart w:id="68" w:name="r14"/>
+      <w:r>
+        <w:t xml:space="preserve">Ramponi, A., &amp; Plank, B. (2020). Neural Unsupervised Domain Adaptation in NLP—A Survey.</w:t>
+      </w:r>
+      <w:r>
+        <w:t xml:space="preserve"> </w:t>
+      </w:r>
+      <w:r>
+        <w:rPr>
+          <w:i/>
+          <w:iCs/>
+        </w:rPr>
+        <w:t xml:space="preserve">COLING</w:t>
+      </w:r>
+      <w:r>
+        <w:t xml:space="preserve">. aclanthology.org/2020.coling-main.603.</w:t>
+      </w:r>
+      <w:bookmarkEnd w:id="68"/>
+    </w:p>
+    <w:p>
+      <w:pPr>
+        <w:pStyle w:val="Compact"/>
+        <w:numPr>
+          <w:ilvl w:val="0"/>
+          <w:numId w:val="1002"/>
+        </w:numPr>
+      </w:pPr>
+      <w:bookmarkStart w:id="69" w:name="r15"/>
+      <w:r>
+        <w:t xml:space="preserve">Plank, B. (2022). The "Problem" of Human Label Variation: On Ground Truth in Data, Modeling and Evaluation.</w:t>
+      </w:r>
+      <w:r>
+        <w:t xml:space="preserve"> </w:t>
+      </w:r>
+      <w:r>
+        <w:rPr>
+          <w:i/>
+          <w:iCs/>
+        </w:rPr>
+        <w:t xml:space="preserve">EMNLP</w:t>
+      </w:r>
+      <w:r>
+        <w:t xml:space="preserve">. arXiv:2211.02570.</w:t>
+      </w:r>
+      <w:bookmarkEnd w:id="69"/>
+    </w:p>
+    <w:p>
+      <w:pPr>
+        <w:pStyle w:val="Compact"/>
+        <w:numPr>
+          <w:ilvl w:val="0"/>
+          <w:numId w:val="1002"/>
+        </w:numPr>
+      </w:pPr>
+      <w:bookmarkStart w:id="70" w:name="r16"/>
+      <w:r>
+        <w:t xml:space="preserve">Uma, A., Fornaciari, T., Hovy, D., Paun, S., Plank, B., &amp; Poesio, M. (2021). Learning from Disagreement: A Survey.</w:t>
+      </w:r>
+      <w:r>
+        <w:t xml:space="preserve"> </w:t>
+      </w:r>
+      <w:r>
+        <w:rPr>
+          <w:i/>
+          <w:iCs/>
+        </w:rPr>
+        <w:t xml:space="preserve">JAIR</w:t>
+      </w:r>
+      <w:r>
+        <w:t xml:space="preserve">, 72, 1385-1470.</w:t>
+      </w:r>
+      <w:bookmarkEnd w:id="70"/>
+    </w:p>
+    <w:p>
+      <w:pPr>
+        <w:pStyle w:val="Compact"/>
+        <w:numPr>
+          <w:ilvl w:val="0"/>
+          <w:numId w:val="1002"/>
+        </w:numPr>
+      </w:pPr>
+      <w:bookmarkStart w:id="71" w:name="r17"/>
+      <w:r>
+        <w:t xml:space="preserve">Leonardelli, E., et al. (2023). SemEval-2023 Task 11: Learning with Disagreements (LeWiDi).</w:t>
+      </w:r>
+      <w:r>
+        <w:t xml:space="preserve"> </w:t>
+      </w:r>
+      <w:r>
+        <w:rPr>
+          <w:i/>
+          <w:iCs/>
+        </w:rPr>
+        <w:t xml:space="preserve">SemEval</w:t>
+      </w:r>
+      <w:r>
+        <w:t xml:space="preserve">. arXiv:2304.14803.</w:t>
+      </w:r>
+      <w:bookmarkEnd w:id="71"/>
+    </w:p>
+    <w:p>
+      <w:pPr>
+        <w:pStyle w:val="Compact"/>
+        <w:numPr>
+          <w:ilvl w:val="0"/>
+          <w:numId w:val="1002"/>
+        </w:numPr>
+      </w:pPr>
+      <w:bookmarkStart w:id="72" w:name="r18"/>
+      <w:r>
+        <w:t xml:space="preserve">Nalchigar, S., &amp; Fox, M. S. (2017). Achieving Interoperability of Smart City Data: An Analysis of 311 Data.</w:t>
+      </w:r>
+      <w:r>
+        <w:t xml:space="preserve"> </w:t>
+      </w:r>
+      <w:r>
+        <w:rPr>
+          <w:i/>
+          <w:iCs/>
+        </w:rPr>
+        <w:t xml:space="preserve">Journal of Smart Cities</w:t>
+      </w:r>
+      <w:r>
+        <w:t xml:space="preserve">, 3(1).</w:t>
+      </w:r>
+      <w:bookmarkEnd w:id="72"/>
+    </w:p>
+    <w:p>
+      <w:pPr>
+        <w:pStyle w:val="Compact"/>
+        <w:numPr>
+          <w:ilvl w:val="0"/>
+          <w:numId w:val="1002"/>
+        </w:numPr>
+      </w:pPr>
+      <w:bookmarkStart w:id="73" w:name="r19"/>
+      <w:r>
+        <w:t xml:space="preserve">Mullenbach, J., Wiegreffe, S., Duke, J., Sun, J., &amp; Eisenstein, J. (2018). Explainable Prediction of Medical Codes from Clinical Text.</w:t>
+      </w:r>
+      <w:r>
+        <w:t xml:space="preserve"> </w:t>
+      </w:r>
+      <w:r>
+        <w:rPr>
+          <w:i/>
+          <w:iCs/>
+        </w:rPr>
+        <w:t xml:space="preserve">NAACL-HLT</w:t>
+      </w:r>
+      <w:r>
+        <w:t xml:space="preserve">. arXiv:1802.05695.</w:t>
+      </w:r>
+      <w:bookmarkEnd w:id="73"/>
+    </w:p>
+    <w:p>
+      <w:pPr>
+        <w:pStyle w:val="Compact"/>
+        <w:numPr>
+          <w:ilvl w:val="0"/>
+          <w:numId w:val="1002"/>
+        </w:numPr>
+      </w:pPr>
+      <w:bookmarkStart w:id="74" w:name="r20"/>
+      <w:r>
+        <w:t xml:space="preserve">Gweon, H., Schonlau, M., Kaczmirek, L., Blohm, M., &amp; Steiner, S. (2017). Three Methods for Occupation Coding Based on Statistical Learning.</w:t>
+      </w:r>
+      <w:r>
+        <w:t xml:space="preserve"> </w:t>
+      </w:r>
+      <w:r>
+        <w:rPr>
+          <w:i/>
+          <w:iCs/>
+        </w:rPr>
+        <w:t xml:space="preserve">Journal of Official Statistics</w:t>
+      </w:r>
+      <w:r>
+        <w:t xml:space="preserve">, 33(1), 101-122.</w:t>
+      </w:r>
+      <w:bookmarkEnd w:id="74"/>
+    </w:p>
+    <w:p>
+      <w:pPr>
+        <w:pStyle w:val="Compact"/>
+        <w:numPr>
+          <w:ilvl w:val="0"/>
+          <w:numId w:val="1002"/>
+        </w:numPr>
+      </w:pPr>
+      <w:bookmarkStart w:id="75" w:name="r21"/>
+      <w:r>
+        <w:t xml:space="preserve">Gulrajani, I., &amp; Lopez-Paz, D. (2021). In Search of Lost Domain Generalization.</w:t>
+      </w:r>
+      <w:r>
+        <w:t xml:space="preserve"> </w:t>
+      </w:r>
+      <w:r>
+        <w:rPr>
+          <w:i/>
+          <w:iCs/>
+        </w:rPr>
+        <w:t xml:space="preserve">ICLR</w:t>
+      </w:r>
+      <w:r>
+        <w:t xml:space="preserve">. arXiv:2007.01434.</w:t>
+      </w:r>
+      <w:bookmarkEnd w:id="75"/>
+    </w:p>
+    <w:p>
+      <w:pPr>
+        <w:pStyle w:val="Compact"/>
+        <w:numPr>
+          <w:ilvl w:val="0"/>
+          <w:numId w:val="1002"/>
+        </w:numPr>
+      </w:pPr>
+      <w:bookmarkStart w:id="76" w:name="r22"/>
+      <w:r>
+        <w:t xml:space="preserve">Mueller, A., Krone, J., Romeo, S., Mansour, S., Mansimov, E., Zhang, Y., &amp; Roth, D. (2022). Label Semantic Aware Pre-training for Few-shot Text Classification.</w:t>
+      </w:r>
+      <w:r>
+        <w:t xml:space="preserve"> </w:t>
+      </w:r>
+      <w:r>
+        <w:rPr>
+          <w:i/>
+          <w:iCs/>
+        </w:rPr>
+        <w:t xml:space="preserve">ACL</w:t>
+      </w:r>
+      <w:r>
+        <w:t xml:space="preserve">. arXiv:2204.07128.</w:t>
+      </w:r>
+      <w:bookmarkEnd w:id="76"/>
+    </w:p>
+    <w:p>
+      <w:pPr>
+        <w:pStyle w:val="Compact"/>
+        <w:numPr>
+          <w:ilvl w:val="0"/>
+          <w:numId w:val="1002"/>
+        </w:numPr>
+      </w:pPr>
+      <w:bookmarkStart w:id="77" w:name="r23"/>
+      <w:r>
+        <w:t xml:space="preserve">Aroyo, L., &amp; Welty, C. (2015). Truth Is a Lie: Crowd Truth and the Seven Myths of Human Annotation.</w:t>
+      </w:r>
+      <w:r>
+        <w:t xml:space="preserve"> </w:t>
+      </w:r>
+      <w:r>
+        <w:rPr>
+          <w:i/>
+          <w:iCs/>
+        </w:rPr>
+        <w:t xml:space="preserve">AI Magazine</w:t>
+      </w:r>
+      <w:r>
+        <w:t xml:space="preserve">, 36(1), 15-24.</w:t>
+      </w:r>
+      <w:bookmarkEnd w:id="77"/>
+    </w:p>
+    <w:p>
+      <w:pPr>
+        <w:pStyle w:val="Compact"/>
+        <w:numPr>
+          <w:ilvl w:val="0"/>
+          <w:numId w:val="1002"/>
+        </w:numPr>
+      </w:pPr>
+      <w:bookmarkStart w:id="78" w:name="r24"/>
+      <w:r>
+        <w:t xml:space="preserve">White, A., &amp; Trump, K. S. (2018). The Promises and Pitfalls of 311 Data.</w:t>
+      </w:r>
+      <w:r>
+        <w:t xml:space="preserve"> </w:t>
+      </w:r>
+      <w:r>
+        <w:rPr>
+          <w:i/>
+          <w:iCs/>
+        </w:rPr>
+        <w:t xml:space="preserve">Urban Affairs Review</w:t>
+      </w:r>
+      <w:r>
+        <w:t xml:space="preserve">, 54(4), 794-823.</w:t>
+      </w:r>
+      <w:bookmarkEnd w:id="78"/>
     </w:p>
     <w:p>
       <w:pPr>
@@ -3737,9 +4418,9 @@
         <w:t xml:space="preserve">Crossref, OpenAlex, and arXiv.</w:t>
       </w:r>
     </w:p>
-    <w:bookmarkEnd w:id="67"/>
-    <w:bookmarkEnd w:id="68"/>
-    <w:bookmarkEnd w:id="69"/>
+    <w:bookmarkEnd w:id="79"/>
+    <w:bookmarkEnd w:id="80"/>
+    <w:bookmarkEnd w:id="81"/>
     <w:sectPr/>
   </w:body>
 </w:document>

</xml_diff>

<commit_message>
Add 7x7 transfer-matrix figure + paragraph: single-source cross-city 0.247 << multi-source LOCO
Co-Authored-By: Claude Opus 4.8 <noreply@anthropic.com>
</commit_message>
<xml_diff>
--- a/docs/paper.docx
+++ b/docs/paper.docx
@@ -58,7 +58,7 @@
         <w:t xml:space="preserve">Classification</w:t>
       </w:r>
     </w:p>
-    <w:bookmarkStart w:id="81" w:name="X90e4dd8225390731b72929ba27f3cf8718ade98"/>
+    <w:bookmarkStart w:id="84" w:name="X90e4dd8225390731b72929ba27f3cf8718ade98"/>
     <w:p>
       <w:pPr>
         <w:pStyle w:val="Heading1"/>
@@ -2155,7 +2155,7 @@
       </w:r>
     </w:p>
     <w:bookmarkEnd w:id="35"/>
-    <w:bookmarkStart w:id="43" w:name="results"/>
+    <w:bookmarkStart w:id="46" w:name="results"/>
     <w:p>
       <w:pPr>
         <w:pStyle w:val="Heading2"/>
@@ -2778,7 +2778,7 @@
         <w:t xml:space="preserve">model reproduces it.</w:t>
       </w:r>
     </w:p>
-    <w:bookmarkStart w:id="42" w:name="robustness"/>
+    <w:bookmarkStart w:id="45" w:name="robustness"/>
     <w:p>
       <w:pPr>
         <w:pStyle w:val="Heading3"/>
@@ -2980,77 +2980,6 @@
         <w:t xml:space="preserve">city, and San Francisco (two content classes only) is degenerate; we handle it explicitly in Section 9.</w:t>
       </w:r>
     </w:p>
-    <w:bookmarkEnd w:id="42"/>
-    <w:bookmarkEnd w:id="43"/>
-    <w:bookmarkStart w:id="50" w:name="what-the-gap-measures"/>
-    <w:p>
-      <w:pPr>
-        <w:pStyle w:val="Heading2"/>
-      </w:pPr>
-      <w:r>
-        <w:t xml:space="preserve">7. What the gap measures</w:t>
-      </w:r>
-    </w:p>
-    <w:p>
-      <w:pPr>
-        <w:pStyle w:val="FirstParagraph"/>
-        <w:jc w:val="both"/>
-      </w:pPr>
-      <w:r>
-        <w:t xml:space="preserve">A large drop is a strong claim, so we ask how much of the gap is genuine model failure. An independent LLM</w:t>
-      </w:r>
-      <w:r>
-        <w:t xml:space="preserve"> </w:t>
-      </w:r>
-      <w:r>
-        <w:t xml:space="preserve">judge (gpt-4o-mini) reads each test request and returns the set of categories that are reasonable for the</w:t>
-      </w:r>
-      <w:r>
-        <w:t xml:space="preserve"> </w:t>
-      </w:r>
-      <w:r>
-        <w:t xml:space="preserve">text, blind to the model prediction and to the city's own label. The judge assigns a single label to 67% of</w:t>
-      </w:r>
-      <w:r>
-        <w:t xml:space="preserve"> </w:t>
-      </w:r>
-      <w:r>
-        <w:t xml:space="preserve">requests and two or more to the rest (mean 1.37), which quantifies genuine ambiguity in the taxonomy.</w:t>
-      </w:r>
-    </w:p>
-    <w:p>
-      <w:pPr>
-        <w:pStyle w:val="BodyText"/>
-        <w:jc w:val="both"/>
-      </w:pPr>
-      <w:r>
-        <w:t xml:space="preserve">The judge also disagrees with the city's own label on 14.3% of requests (from 5.6% in San Francisco to 20%</w:t>
-      </w:r>
-      <w:r>
-        <w:t xml:space="preserve"> </w:t>
-      </w:r>
-      <w:r>
-        <w:t xml:space="preserve">in Richmond). This is a measured rate of city labels not entailed by the text, on the same population the gap</w:t>
-      </w:r>
-      <w:r>
-        <w:t xml:space="preserve"> </w:t>
-      </w:r>
-      <w:r>
-        <w:t xml:space="preserve">is computed on. It does not cap predictive accuracy, since a model can still exploit a city's administrative</w:t>
-      </w:r>
-      <w:r>
-        <w:t xml:space="preserve"> </w:t>
-      </w:r>
-      <w:r>
-        <w:t xml:space="preserve">conventions, location cues, or lexical shortcuts; rather, it shows that matching the city label is not a pure</w:t>
-      </w:r>
-      <w:r>
-        <w:t xml:space="preserve"> </w:t>
-      </w:r>
-      <w:r>
-        <w:t xml:space="preserve">measure of semantic classification ability.</w:t>
-      </w:r>
-    </w:p>
     <w:p>
       <w:pPr>
         <w:pStyle w:val="CaptionedFigure"/>
@@ -3058,20 +2987,201 @@
       <w:r>
         <w:drawing>
           <wp:inline>
-            <wp:extent cx="5334000" cy="3097161"/>
+            <wp:extent cx="5334000" cy="4525818"/>
             <wp:effectExtent b="0" l="0" r="0" t="0"/>
-            <wp:docPr descr="Strict vs lenient accuracy by model" title="" id="45" name="Picture"/>
+            <wp:docPr descr="City-to-city transfer matrix" title="" id="43" name="Picture"/>
             <a:graphic>
               <a:graphicData uri="http://schemas.openxmlformats.org/drawingml/2006/picture">
                 <pic:pic>
                   <pic:nvPicPr>
-                    <pic:cNvPr descr="fig_defensibility.png" id="46" name="Picture"/>
+                    <pic:cNvPr descr="fig_transfer_matrix.png" id="44" name="Picture"/>
                     <pic:cNvPicPr>
                       <a:picLocks noChangeArrowheads="1" noChangeAspect="1"/>
                     </pic:cNvPicPr>
                   </pic:nvPicPr>
                   <pic:blipFill>
-                    <a:blip r:embed="rId44"/>
+                    <a:blip r:embed="rId42"/>
+                    <a:stretch>
+                      <a:fillRect/>
+                    </a:stretch>
+                  </pic:blipFill>
+                  <pic:spPr bwMode="auto">
+                    <a:xfrm>
+                      <a:off x="0" y="0"/>
+                      <a:ext cx="5334000" cy="4525818"/>
+                    </a:xfrm>
+                    <a:prstGeom prst="rect">
+                      <a:avLst/>
+                    </a:prstGeom>
+                    <a:noFill/>
+                    <a:ln w="9525">
+                      <a:noFill/>
+                      <a:headEnd/>
+                      <a:tailEnd/>
+                    </a:ln>
+                  </pic:spPr>
+                </pic:pic>
+              </a:graphicData>
+            </a:graphic>
+          </wp:inline>
+        </w:drawing>
+      </w:r>
+    </w:p>
+    <w:p>
+      <w:pPr>
+        <w:pStyle w:val="ImageCaption"/>
+      </w:pPr>
+      <w:r>
+        <w:rPr>
+          <w:b/>
+          <w:bCs/>
+        </w:rPr>
+        <w:t xml:space="preserve">Figure 5.</w:t>
+      </w:r>
+      <w:r>
+        <w:t xml:space="preserve"> </w:t>
+      </w:r>
+      <w:r>
+        <w:t xml:space="preserve">Full 7×7 city-to-city TF-IDF transfer (train on the row city,</w:t>
+      </w:r>
+      <w:r>
+        <w:t xml:space="preserve"> </w:t>
+      </w:r>
+      <w:r>
+        <w:t xml:space="preserve">test on the column city). Single-source cross-city transfer averages 0.247 macro-F1, far below the</w:t>
+      </w:r>
+      <w:r>
+        <w:t xml:space="preserve"> </w:t>
+      </w:r>
+      <w:r>
+        <w:t xml:space="preserve">multi-source leave-one-city-out result, and the SeeClickFix pair transfers asymmetrically.</w:t>
+      </w:r>
+    </w:p>
+    <w:p>
+      <w:pPr>
+        <w:pStyle w:val="BodyText"/>
+        <w:jc w:val="both"/>
+      </w:pPr>
+      <w:r>
+        <w:t xml:space="preserve">The full city-to-city matrix (Figure 5) makes the multi-source benefit concrete: training on a single</w:t>
+      </w:r>
+      <w:r>
+        <w:t xml:space="preserve"> </w:t>
+      </w:r>
+      <w:r>
+        <w:t xml:space="preserve">other city and testing on a target averages 0.247 macro-F1, less than half the leave-one-city-out result</w:t>
+      </w:r>
+      <w:r>
+        <w:t xml:space="preserve"> </w:t>
+      </w:r>
+      <w:r>
+        <w:t xml:space="preserve">(0.523 for TF-IDF), so pooling several source cities is worth far more than any single source. The structure</w:t>
+      </w:r>
+      <w:r>
+        <w:t xml:space="preserve"> </w:t>
+      </w:r>
+      <w:r>
+        <w:t xml:space="preserve">is not explained by shared platform alone; the two SeeClickFix cities transfer asymmetrically (Auburn to</w:t>
+      </w:r>
+      <w:r>
+        <w:t xml:space="preserve"> </w:t>
+      </w:r>
+      <w:r>
+        <w:t xml:space="preserve">Richmond 0.58, Richmond to Auburn 0.34), consistent with the inconclusive same-platform probe above.</w:t>
+      </w:r>
+    </w:p>
+    <w:bookmarkEnd w:id="45"/>
+    <w:bookmarkEnd w:id="46"/>
+    <w:bookmarkStart w:id="53" w:name="what-the-gap-measures"/>
+    <w:p>
+      <w:pPr>
+        <w:pStyle w:val="Heading2"/>
+      </w:pPr>
+      <w:r>
+        <w:t xml:space="preserve">7. What the gap measures</w:t>
+      </w:r>
+    </w:p>
+    <w:p>
+      <w:pPr>
+        <w:pStyle w:val="FirstParagraph"/>
+        <w:jc w:val="both"/>
+      </w:pPr>
+      <w:r>
+        <w:t xml:space="preserve">A large drop is a strong claim, so we ask how much of the gap is genuine model failure. An independent LLM</w:t>
+      </w:r>
+      <w:r>
+        <w:t xml:space="preserve"> </w:t>
+      </w:r>
+      <w:r>
+        <w:t xml:space="preserve">judge (gpt-4o-mini) reads each test request and returns the set of categories that are reasonable for the</w:t>
+      </w:r>
+      <w:r>
+        <w:t xml:space="preserve"> </w:t>
+      </w:r>
+      <w:r>
+        <w:t xml:space="preserve">text, blind to the model prediction and to the city's own label. The judge assigns a single label to 67% of</w:t>
+      </w:r>
+      <w:r>
+        <w:t xml:space="preserve"> </w:t>
+      </w:r>
+      <w:r>
+        <w:t xml:space="preserve">requests and two or more to the rest (mean 1.37), which quantifies genuine ambiguity in the taxonomy.</w:t>
+      </w:r>
+    </w:p>
+    <w:p>
+      <w:pPr>
+        <w:pStyle w:val="BodyText"/>
+        <w:jc w:val="both"/>
+      </w:pPr>
+      <w:r>
+        <w:t xml:space="preserve">The judge also disagrees with the city's own label on 14.3% of requests (from 5.6% in San Francisco to 20%</w:t>
+      </w:r>
+      <w:r>
+        <w:t xml:space="preserve"> </w:t>
+      </w:r>
+      <w:r>
+        <w:t xml:space="preserve">in Richmond). This is a measured rate of city labels not entailed by the text, on the same population the gap</w:t>
+      </w:r>
+      <w:r>
+        <w:t xml:space="preserve"> </w:t>
+      </w:r>
+      <w:r>
+        <w:t xml:space="preserve">is computed on. It does not cap predictive accuracy, since a model can still exploit a city's administrative</w:t>
+      </w:r>
+      <w:r>
+        <w:t xml:space="preserve"> </w:t>
+      </w:r>
+      <w:r>
+        <w:t xml:space="preserve">conventions, location cues, or lexical shortcuts; rather, it shows that matching the city label is not a pure</w:t>
+      </w:r>
+      <w:r>
+        <w:t xml:space="preserve"> </w:t>
+      </w:r>
+      <w:r>
+        <w:t xml:space="preserve">measure of semantic classification ability.</w:t>
+      </w:r>
+    </w:p>
+    <w:p>
+      <w:pPr>
+        <w:pStyle w:val="CaptionedFigure"/>
+      </w:pPr>
+      <w:r>
+        <w:drawing>
+          <wp:inline>
+            <wp:extent cx="5334000" cy="3097161"/>
+            <wp:effectExtent b="0" l="0" r="0" t="0"/>
+            <wp:docPr descr="Strict vs lenient accuracy by model" title="" id="48" name="Picture"/>
+            <a:graphic>
+              <a:graphicData uri="http://schemas.openxmlformats.org/drawingml/2006/picture">
+                <pic:pic>
+                  <pic:nvPicPr>
+                    <pic:cNvPr descr="fig_defensibility.png" id="49" name="Picture"/>
+                    <pic:cNvPicPr>
+                      <a:picLocks noChangeArrowheads="1" noChangeAspect="1"/>
+                    </pic:cNvPicPr>
+                  </pic:nvPicPr>
+                  <pic:blipFill>
+                    <a:blip r:embed="rId47"/>
                     <a:stretch>
                       <a:fillRect/>
                     </a:stretch>
@@ -3224,18 +3334,18 @@
           <wp:inline>
             <wp:extent cx="5334000" cy="4593166"/>
             <wp:effectExtent b="0" l="0" r="0" t="0"/>
-            <wp:docPr descr="Cross-city confusion matrix for DistilBERT" title="" id="48" name="Picture"/>
+            <wp:docPr descr="Cross-city confusion matrix for DistilBERT" title="" id="51" name="Picture"/>
             <a:graphic>
               <a:graphicData uri="http://schemas.openxmlformats.org/drawingml/2006/picture">
                 <pic:pic>
                   <pic:nvPicPr>
-                    <pic:cNvPr descr="fig_confusion.png" id="49" name="Picture"/>
+                    <pic:cNvPr descr="fig_confusion.png" id="52" name="Picture"/>
                     <pic:cNvPicPr>
                       <a:picLocks noChangeArrowheads="1" noChangeAspect="1"/>
                     </pic:cNvPicPr>
                   </pic:nvPicPr>
                   <pic:blipFill>
-                    <a:blip r:embed="rId47"/>
+                    <a:blip r:embed="rId50"/>
                     <a:stretch>
                       <a:fillRect/>
                     </a:stretch>
@@ -3340,8 +3450,8 @@
         <w:t xml:space="preserve">taxonomy revision.</w:t>
       </w:r>
     </w:p>
-    <w:bookmarkEnd w:id="50"/>
-    <w:bookmarkStart w:id="51" w:name="discussion"/>
+    <w:bookmarkEnd w:id="53"/>
+    <w:bookmarkStart w:id="54" w:name="discussion"/>
     <w:p>
       <w:pPr>
         <w:pStyle w:val="Heading2"/>
@@ -3416,8 +3526,8 @@
         <w:t xml:space="preserve">this way.</w:t>
       </w:r>
     </w:p>
-    <w:bookmarkEnd w:id="51"/>
-    <w:bookmarkStart w:id="52" w:name="limitations-and-scope"/>
+    <w:bookmarkEnd w:id="54"/>
+    <w:bookmarkStart w:id="55" w:name="limitations-and-scope"/>
     <w:p>
       <w:pPr>
         <w:pStyle w:val="Heading2"/>
@@ -3519,8 +3629,8 @@
         <w:t xml:space="preserve">text.</w:t>
       </w:r>
     </w:p>
-    <w:bookmarkEnd w:id="52"/>
-    <w:bookmarkStart w:id="53" w:name="ethics-and-data"/>
+    <w:bookmarkEnd w:id="55"/>
+    <w:bookmarkStart w:id="56" w:name="ethics-and-data"/>
     <w:p>
       <w:pPr>
         <w:pStyle w:val="Heading2"/>
@@ -3580,8 +3690,8 @@
         <w:t xml:space="preserve">enforcement targeting.</w:t>
       </w:r>
     </w:p>
-    <w:bookmarkEnd w:id="53"/>
-    <w:bookmarkStart w:id="54" w:name="reproducibility"/>
+    <w:bookmarkEnd w:id="56"/>
+    <w:bookmarkStart w:id="57" w:name="reproducibility"/>
     <w:p>
       <w:pPr>
         <w:pStyle w:val="Heading2"/>
@@ -3703,8 +3813,8 @@
         <w:t xml:space="preserve">mismatch rates, from the released artifacts.</w:t>
       </w:r>
     </w:p>
-    <w:bookmarkEnd w:id="54"/>
-    <w:bookmarkStart w:id="80" w:name="conclusion"/>
+    <w:bookmarkEnd w:id="57"/>
+    <w:bookmarkStart w:id="83" w:name="conclusion"/>
     <w:p>
       <w:pPr>
         <w:pStyle w:val="Heading2"/>
@@ -3762,7 +3872,7 @@
         </w:pict>
       </w:r>
     </w:p>
-    <w:bookmarkStart w:id="79" w:name="references"/>
+    <w:bookmarkStart w:id="82" w:name="references"/>
     <w:p>
       <w:pPr>
         <w:pStyle w:val="Heading3"/>
@@ -3779,7 +3889,7 @@
           <w:numId w:val="1002"/>
         </w:numPr>
       </w:pPr>
-      <w:bookmarkStart w:id="55" w:name="r1"/>
+      <w:bookmarkStart w:id="58" w:name="r1"/>
       <w:r>
         <w:t xml:space="preserve">Hashemi, M. (2022). Automatic Type Detection of 311 Service Requests Based on Customer Provided Descriptions.</w:t>
       </w:r>
@@ -3796,7 +3906,7 @@
       <w:r>
         <w:t xml:space="preserve">, 36(1). doi:10.1080/08839514.2022.2073717.</w:t>
       </w:r>
-      <w:bookmarkEnd w:id="55"/>
+      <w:bookmarkEnd w:id="58"/>
     </w:p>
     <w:p>
       <w:pPr>
@@ -3806,7 +3916,7 @@
           <w:numId w:val="1002"/>
         </w:numPr>
       </w:pPr>
-      <w:bookmarkStart w:id="56" w:name="r2"/>
+      <w:bookmarkStart w:id="59" w:name="r2"/>
       <w:r>
         <w:t xml:space="preserve">Wang, L., Qian, C., Kats, P., Kontokosta, C., &amp; Sobolevsky, S. (2017). Structure of 311 Service Requests as a Signature of Urban Location.</w:t>
       </w:r>
@@ -3823,7 +3933,7 @@
       <w:r>
         <w:t xml:space="preserve">, 12(10):e0186314.</w:t>
       </w:r>
-      <w:bookmarkEnd w:id="56"/>
+      <w:bookmarkEnd w:id="59"/>
     </w:p>
     <w:p>
       <w:pPr>
@@ -3833,11 +3943,11 @@
           <w:numId w:val="1002"/>
         </w:numPr>
       </w:pPr>
-      <w:bookmarkStart w:id="57" w:name="r3"/>
+      <w:bookmarkStart w:id="60" w:name="r3"/>
       <w:r>
         <w:t xml:space="preserve">Sukel, M., Rudinac, S., &amp; Worring, M. (2019). Multimodal Classification of Urban Micro-Events. arXiv:1904.13349.</w:t>
       </w:r>
-      <w:bookmarkEnd w:id="57"/>
+      <w:bookmarkEnd w:id="60"/>
     </w:p>
     <w:p>
       <w:pPr>
@@ -3847,7 +3957,7 @@
           <w:numId w:val="1002"/>
         </w:numPr>
       </w:pPr>
-      <w:bookmarkStart w:id="58" w:name="r4"/>
+      <w:bookmarkStart w:id="61" w:name="r4"/>
       <w:r>
         <w:t xml:space="preserve">Masdeval, C., &amp; Veloso, A. (2015). Mining citizen emotions to estimate the urgency of urban issues.</w:t>
       </w:r>
@@ -3864,7 +3974,7 @@
       <w:r>
         <w:t xml:space="preserve">, 54, 147-155.</w:t>
       </w:r>
-      <w:bookmarkEnd w:id="58"/>
+      <w:bookmarkEnd w:id="61"/>
     </w:p>
     <w:p>
       <w:pPr>
@@ -3874,7 +3984,7 @@
           <w:numId w:val="1002"/>
         </w:numPr>
       </w:pPr>
-      <w:bookmarkStart w:id="59" w:name="r5"/>
+      <w:bookmarkStart w:id="62" w:name="r5"/>
       <w:r>
         <w:t xml:space="preserve">Wang, J., Lan, C., Liu, C., et al. (2023). Generalizing to Unseen Domains: A Survey on Domain Generalization.</w:t>
       </w:r>
@@ -3894,7 +4004,7 @@
       <w:r>
         <w:t xml:space="preserve">(arXiv:2103.03097).</w:t>
       </w:r>
-      <w:bookmarkEnd w:id="59"/>
+      <w:bookmarkEnd w:id="62"/>
     </w:p>
     <w:p>
       <w:pPr>
@@ -3904,11 +4014,11 @@
           <w:numId w:val="1002"/>
         </w:numPr>
       </w:pPr>
-      <w:bookmarkStart w:id="60" w:name="r6"/>
+      <w:bookmarkStart w:id="63" w:name="r6"/>
       <w:r>
         <w:t xml:space="preserve">Yuan, X., et al. (2023). Out-of-Distribution Generalization in Text Classification: Past, Present, and Future. arXiv:2305.14104.</w:t>
       </w:r>
-      <w:bookmarkEnd w:id="60"/>
+      <w:bookmarkEnd w:id="63"/>
     </w:p>
     <w:p>
       <w:pPr>
@@ -3918,7 +4028,7 @@
           <w:numId w:val="1002"/>
         </w:numPr>
       </w:pPr>
-      <w:bookmarkStart w:id="61" w:name="r7"/>
+      <w:bookmarkStart w:id="64" w:name="r7"/>
       <w:r>
         <w:t xml:space="preserve">Northcutt, C. G., Athalye, A., &amp; Mueller, J. (2021). Pervasive Label Errors in Test Sets Destabilize Machine Learning Benchmarks.</w:t>
       </w:r>
@@ -3938,7 +4048,7 @@
       <w:r>
         <w:t xml:space="preserve">(arXiv:2103.14749).</w:t>
       </w:r>
-      <w:bookmarkEnd w:id="61"/>
+      <w:bookmarkEnd w:id="64"/>
     </w:p>
     <w:p>
       <w:pPr>
@@ -3948,7 +4058,7 @@
           <w:numId w:val="1002"/>
         </w:numPr>
       </w:pPr>
-      <w:bookmarkStart w:id="62" w:name="r8"/>
+      <w:bookmarkStart w:id="65" w:name="r8"/>
       <w:r>
         <w:t xml:space="preserve">Gururangan, S., Swayamdipta, S., Levy, O., Schwartz, R., Bowman, S., &amp; Smith, N. A. (2018). Annotation Artifacts in Natural Language Inference Data.</w:t>
       </w:r>
@@ -3968,7 +4078,7 @@
       <w:r>
         <w:t xml:space="preserve">(arXiv:1803.02324).</w:t>
       </w:r>
-      <w:bookmarkEnd w:id="62"/>
+      <w:bookmarkEnd w:id="65"/>
     </w:p>
     <w:p>
       <w:pPr>
@@ -3978,7 +4088,7 @@
           <w:numId w:val="1002"/>
         </w:numPr>
       </w:pPr>
-      <w:bookmarkStart w:id="63" w:name="r9"/>
+      <w:bookmarkStart w:id="66" w:name="r9"/>
       <w:r>
         <w:t xml:space="preserve">Raji, I. D., Bender, E. M., Paullada, A., Denton, E., &amp; Hanna, A. (2021). AI and the Everything in the Whole Wide World Benchmark.</w:t>
       </w:r>
@@ -3998,7 +4108,7 @@
       <w:r>
         <w:t xml:space="preserve">(arXiv:2111.15366).</w:t>
       </w:r>
-      <w:bookmarkEnd w:id="63"/>
+      <w:bookmarkEnd w:id="66"/>
     </w:p>
     <w:p>
       <w:pPr>
@@ -4008,7 +4118,7 @@
           <w:numId w:val="1002"/>
         </w:numPr>
       </w:pPr>
-      <w:bookmarkStart w:id="64" w:name="r10"/>
+      <w:bookmarkStart w:id="67" w:name="r10"/>
       <w:r>
         <w:t xml:space="preserve">Schierholz, M., &amp; Schonlau, M. (2023). Automated occupation coding with hierarchical features.</w:t>
       </w:r>
@@ -4025,7 +4135,7 @@
       <w:r>
         <w:t xml:space="preserve">.</w:t>
       </w:r>
-      <w:bookmarkEnd w:id="64"/>
+      <w:bookmarkEnd w:id="67"/>
     </w:p>
     <w:p>
       <w:pPr>
@@ -4035,7 +4145,7 @@
           <w:numId w:val="1002"/>
         </w:numPr>
       </w:pPr>
-      <w:bookmarkStart w:id="65" w:name="r11"/>
+      <w:bookmarkStart w:id="68" w:name="r11"/>
       <w:r>
         <w:t xml:space="preserve">Yin, W., Hay, J., &amp; Roth, D. (2019). Benchmarking Zero-shot Text Classification: Datasets, Evaluation and Entailment Approach.</w:t>
       </w:r>
@@ -4055,7 +4165,7 @@
       <w:r>
         <w:t xml:space="preserve">(arXiv:1909.00161).</w:t>
       </w:r>
-      <w:bookmarkEnd w:id="65"/>
+      <w:bookmarkEnd w:id="68"/>
     </w:p>
     <w:p>
       <w:pPr>
@@ -4065,11 +4175,11 @@
           <w:numId w:val="1002"/>
         </w:numPr>
       </w:pPr>
-      <w:bookmarkStart w:id="66" w:name="r12"/>
+      <w:bookmarkStart w:id="69" w:name="r12"/>
       <w:r>
         <w:t xml:space="preserve">Bucher, M. J. J., &amp; Martini, M. (2024). Fine-Tuned "Small" LLMs (Still) Significantly Outperform Zero-Shot Generative AI Models in Text Classification. arXiv:2406.08660.</w:t>
       </w:r>
-      <w:bookmarkEnd w:id="66"/>
+      <w:bookmarkEnd w:id="69"/>
     </w:p>
     <w:p>
       <w:pPr>
@@ -4079,11 +4189,11 @@
           <w:numId w:val="1002"/>
         </w:numPr>
       </w:pPr>
-      <w:bookmarkStart w:id="67" w:name="r13"/>
+      <w:bookmarkStart w:id="70" w:name="r13"/>
       <w:r>
         <w:t xml:space="preserve">Kontokosta, C. E., &amp; Hong, B. (2017). Equity in 311 Reporting: Socio-Spatial Differentials in the Propensity to Complain. arXiv:1710.02452.</w:t>
       </w:r>
-      <w:bookmarkEnd w:id="67"/>
+      <w:bookmarkEnd w:id="70"/>
     </w:p>
     <w:p>
       <w:pPr>
@@ -4093,7 +4203,7 @@
           <w:numId w:val="1002"/>
         </w:numPr>
       </w:pPr>
-      <w:bookmarkStart w:id="68" w:name="r14"/>
+      <w:bookmarkStart w:id="71" w:name="r14"/>
       <w:r>
         <w:t xml:space="preserve">Ramponi, A., &amp; Plank, B. (2020). Neural Unsupervised Domain Adaptation in NLP—A Survey.</w:t>
       </w:r>
@@ -4110,7 +4220,7 @@
       <w:r>
         <w:t xml:space="preserve">. aclanthology.org/2020.coling-main.603.</w:t>
       </w:r>
-      <w:bookmarkEnd w:id="68"/>
+      <w:bookmarkEnd w:id="71"/>
     </w:p>
     <w:p>
       <w:pPr>
@@ -4120,7 +4230,7 @@
           <w:numId w:val="1002"/>
         </w:numPr>
       </w:pPr>
-      <w:bookmarkStart w:id="69" w:name="r15"/>
+      <w:bookmarkStart w:id="72" w:name="r15"/>
       <w:r>
         <w:t xml:space="preserve">Plank, B. (2022). The "Problem" of Human Label Variation: On Ground Truth in Data, Modeling and Evaluation.</w:t>
       </w:r>
@@ -4137,7 +4247,7 @@
       <w:r>
         <w:t xml:space="preserve">. arXiv:2211.02570.</w:t>
       </w:r>
-      <w:bookmarkEnd w:id="69"/>
+      <w:bookmarkEnd w:id="72"/>
     </w:p>
     <w:p>
       <w:pPr>
@@ -4147,7 +4257,7 @@
           <w:numId w:val="1002"/>
         </w:numPr>
       </w:pPr>
-      <w:bookmarkStart w:id="70" w:name="r16"/>
+      <w:bookmarkStart w:id="73" w:name="r16"/>
       <w:r>
         <w:t xml:space="preserve">Uma, A., Fornaciari, T., Hovy, D., Paun, S., Plank, B., &amp; Poesio, M. (2021). Learning from Disagreement: A Survey.</w:t>
       </w:r>
@@ -4164,7 +4274,7 @@
       <w:r>
         <w:t xml:space="preserve">, 72, 1385-1470.</w:t>
       </w:r>
-      <w:bookmarkEnd w:id="70"/>
+      <w:bookmarkEnd w:id="73"/>
     </w:p>
     <w:p>
       <w:pPr>
@@ -4174,7 +4284,7 @@
           <w:numId w:val="1002"/>
         </w:numPr>
       </w:pPr>
-      <w:bookmarkStart w:id="71" w:name="r17"/>
+      <w:bookmarkStart w:id="74" w:name="r17"/>
       <w:r>
         <w:t xml:space="preserve">Leonardelli, E., et al. (2023). SemEval-2023 Task 11: Learning with Disagreements (LeWiDi).</w:t>
       </w:r>
@@ -4191,7 +4301,7 @@
       <w:r>
         <w:t xml:space="preserve">. arXiv:2304.14803.</w:t>
       </w:r>
-      <w:bookmarkEnd w:id="71"/>
+      <w:bookmarkEnd w:id="74"/>
     </w:p>
     <w:p>
       <w:pPr>
@@ -4201,7 +4311,7 @@
           <w:numId w:val="1002"/>
         </w:numPr>
       </w:pPr>
-      <w:bookmarkStart w:id="72" w:name="r18"/>
+      <w:bookmarkStart w:id="75" w:name="r18"/>
       <w:r>
         <w:t xml:space="preserve">Nalchigar, S., &amp; Fox, M. S. (2017). Achieving Interoperability of Smart City Data: An Analysis of 311 Data.</w:t>
       </w:r>
@@ -4218,7 +4328,7 @@
       <w:r>
         <w:t xml:space="preserve">, 3(1).</w:t>
       </w:r>
-      <w:bookmarkEnd w:id="72"/>
+      <w:bookmarkEnd w:id="75"/>
     </w:p>
     <w:p>
       <w:pPr>
@@ -4228,7 +4338,7 @@
           <w:numId w:val="1002"/>
         </w:numPr>
       </w:pPr>
-      <w:bookmarkStart w:id="73" w:name="r19"/>
+      <w:bookmarkStart w:id="76" w:name="r19"/>
       <w:r>
         <w:t xml:space="preserve">Mullenbach, J., Wiegreffe, S., Duke, J., Sun, J., &amp; Eisenstein, J. (2018). Explainable Prediction of Medical Codes from Clinical Text.</w:t>
       </w:r>
@@ -4245,7 +4355,7 @@
       <w:r>
         <w:t xml:space="preserve">. arXiv:1802.05695.</w:t>
       </w:r>
-      <w:bookmarkEnd w:id="73"/>
+      <w:bookmarkEnd w:id="76"/>
     </w:p>
     <w:p>
       <w:pPr>
@@ -4255,7 +4365,7 @@
           <w:numId w:val="1002"/>
         </w:numPr>
       </w:pPr>
-      <w:bookmarkStart w:id="74" w:name="r20"/>
+      <w:bookmarkStart w:id="77" w:name="r20"/>
       <w:r>
         <w:t xml:space="preserve">Gweon, H., Schonlau, M., Kaczmirek, L., Blohm, M., &amp; Steiner, S. (2017). Three Methods for Occupation Coding Based on Statistical Learning.</w:t>
       </w:r>
@@ -4272,7 +4382,7 @@
       <w:r>
         <w:t xml:space="preserve">, 33(1), 101-122.</w:t>
       </w:r>
-      <w:bookmarkEnd w:id="74"/>
+      <w:bookmarkEnd w:id="77"/>
     </w:p>
     <w:p>
       <w:pPr>
@@ -4282,7 +4392,7 @@
           <w:numId w:val="1002"/>
         </w:numPr>
       </w:pPr>
-      <w:bookmarkStart w:id="75" w:name="r21"/>
+      <w:bookmarkStart w:id="78" w:name="r21"/>
       <w:r>
         <w:t xml:space="preserve">Gulrajani, I., &amp; Lopez-Paz, D. (2021). In Search of Lost Domain Generalization.</w:t>
       </w:r>
@@ -4299,7 +4409,7 @@
       <w:r>
         <w:t xml:space="preserve">. arXiv:2007.01434.</w:t>
       </w:r>
-      <w:bookmarkEnd w:id="75"/>
+      <w:bookmarkEnd w:id="78"/>
     </w:p>
     <w:p>
       <w:pPr>
@@ -4309,7 +4419,7 @@
           <w:numId w:val="1002"/>
         </w:numPr>
       </w:pPr>
-      <w:bookmarkStart w:id="76" w:name="r22"/>
+      <w:bookmarkStart w:id="79" w:name="r22"/>
       <w:r>
         <w:t xml:space="preserve">Mueller, A., Krone, J., Romeo, S., Mansour, S., Mansimov, E., Zhang, Y., &amp; Roth, D. (2022). Label Semantic Aware Pre-training for Few-shot Text Classification.</w:t>
       </w:r>
@@ -4326,7 +4436,7 @@
       <w:r>
         <w:t xml:space="preserve">. arXiv:2204.07128.</w:t>
       </w:r>
-      <w:bookmarkEnd w:id="76"/>
+      <w:bookmarkEnd w:id="79"/>
     </w:p>
     <w:p>
       <w:pPr>
@@ -4336,7 +4446,7 @@
           <w:numId w:val="1002"/>
         </w:numPr>
       </w:pPr>
-      <w:bookmarkStart w:id="77" w:name="r23"/>
+      <w:bookmarkStart w:id="80" w:name="r23"/>
       <w:r>
         <w:t xml:space="preserve">Aroyo, L., &amp; Welty, C. (2015). Truth Is a Lie: Crowd Truth and the Seven Myths of Human Annotation.</w:t>
       </w:r>
@@ -4353,7 +4463,7 @@
       <w:r>
         <w:t xml:space="preserve">, 36(1), 15-24.</w:t>
       </w:r>
-      <w:bookmarkEnd w:id="77"/>
+      <w:bookmarkEnd w:id="80"/>
     </w:p>
     <w:p>
       <w:pPr>
@@ -4363,7 +4473,7 @@
           <w:numId w:val="1002"/>
         </w:numPr>
       </w:pPr>
-      <w:bookmarkStart w:id="78" w:name="r24"/>
+      <w:bookmarkStart w:id="81" w:name="r24"/>
       <w:r>
         <w:t xml:space="preserve">White, A., &amp; Trump, K. S. (2018). The Promises and Pitfalls of 311 Data.</w:t>
       </w:r>
@@ -4380,7 +4490,7 @@
       <w:r>
         <w:t xml:space="preserve">, 54(4), 794-823.</w:t>
       </w:r>
-      <w:bookmarkEnd w:id="78"/>
+      <w:bookmarkEnd w:id="81"/>
     </w:p>
     <w:p>
       <w:pPr>
@@ -4418,9 +4528,9 @@
         <w:t xml:space="preserve">Crossref, OpenAlex, and arXiv.</w:t>
       </w:r>
     </w:p>
-    <w:bookmarkEnd w:id="79"/>
-    <w:bookmarkEnd w:id="80"/>
-    <w:bookmarkEnd w:id="81"/>
+    <w:bookmarkEnd w:id="82"/>
+    <w:bookmarkEnd w:id="83"/>
+    <w:bookmarkEnd w:id="84"/>
     <w:sectPr/>
   </w:body>
 </w:document>

</xml_diff>

<commit_message>
Add corpus-flow (Fig 6) and taxonomy-boundary (Fig 7) diagrams
Co-Authored-By: Claude Opus 4.8 <noreply@anthropic.com>
</commit_message>
<xml_diff>
--- a/docs/paper.docx
+++ b/docs/paper.docx
@@ -58,7 +58,7 @@
         <w:t xml:space="preserve">Classification</w:t>
       </w:r>
     </w:p>
-    <w:bookmarkStart w:id="84" w:name="X90e4dd8225390731b72929ba27f3cf8718ade98"/>
+    <w:bookmarkStart w:id="90" w:name="X90e4dd8225390731b72929ba27f3cf8718ade98"/>
     <w:p>
       <w:pPr>
         <w:pStyle w:val="Heading1"/>
@@ -1151,7 +1151,7 @@
     </w:p>
     <w:bookmarkEnd w:id="28"/>
     <w:bookmarkEnd w:id="29"/>
-    <w:bookmarkStart w:id="33" w:name="corpus-construction"/>
+    <w:bookmarkStart w:id="36" w:name="corpus-construction"/>
     <w:p>
       <w:pPr>
         <w:pStyle w:val="Heading2"/>
@@ -1160,7 +1160,84 @@
         <w:t xml:space="preserve">3. Corpus construction</w:t>
       </w:r>
     </w:p>
-    <w:bookmarkStart w:id="30" w:name="the-free-text-availability-problem"/>
+    <w:p>
+      <w:pPr>
+        <w:pStyle w:val="CaptionedFigure"/>
+      </w:pPr>
+      <w:r>
+        <w:drawing>
+          <wp:inline>
+            <wp:extent cx="5334000" cy="1359106"/>
+            <wp:effectExtent b="0" l="0" r="0" t="0"/>
+            <wp:docPr descr="Corpus construction pipeline" title="" id="31" name="Picture"/>
+            <a:graphic>
+              <a:graphicData uri="http://schemas.openxmlformats.org/drawingml/2006/picture">
+                <pic:pic>
+                  <pic:nvPicPr>
+                    <pic:cNvPr descr="fig_corpus_flow.png" id="32" name="Picture"/>
+                    <pic:cNvPicPr>
+                      <a:picLocks noChangeArrowheads="1" noChangeAspect="1"/>
+                    </pic:cNvPicPr>
+                  </pic:nvPicPr>
+                  <pic:blipFill>
+                    <a:blip r:embed="rId30"/>
+                    <a:stretch>
+                      <a:fillRect/>
+                    </a:stretch>
+                  </pic:blipFill>
+                  <pic:spPr bwMode="auto">
+                    <a:xfrm>
+                      <a:off x="0" y="0"/>
+                      <a:ext cx="5334000" cy="1359106"/>
+                    </a:xfrm>
+                    <a:prstGeom prst="rect">
+                      <a:avLst/>
+                    </a:prstGeom>
+                    <a:noFill/>
+                    <a:ln w="9525">
+                      <a:noFill/>
+                      <a:headEnd/>
+                      <a:tailEnd/>
+                    </a:ln>
+                  </pic:spPr>
+                </pic:pic>
+              </a:graphicData>
+            </a:graphic>
+          </wp:inline>
+        </w:drawing>
+      </w:r>
+    </w:p>
+    <w:p>
+      <w:pPr>
+        <w:pStyle w:val="ImageCaption"/>
+      </w:pPr>
+      <w:r>
+        <w:rPr>
+          <w:b/>
+          <w:bCs/>
+        </w:rPr>
+        <w:t xml:space="preserve">Figure 6.</w:t>
+      </w:r>
+      <w:r>
+        <w:t xml:space="preserve"> </w:t>
+      </w:r>
+      <w:r>
+        <w:t xml:space="preserve">Corpus construction: from probed municipal portals to the frozen</w:t>
+      </w:r>
+      <w:r>
+        <w:t xml:space="preserve"> </w:t>
+      </w:r>
+      <w:r>
+        <w:t xml:space="preserve">MC311 benchmark, through free-text confirmation, harmonization, administrative-category removal, an</w:t>
+      </w:r>
+      <w:r>
+        <w:t xml:space="preserve"> </w:t>
+      </w:r>
+      <w:r>
+        <w:t xml:space="preserve">informativeness filter, and PII scrubbing.</w:t>
+      </w:r>
+    </w:p>
+    <w:bookmarkStart w:id="33" w:name="the-free-text-availability-problem"/>
     <w:p>
       <w:pPr>
         <w:pStyle w:val="Heading3"/>
@@ -1250,8 +1327,8 @@
         <w:t xml:space="preserve">confirmed by inspection.</w:t>
       </w:r>
     </w:p>
-    <w:bookmarkEnd w:id="30"/>
-    <w:bookmarkStart w:id="31" w:name="cities"/>
+    <w:bookmarkEnd w:id="33"/>
+    <w:bookmarkStart w:id="34" w:name="cities"/>
     <w:p>
       <w:pPr>
         <w:pStyle w:val="Heading3"/>
@@ -1724,8 +1801,8 @@
         <w:t xml:space="preserve">confounded with jurisdiction and that we return to in Section 9.</w:t>
       </w:r>
     </w:p>
-    <w:bookmarkEnd w:id="31"/>
-    <w:bookmarkStart w:id="32" w:name="text-hygiene-and-informativeness"/>
+    <w:bookmarkEnd w:id="34"/>
+    <w:bookmarkStart w:id="35" w:name="text-hygiene-and-informativeness"/>
     <w:p>
       <w:pPr>
         <w:pStyle w:val="Heading3"/>
@@ -1839,9 +1916,9 @@
         <w:t xml:space="preserve">occasional phone numbers, which we address in Section 10.</w:t>
       </w:r>
     </w:p>
-    <w:bookmarkEnd w:id="32"/>
-    <w:bookmarkEnd w:id="33"/>
-    <w:bookmarkStart w:id="34" w:name="taxonomy-harmonization"/>
+    <w:bookmarkEnd w:id="35"/>
+    <w:bookmarkEnd w:id="36"/>
+    <w:bookmarkStart w:id="40" w:name="taxonomy-harmonization"/>
     <w:p>
       <w:pPr>
         <w:pStyle w:val="Heading2"/>
@@ -1910,258 +1987,19 @@
         <w:t xml:space="preserve"> </w:t>
       </w:r>
       <w:r>
-        <w:t xml:space="preserve">disagreement.</w:t>
-      </w:r>
-    </w:p>
-    <w:bookmarkEnd w:id="34"/>
-    <w:bookmarkStart w:id="35" w:name="experimental-setup"/>
-    <w:p>
-      <w:pPr>
-        <w:pStyle w:val="Heading2"/>
-      </w:pPr>
-      <w:r>
-        <w:t xml:space="preserve">5. Experimental setup</w:t>
-      </w:r>
-    </w:p>
-    <w:p>
-      <w:pPr>
-        <w:pStyle w:val="FirstParagraph"/>
-        <w:jc w:val="both"/>
-      </w:pPr>
-      <w:r>
-        <w:rPr>
-          <w:b/>
-          <w:bCs/>
-        </w:rPr>
-        <w:t xml:space="preserve">Task.</w:t>
-      </w:r>
-      <w:r>
-        <w:t xml:space="preserve"> </w:t>
-      </w:r>
-      <w:r>
-        <w:t xml:space="preserve">Given the citizen free text, predict one of the 14 harmonized content classes.</w:t>
-      </w:r>
-    </w:p>
-    <w:p>
-      <w:pPr>
-        <w:pStyle w:val="BodyText"/>
-        <w:jc w:val="both"/>
-      </w:pPr>
-      <w:r>
-        <w:rPr>
-          <w:b/>
-          <w:bCs/>
-        </w:rPr>
-        <w:t xml:space="preserve">Frozen split.</w:t>
-      </w:r>
-      <w:r>
-        <w:t xml:space="preserve"> </w:t>
-      </w:r>
-      <w:r>
-        <w:t xml:space="preserve">For each city we hold out a fixed, seeded, stratified test set of up to 500</w:t>
-      </w:r>
-      <w:r>
-        <w:t xml:space="preserve"> </w:t>
-      </w:r>
-      <w:r>
-        <w:t xml:space="preserve">requests (3,502 total). Every model predicts on exactly these rows, so in-city and cross-city results, and</w:t>
-      </w:r>
-      <w:r>
-        <w:t xml:space="preserve"> </w:t>
-      </w:r>
-      <w:r>
-        <w:t xml:space="preserve">all three arms, are one comparison rather than three. Training pools are capped at 8,000 to 12,000 requests</w:t>
-      </w:r>
-      <w:r>
-        <w:t xml:space="preserve"> </w:t>
-      </w:r>
-      <w:r>
-        <w:t xml:space="preserve">per city.</w:t>
-      </w:r>
-    </w:p>
-    <w:p>
-      <w:pPr>
-        <w:pStyle w:val="BodyText"/>
-        <w:jc w:val="both"/>
-      </w:pPr>
-      <w:r>
-        <w:rPr>
-          <w:b/>
-          <w:bCs/>
-        </w:rPr>
-        <w:t xml:space="preserve">Protocols.</w:t>
-      </w:r>
-      <w:r>
-        <w:t xml:space="preserve"> </w:t>
-      </w:r>
-      <w:r>
-        <w:rPr>
-          <w:i/>
-          <w:iCs/>
-        </w:rPr>
-        <w:t xml:space="preserve">In-city</w:t>
-      </w:r>
-      <w:r>
-        <w:t xml:space="preserve"> </w:t>
-      </w:r>
-      <w:r>
-        <w:t xml:space="preserve">trains on the held-out city's remaining data.</w:t>
-      </w:r>
-      <w:r>
-        <w:t xml:space="preserve"> </w:t>
-      </w:r>
-      <w:r>
-        <w:rPr>
-          <w:i/>
-          <w:iCs/>
-        </w:rPr>
-        <w:t xml:space="preserve">Leave-one-city-out</w:t>
-      </w:r>
-      <w:r>
-        <w:rPr>
-          <w:i/>
-          <w:iCs/>
-        </w:rPr>
-        <w:t xml:space="preserve"> </w:t>
-      </w:r>
-      <w:r>
-        <w:rPr>
-          <w:i/>
-          <w:iCs/>
-        </w:rPr>
-        <w:t xml:space="preserve">(LOCO)</w:t>
-      </w:r>
-      <w:r>
-        <w:t xml:space="preserve"> </w:t>
-      </w:r>
-      <w:r>
-        <w:t xml:space="preserve">trains on all other cities. Both are evaluated on the same frozen test rows.</w:t>
-      </w:r>
-    </w:p>
-    <w:p>
-      <w:pPr>
-        <w:pStyle w:val="BodyText"/>
-        <w:jc w:val="both"/>
-      </w:pPr>
-      <w:r>
-        <w:rPr>
-          <w:b/>
-          <w:bCs/>
-        </w:rPr>
-        <w:t xml:space="preserve">Metric.</w:t>
-      </w:r>
-      <w:r>
-        <w:t xml:space="preserve"> </w:t>
-      </w:r>
-      <w:r>
-        <w:t xml:space="preserve">Macro-F1 over the classes present in the pooled test set, with 95% confidence</w:t>
-      </w:r>
-      <w:r>
-        <w:t xml:space="preserve"> </w:t>
-      </w:r>
-      <w:r>
-        <w:t xml:space="preserve">intervals from 1,000 bootstrap resamples of the test examples. Pooled macro-F1 concatenates all cities' test</w:t>
-      </w:r>
-      <w:r>
-        <w:t xml:space="preserve"> </w:t>
-      </w:r>
-      <w:r>
-        <w:t xml:space="preserve">rows and computes macro-F1 once over the union of classes; the unweighted mean averages per-city macro-F1,</w:t>
-      </w:r>
-      <w:r>
-        <w:t xml:space="preserve"> </w:t>
-      </w:r>
-      <w:r>
-        <w:t xml:space="preserve">weighting each city equally. Because per-city class sets differ, we report the pooled metric as primary and</w:t>
-      </w:r>
-      <w:r>
-        <w:t xml:space="preserve"> </w:t>
-      </w:r>
-      <w:r>
-        <w:t xml:space="preserve">the unweighted mean as secondary, each also with San Francisco excluded (Section 9). Model differences use a</w:t>
-      </w:r>
-      <w:r>
-        <w:t xml:space="preserve"> </w:t>
-      </w:r>
-      <w:r>
-        <w:t xml:space="preserve">paired bootstrap (1,000 resamples over the shared test rows).</w:t>
-      </w:r>
-    </w:p>
-    <w:p>
-      <w:pPr>
-        <w:pStyle w:val="BodyText"/>
-        <w:jc w:val="both"/>
-      </w:pPr>
-      <w:r>
-        <w:rPr>
-          <w:b/>
-          <w:bCs/>
-        </w:rPr>
-        <w:t xml:space="preserve">Models.</w:t>
-      </w:r>
-      <w:r>
-        <w:t xml:space="preserve"> </w:t>
-      </w:r>
-      <w:r>
-        <w:t xml:space="preserve">(i) TF-IDF over word 1-2-grams and character 3-5-grams with a logistic-regression</w:t>
-      </w:r>
-      <w:r>
-        <w:t xml:space="preserve"> </w:t>
-      </w:r>
-      <w:r>
-        <w:t xml:space="preserve">head. (ii) DistilBERT fine-tuned for three epochs. (iii) gpt-4o-mini (temperature 0) prompted zero-shot with the 14-class</w:t>
-      </w:r>
-      <w:r>
-        <w:t xml:space="preserve"> </w:t>
-      </w:r>
-      <w:r>
-        <w:t xml:space="preserve">taxonomy and short glosses, seeing no city-specific training data, which makes it an inherently</w:t>
-      </w:r>
-      <w:r>
-        <w:t xml:space="preserve"> </w:t>
-      </w:r>
-      <w:r>
-        <w:t xml:space="preserve">cross-jurisdiction condition. As LLM ablations we also report gpt-4o (a stronger model) and a few-shot variant</w:t>
-      </w:r>
-      <w:r>
-        <w:t xml:space="preserve"> </w:t>
-      </w:r>
-      <w:r>
-        <w:t xml:space="preserve">that adds one labeled exemplar per class drawn from the training cities. LLM inference runs through the</w:t>
-      </w:r>
-      <w:r>
-        <w:t xml:space="preserve"> </w:t>
-      </w:r>
-      <w:r>
-        <w:t xml:space="preserve">provider batch APIs at half the standard token price. As additional baselines we report (iv) a fine-tuned</w:t>
-      </w:r>
-      <w:r>
-        <w:t xml:space="preserve"> </w:t>
-      </w:r>
-      <w:r>
-        <w:t xml:space="preserve">RoBERTa-base encoder, and two zero-shot label-semantic methods that use the class descriptions but no training:</w:t>
-      </w:r>
-      <w:r>
-        <w:t xml:space="preserve"> </w:t>
-      </w:r>
-      <w:r>
-        <w:t xml:space="preserve">a sentence-transformer that assigns the nearest class-description embedding, and an NLI entailment classifier.</w:t>
-      </w:r>
-      <w:r>
-        <w:t xml:space="preserve"> </w:t>
-      </w:r>
-      <w:r>
-        <w:t xml:space="preserve">Hyperparameters and the verbatim prompt are released with the code.</w:t>
-      </w:r>
-    </w:p>
-    <w:bookmarkEnd w:id="35"/>
-    <w:bookmarkStart w:id="46" w:name="results"/>
-    <w:p>
-      <w:pPr>
-        <w:pStyle w:val="Heading2"/>
-      </w:pPr>
-      <w:r>
-        <w:t xml:space="preserve">6. Results</w:t>
+        <w:t xml:space="preserve">disagreement. Figure 7 shows these boundaries empirically: the heaviest cross-city confusion concentrates on a</w:t>
+      </w:r>
+      <w:r>
+        <w:t xml:space="preserve"> </w:t>
+      </w:r>
+      <w:r>
+        <w:t xml:space="preserve">few neighboring pairs, with Waste and Sanitation acting as a hub (its overlap with Parking, Homelessness,</w:t>
+      </w:r>
+      <w:r>
+        <w:t xml:space="preserve"> </w:t>
+      </w:r>
+      <w:r>
+        <w:t xml:space="preserve">Trees, and Property reflects debris, encampment cleanups, yard waste, and property nuisance all bordering it).</w:t>
       </w:r>
     </w:p>
     <w:p>
@@ -2171,20 +2009,348 @@
       <w:r>
         <w:drawing>
           <wp:inline>
-            <wp:extent cx="5334000" cy="3269225"/>
+            <wp:extent cx="5334000" cy="5169030"/>
             <wp:effectExtent b="0" l="0" r="0" t="0"/>
-            <wp:docPr descr="In-city vs cross-city macro-F1 by model" title="" id="37" name="Picture"/>
+            <wp:docPr descr="Taxonomy boundary confusion graph" title="" id="38" name="Picture"/>
             <a:graphic>
               <a:graphicData uri="http://schemas.openxmlformats.org/drawingml/2006/picture">
                 <pic:pic>
                   <pic:nvPicPr>
-                    <pic:cNvPr descr="fig_transfer.png" id="38" name="Picture"/>
+                    <pic:cNvPr descr="fig_taxonomy_boundary.png" id="39" name="Picture"/>
                     <pic:cNvPicPr>
                       <a:picLocks noChangeArrowheads="1" noChangeAspect="1"/>
                     </pic:cNvPicPr>
                   </pic:nvPicPr>
                   <pic:blipFill>
-                    <a:blip r:embed="rId36"/>
+                    <a:blip r:embed="rId37"/>
+                    <a:stretch>
+                      <a:fillRect/>
+                    </a:stretch>
+                  </pic:blipFill>
+                  <pic:spPr bwMode="auto">
+                    <a:xfrm>
+                      <a:off x="0" y="0"/>
+                      <a:ext cx="5334000" cy="5169030"/>
+                    </a:xfrm>
+                    <a:prstGeom prst="rect">
+                      <a:avLst/>
+                    </a:prstGeom>
+                    <a:noFill/>
+                    <a:ln w="9525">
+                      <a:noFill/>
+                      <a:headEnd/>
+                      <a:tailEnd/>
+                    </a:ln>
+                  </pic:spPr>
+                </pic:pic>
+              </a:graphicData>
+            </a:graphic>
+          </wp:inline>
+        </w:drawing>
+      </w:r>
+    </w:p>
+    <w:p>
+      <w:pPr>
+        <w:pStyle w:val="ImageCaption"/>
+      </w:pPr>
+      <w:r>
+        <w:rPr>
+          <w:b/>
+          <w:bCs/>
+        </w:rPr>
+        <w:t xml:space="preserve">Figure 7.</w:t>
+      </w:r>
+      <w:r>
+        <w:t xml:space="preserve"> </w:t>
+      </w:r>
+      <w:r>
+        <w:t xml:space="preserve">The 14 classes with the top cross-city confusion pairs as edges</w:t>
+      </w:r>
+      <w:r>
+        <w:t xml:space="preserve"> </w:t>
+      </w:r>
+      <w:r>
+        <w:t xml:space="preserve">(edge width proportional to DistilBERT misclassification count). Confusion concentrates on semantically</w:t>
+      </w:r>
+      <w:r>
+        <w:t xml:space="preserve"> </w:t>
+      </w:r>
+      <w:r>
+        <w:t xml:space="preserve">adjacent boundaries rather than spreading uniformly.</w:t>
+      </w:r>
+    </w:p>
+    <w:bookmarkEnd w:id="40"/>
+    <w:bookmarkStart w:id="41" w:name="experimental-setup"/>
+    <w:p>
+      <w:pPr>
+        <w:pStyle w:val="Heading2"/>
+      </w:pPr>
+      <w:r>
+        <w:t xml:space="preserve">5. Experimental setup</w:t>
+      </w:r>
+    </w:p>
+    <w:p>
+      <w:pPr>
+        <w:pStyle w:val="FirstParagraph"/>
+        <w:jc w:val="both"/>
+      </w:pPr>
+      <w:r>
+        <w:rPr>
+          <w:b/>
+          <w:bCs/>
+        </w:rPr>
+        <w:t xml:space="preserve">Task.</w:t>
+      </w:r>
+      <w:r>
+        <w:t xml:space="preserve"> </w:t>
+      </w:r>
+      <w:r>
+        <w:t xml:space="preserve">Given the citizen free text, predict one of the 14 harmonized content classes.</w:t>
+      </w:r>
+    </w:p>
+    <w:p>
+      <w:pPr>
+        <w:pStyle w:val="BodyText"/>
+        <w:jc w:val="both"/>
+      </w:pPr>
+      <w:r>
+        <w:rPr>
+          <w:b/>
+          <w:bCs/>
+        </w:rPr>
+        <w:t xml:space="preserve">Frozen split.</w:t>
+      </w:r>
+      <w:r>
+        <w:t xml:space="preserve"> </w:t>
+      </w:r>
+      <w:r>
+        <w:t xml:space="preserve">For each city we hold out a fixed, seeded, stratified test set of up to 500</w:t>
+      </w:r>
+      <w:r>
+        <w:t xml:space="preserve"> </w:t>
+      </w:r>
+      <w:r>
+        <w:t xml:space="preserve">requests (3,502 total). Every model predicts on exactly these rows, so in-city and cross-city results, and</w:t>
+      </w:r>
+      <w:r>
+        <w:t xml:space="preserve"> </w:t>
+      </w:r>
+      <w:r>
+        <w:t xml:space="preserve">all three arms, are one comparison rather than three. Training pools are capped at 8,000 to 12,000 requests</w:t>
+      </w:r>
+      <w:r>
+        <w:t xml:space="preserve"> </w:t>
+      </w:r>
+      <w:r>
+        <w:t xml:space="preserve">per city.</w:t>
+      </w:r>
+    </w:p>
+    <w:p>
+      <w:pPr>
+        <w:pStyle w:val="BodyText"/>
+        <w:jc w:val="both"/>
+      </w:pPr>
+      <w:r>
+        <w:rPr>
+          <w:b/>
+          <w:bCs/>
+        </w:rPr>
+        <w:t xml:space="preserve">Protocols.</w:t>
+      </w:r>
+      <w:r>
+        <w:t xml:space="preserve"> </w:t>
+      </w:r>
+      <w:r>
+        <w:rPr>
+          <w:i/>
+          <w:iCs/>
+        </w:rPr>
+        <w:t xml:space="preserve">In-city</w:t>
+      </w:r>
+      <w:r>
+        <w:t xml:space="preserve"> </w:t>
+      </w:r>
+      <w:r>
+        <w:t xml:space="preserve">trains on the held-out city's remaining data.</w:t>
+      </w:r>
+      <w:r>
+        <w:t xml:space="preserve"> </w:t>
+      </w:r>
+      <w:r>
+        <w:rPr>
+          <w:i/>
+          <w:iCs/>
+        </w:rPr>
+        <w:t xml:space="preserve">Leave-one-city-out</w:t>
+      </w:r>
+      <w:r>
+        <w:rPr>
+          <w:i/>
+          <w:iCs/>
+        </w:rPr>
+        <w:t xml:space="preserve"> </w:t>
+      </w:r>
+      <w:r>
+        <w:rPr>
+          <w:i/>
+          <w:iCs/>
+        </w:rPr>
+        <w:t xml:space="preserve">(LOCO)</w:t>
+      </w:r>
+      <w:r>
+        <w:t xml:space="preserve"> </w:t>
+      </w:r>
+      <w:r>
+        <w:t xml:space="preserve">trains on all other cities. Both are evaluated on the same frozen test rows.</w:t>
+      </w:r>
+    </w:p>
+    <w:p>
+      <w:pPr>
+        <w:pStyle w:val="BodyText"/>
+        <w:jc w:val="both"/>
+      </w:pPr>
+      <w:r>
+        <w:rPr>
+          <w:b/>
+          <w:bCs/>
+        </w:rPr>
+        <w:t xml:space="preserve">Metric.</w:t>
+      </w:r>
+      <w:r>
+        <w:t xml:space="preserve"> </w:t>
+      </w:r>
+      <w:r>
+        <w:t xml:space="preserve">Macro-F1 over the classes present in the pooled test set, with 95% confidence</w:t>
+      </w:r>
+      <w:r>
+        <w:t xml:space="preserve"> </w:t>
+      </w:r>
+      <w:r>
+        <w:t xml:space="preserve">intervals from 1,000 bootstrap resamples of the test examples. Pooled macro-F1 concatenates all cities' test</w:t>
+      </w:r>
+      <w:r>
+        <w:t xml:space="preserve"> </w:t>
+      </w:r>
+      <w:r>
+        <w:t xml:space="preserve">rows and computes macro-F1 once over the union of classes; the unweighted mean averages per-city macro-F1,</w:t>
+      </w:r>
+      <w:r>
+        <w:t xml:space="preserve"> </w:t>
+      </w:r>
+      <w:r>
+        <w:t xml:space="preserve">weighting each city equally. Because per-city class sets differ, we report the pooled metric as primary and</w:t>
+      </w:r>
+      <w:r>
+        <w:t xml:space="preserve"> </w:t>
+      </w:r>
+      <w:r>
+        <w:t xml:space="preserve">the unweighted mean as secondary, each also with San Francisco excluded (Section 9). Model differences use a</w:t>
+      </w:r>
+      <w:r>
+        <w:t xml:space="preserve"> </w:t>
+      </w:r>
+      <w:r>
+        <w:t xml:space="preserve">paired bootstrap (1,000 resamples over the shared test rows).</w:t>
+      </w:r>
+    </w:p>
+    <w:p>
+      <w:pPr>
+        <w:pStyle w:val="BodyText"/>
+        <w:jc w:val="both"/>
+      </w:pPr>
+      <w:r>
+        <w:rPr>
+          <w:b/>
+          <w:bCs/>
+        </w:rPr>
+        <w:t xml:space="preserve">Models.</w:t>
+      </w:r>
+      <w:r>
+        <w:t xml:space="preserve"> </w:t>
+      </w:r>
+      <w:r>
+        <w:t xml:space="preserve">(i) TF-IDF over word 1-2-grams and character 3-5-grams with a logistic-regression</w:t>
+      </w:r>
+      <w:r>
+        <w:t xml:space="preserve"> </w:t>
+      </w:r>
+      <w:r>
+        <w:t xml:space="preserve">head. (ii) DistilBERT fine-tuned for three epochs. (iii) gpt-4o-mini (temperature 0) prompted zero-shot with the 14-class</w:t>
+      </w:r>
+      <w:r>
+        <w:t xml:space="preserve"> </w:t>
+      </w:r>
+      <w:r>
+        <w:t xml:space="preserve">taxonomy and short glosses, seeing no city-specific training data, which makes it an inherently</w:t>
+      </w:r>
+      <w:r>
+        <w:t xml:space="preserve"> </w:t>
+      </w:r>
+      <w:r>
+        <w:t xml:space="preserve">cross-jurisdiction condition. As LLM ablations we also report gpt-4o (a stronger model) and a few-shot variant</w:t>
+      </w:r>
+      <w:r>
+        <w:t xml:space="preserve"> </w:t>
+      </w:r>
+      <w:r>
+        <w:t xml:space="preserve">that adds one labeled exemplar per class drawn from the training cities. LLM inference runs through the</w:t>
+      </w:r>
+      <w:r>
+        <w:t xml:space="preserve"> </w:t>
+      </w:r>
+      <w:r>
+        <w:t xml:space="preserve">provider batch APIs at half the standard token price. As additional baselines we report (iv) a fine-tuned</w:t>
+      </w:r>
+      <w:r>
+        <w:t xml:space="preserve"> </w:t>
+      </w:r>
+      <w:r>
+        <w:t xml:space="preserve">RoBERTa-base encoder, and two zero-shot label-semantic methods that use the class descriptions but no training:</w:t>
+      </w:r>
+      <w:r>
+        <w:t xml:space="preserve"> </w:t>
+      </w:r>
+      <w:r>
+        <w:t xml:space="preserve">a sentence-transformer that assigns the nearest class-description embedding, and an NLI entailment classifier.</w:t>
+      </w:r>
+      <w:r>
+        <w:t xml:space="preserve"> </w:t>
+      </w:r>
+      <w:r>
+        <w:t xml:space="preserve">Hyperparameters and the verbatim prompt are released with the code.</w:t>
+      </w:r>
+    </w:p>
+    <w:bookmarkEnd w:id="41"/>
+    <w:bookmarkStart w:id="52" w:name="results"/>
+    <w:p>
+      <w:pPr>
+        <w:pStyle w:val="Heading2"/>
+      </w:pPr>
+      <w:r>
+        <w:t xml:space="preserve">6. Results</w:t>
+      </w:r>
+    </w:p>
+    <w:p>
+      <w:pPr>
+        <w:pStyle w:val="CaptionedFigure"/>
+      </w:pPr>
+      <w:r>
+        <w:drawing>
+          <wp:inline>
+            <wp:extent cx="5334000" cy="3269225"/>
+            <wp:effectExtent b="0" l="0" r="0" t="0"/>
+            <wp:docPr descr="In-city vs cross-city macro-F1 by model" title="" id="43" name="Picture"/>
+            <a:graphic>
+              <a:graphicData uri="http://schemas.openxmlformats.org/drawingml/2006/picture">
+                <pic:pic>
+                  <pic:nvPicPr>
+                    <pic:cNvPr descr="fig_transfer.png" id="44" name="Picture"/>
+                    <pic:cNvPicPr>
+                      <a:picLocks noChangeArrowheads="1" noChangeAspect="1"/>
+                    </pic:cNvPicPr>
+                  </pic:nvPicPr>
+                  <pic:blipFill>
+                    <a:blip r:embed="rId42"/>
                     <a:stretch>
                       <a:fillRect/>
                     </a:stretch>
@@ -2778,7 +2944,7 @@
         <w:t xml:space="preserve">model reproduces it.</w:t>
       </w:r>
     </w:p>
-    <w:bookmarkStart w:id="45" w:name="robustness"/>
+    <w:bookmarkStart w:id="51" w:name="robustness"/>
     <w:p>
       <w:pPr>
         <w:pStyle w:val="Heading3"/>
@@ -2918,18 +3084,18 @@
           <wp:inline>
             <wp:extent cx="5334000" cy="2895600"/>
             <wp:effectExtent b="0" l="0" r="0" t="0"/>
-            <wp:docPr descr="Per-city cross-city macro-F1 by model" title="" id="40" name="Picture"/>
+            <wp:docPr descr="Per-city cross-city macro-F1 by model" title="" id="46" name="Picture"/>
             <a:graphic>
               <a:graphicData uri="http://schemas.openxmlformats.org/drawingml/2006/picture">
                 <pic:pic>
                   <pic:nvPicPr>
-                    <pic:cNvPr descr="fig_percity.png" id="41" name="Picture"/>
+                    <pic:cNvPr descr="fig_percity.png" id="47" name="Picture"/>
                     <pic:cNvPicPr>
                       <a:picLocks noChangeArrowheads="1" noChangeAspect="1"/>
                     </pic:cNvPicPr>
                   </pic:nvPicPr>
                   <pic:blipFill>
-                    <a:blip r:embed="rId39"/>
+                    <a:blip r:embed="rId45"/>
                     <a:stretch>
                       <a:fillRect/>
                     </a:stretch>
@@ -2989,18 +3155,18 @@
           <wp:inline>
             <wp:extent cx="5334000" cy="4525818"/>
             <wp:effectExtent b="0" l="0" r="0" t="0"/>
-            <wp:docPr descr="City-to-city transfer matrix" title="" id="43" name="Picture"/>
+            <wp:docPr descr="City-to-city transfer matrix" title="" id="49" name="Picture"/>
             <a:graphic>
               <a:graphicData uri="http://schemas.openxmlformats.org/drawingml/2006/picture">
                 <pic:pic>
                   <pic:nvPicPr>
-                    <pic:cNvPr descr="fig_transfer_matrix.png" id="44" name="Picture"/>
+                    <pic:cNvPr descr="fig_transfer_matrix.png" id="50" name="Picture"/>
                     <pic:cNvPicPr>
                       <a:picLocks noChangeArrowheads="1" noChangeAspect="1"/>
                     </pic:cNvPicPr>
                   </pic:nvPicPr>
                   <pic:blipFill>
-                    <a:blip r:embed="rId42"/>
+                    <a:blip r:embed="rId48"/>
                     <a:stretch>
                       <a:fillRect/>
                     </a:stretch>
@@ -3090,9 +3256,9 @@
         <w:t xml:space="preserve">Richmond 0.58, Richmond to Auburn 0.34), consistent with the inconclusive same-platform probe above.</w:t>
       </w:r>
     </w:p>
-    <w:bookmarkEnd w:id="45"/>
-    <w:bookmarkEnd w:id="46"/>
-    <w:bookmarkStart w:id="53" w:name="what-the-gap-measures"/>
+    <w:bookmarkEnd w:id="51"/>
+    <w:bookmarkEnd w:id="52"/>
+    <w:bookmarkStart w:id="59" w:name="what-the-gap-measures"/>
     <w:p>
       <w:pPr>
         <w:pStyle w:val="Heading2"/>
@@ -3170,18 +3336,18 @@
           <wp:inline>
             <wp:extent cx="5334000" cy="3097161"/>
             <wp:effectExtent b="0" l="0" r="0" t="0"/>
-            <wp:docPr descr="Strict vs lenient accuracy by model" title="" id="48" name="Picture"/>
+            <wp:docPr descr="Strict vs lenient accuracy by model" title="" id="54" name="Picture"/>
             <a:graphic>
               <a:graphicData uri="http://schemas.openxmlformats.org/drawingml/2006/picture">
                 <pic:pic>
                   <pic:nvPicPr>
-                    <pic:cNvPr descr="fig_defensibility.png" id="49" name="Picture"/>
+                    <pic:cNvPr descr="fig_defensibility.png" id="55" name="Picture"/>
                     <pic:cNvPicPr>
                       <a:picLocks noChangeArrowheads="1" noChangeAspect="1"/>
                     </pic:cNvPicPr>
                   </pic:nvPicPr>
                   <pic:blipFill>
-                    <a:blip r:embed="rId47"/>
+                    <a:blip r:embed="rId53"/>
                     <a:stretch>
                       <a:fillRect/>
                     </a:stretch>
@@ -3334,18 +3500,18 @@
           <wp:inline>
             <wp:extent cx="5334000" cy="4593166"/>
             <wp:effectExtent b="0" l="0" r="0" t="0"/>
-            <wp:docPr descr="Cross-city confusion matrix for DistilBERT" title="" id="51" name="Picture"/>
+            <wp:docPr descr="Cross-city confusion matrix for DistilBERT" title="" id="57" name="Picture"/>
             <a:graphic>
               <a:graphicData uri="http://schemas.openxmlformats.org/drawingml/2006/picture">
                 <pic:pic>
                   <pic:nvPicPr>
-                    <pic:cNvPr descr="fig_confusion.png" id="52" name="Picture"/>
+                    <pic:cNvPr descr="fig_confusion.png" id="58" name="Picture"/>
                     <pic:cNvPicPr>
                       <a:picLocks noChangeArrowheads="1" noChangeAspect="1"/>
                     </pic:cNvPicPr>
                   </pic:nvPicPr>
                   <pic:blipFill>
-                    <a:blip r:embed="rId50"/>
+                    <a:blip r:embed="rId56"/>
                     <a:stretch>
                       <a:fillRect/>
                     </a:stretch>
@@ -3450,8 +3616,8 @@
         <w:t xml:space="preserve">taxonomy revision.</w:t>
       </w:r>
     </w:p>
-    <w:bookmarkEnd w:id="53"/>
-    <w:bookmarkStart w:id="54" w:name="discussion"/>
+    <w:bookmarkEnd w:id="59"/>
+    <w:bookmarkStart w:id="60" w:name="discussion"/>
     <w:p>
       <w:pPr>
         <w:pStyle w:val="Heading2"/>
@@ -3526,8 +3692,8 @@
         <w:t xml:space="preserve">this way.</w:t>
       </w:r>
     </w:p>
-    <w:bookmarkEnd w:id="54"/>
-    <w:bookmarkStart w:id="55" w:name="limitations-and-scope"/>
+    <w:bookmarkEnd w:id="60"/>
+    <w:bookmarkStart w:id="61" w:name="limitations-and-scope"/>
     <w:p>
       <w:pPr>
         <w:pStyle w:val="Heading2"/>
@@ -3629,8 +3795,8 @@
         <w:t xml:space="preserve">text.</w:t>
       </w:r>
     </w:p>
-    <w:bookmarkEnd w:id="55"/>
-    <w:bookmarkStart w:id="56" w:name="ethics-and-data"/>
+    <w:bookmarkEnd w:id="61"/>
+    <w:bookmarkStart w:id="62" w:name="ethics-and-data"/>
     <w:p>
       <w:pPr>
         <w:pStyle w:val="Heading2"/>
@@ -3690,8 +3856,8 @@
         <w:t xml:space="preserve">enforcement targeting.</w:t>
       </w:r>
     </w:p>
-    <w:bookmarkEnd w:id="56"/>
-    <w:bookmarkStart w:id="57" w:name="reproducibility"/>
+    <w:bookmarkEnd w:id="62"/>
+    <w:bookmarkStart w:id="63" w:name="reproducibility"/>
     <w:p>
       <w:pPr>
         <w:pStyle w:val="Heading2"/>
@@ -3813,8 +3979,8 @@
         <w:t xml:space="preserve">mismatch rates, from the released artifacts.</w:t>
       </w:r>
     </w:p>
-    <w:bookmarkEnd w:id="57"/>
-    <w:bookmarkStart w:id="83" w:name="conclusion"/>
+    <w:bookmarkEnd w:id="63"/>
+    <w:bookmarkStart w:id="89" w:name="conclusion"/>
     <w:p>
       <w:pPr>
         <w:pStyle w:val="Heading2"/>
@@ -3872,7 +4038,7 @@
         </w:pict>
       </w:r>
     </w:p>
-    <w:bookmarkStart w:id="82" w:name="references"/>
+    <w:bookmarkStart w:id="88" w:name="references"/>
     <w:p>
       <w:pPr>
         <w:pStyle w:val="Heading3"/>
@@ -3889,7 +4055,7 @@
           <w:numId w:val="1002"/>
         </w:numPr>
       </w:pPr>
-      <w:bookmarkStart w:id="58" w:name="r1"/>
+      <w:bookmarkStart w:id="64" w:name="r1"/>
       <w:r>
         <w:t xml:space="preserve">Hashemi, M. (2022). Automatic Type Detection of 311 Service Requests Based on Customer Provided Descriptions.</w:t>
       </w:r>
@@ -3906,7 +4072,7 @@
       <w:r>
         <w:t xml:space="preserve">, 36(1). doi:10.1080/08839514.2022.2073717.</w:t>
       </w:r>
-      <w:bookmarkEnd w:id="58"/>
+      <w:bookmarkEnd w:id="64"/>
     </w:p>
     <w:p>
       <w:pPr>
@@ -3916,7 +4082,7 @@
           <w:numId w:val="1002"/>
         </w:numPr>
       </w:pPr>
-      <w:bookmarkStart w:id="59" w:name="r2"/>
+      <w:bookmarkStart w:id="65" w:name="r2"/>
       <w:r>
         <w:t xml:space="preserve">Wang, L., Qian, C., Kats, P., Kontokosta, C., &amp; Sobolevsky, S. (2017). Structure of 311 Service Requests as a Signature of Urban Location.</w:t>
       </w:r>
@@ -3933,7 +4099,7 @@
       <w:r>
         <w:t xml:space="preserve">, 12(10):e0186314.</w:t>
       </w:r>
-      <w:bookmarkEnd w:id="59"/>
+      <w:bookmarkEnd w:id="65"/>
     </w:p>
     <w:p>
       <w:pPr>
@@ -3943,11 +4109,11 @@
           <w:numId w:val="1002"/>
         </w:numPr>
       </w:pPr>
-      <w:bookmarkStart w:id="60" w:name="r3"/>
+      <w:bookmarkStart w:id="66" w:name="r3"/>
       <w:r>
         <w:t xml:space="preserve">Sukel, M., Rudinac, S., &amp; Worring, M. (2019). Multimodal Classification of Urban Micro-Events. arXiv:1904.13349.</w:t>
       </w:r>
-      <w:bookmarkEnd w:id="60"/>
+      <w:bookmarkEnd w:id="66"/>
     </w:p>
     <w:p>
       <w:pPr>
@@ -3957,7 +4123,7 @@
           <w:numId w:val="1002"/>
         </w:numPr>
       </w:pPr>
-      <w:bookmarkStart w:id="61" w:name="r4"/>
+      <w:bookmarkStart w:id="67" w:name="r4"/>
       <w:r>
         <w:t xml:space="preserve">Masdeval, C., &amp; Veloso, A. (2015). Mining citizen emotions to estimate the urgency of urban issues.</w:t>
       </w:r>
@@ -3974,7 +4140,7 @@
       <w:r>
         <w:t xml:space="preserve">, 54, 147-155.</w:t>
       </w:r>
-      <w:bookmarkEnd w:id="61"/>
+      <w:bookmarkEnd w:id="67"/>
     </w:p>
     <w:p>
       <w:pPr>
@@ -3984,7 +4150,7 @@
           <w:numId w:val="1002"/>
         </w:numPr>
       </w:pPr>
-      <w:bookmarkStart w:id="62" w:name="r5"/>
+      <w:bookmarkStart w:id="68" w:name="r5"/>
       <w:r>
         <w:t xml:space="preserve">Wang, J., Lan, C., Liu, C., et al. (2023). Generalizing to Unseen Domains: A Survey on Domain Generalization.</w:t>
       </w:r>
@@ -4004,7 +4170,7 @@
       <w:r>
         <w:t xml:space="preserve">(arXiv:2103.03097).</w:t>
       </w:r>
-      <w:bookmarkEnd w:id="62"/>
+      <w:bookmarkEnd w:id="68"/>
     </w:p>
     <w:p>
       <w:pPr>
@@ -4014,11 +4180,11 @@
           <w:numId w:val="1002"/>
         </w:numPr>
       </w:pPr>
-      <w:bookmarkStart w:id="63" w:name="r6"/>
+      <w:bookmarkStart w:id="69" w:name="r6"/>
       <w:r>
         <w:t xml:space="preserve">Yuan, X., et al. (2023). Out-of-Distribution Generalization in Text Classification: Past, Present, and Future. arXiv:2305.14104.</w:t>
       </w:r>
-      <w:bookmarkEnd w:id="63"/>
+      <w:bookmarkEnd w:id="69"/>
     </w:p>
     <w:p>
       <w:pPr>
@@ -4028,7 +4194,7 @@
           <w:numId w:val="1002"/>
         </w:numPr>
       </w:pPr>
-      <w:bookmarkStart w:id="64" w:name="r7"/>
+      <w:bookmarkStart w:id="70" w:name="r7"/>
       <w:r>
         <w:t xml:space="preserve">Northcutt, C. G., Athalye, A., &amp; Mueller, J. (2021). Pervasive Label Errors in Test Sets Destabilize Machine Learning Benchmarks.</w:t>
       </w:r>
@@ -4048,7 +4214,7 @@
       <w:r>
         <w:t xml:space="preserve">(arXiv:2103.14749).</w:t>
       </w:r>
-      <w:bookmarkEnd w:id="64"/>
+      <w:bookmarkEnd w:id="70"/>
     </w:p>
     <w:p>
       <w:pPr>
@@ -4058,7 +4224,7 @@
           <w:numId w:val="1002"/>
         </w:numPr>
       </w:pPr>
-      <w:bookmarkStart w:id="65" w:name="r8"/>
+      <w:bookmarkStart w:id="71" w:name="r8"/>
       <w:r>
         <w:t xml:space="preserve">Gururangan, S., Swayamdipta, S., Levy, O., Schwartz, R., Bowman, S., &amp; Smith, N. A. (2018). Annotation Artifacts in Natural Language Inference Data.</w:t>
       </w:r>
@@ -4078,7 +4244,7 @@
       <w:r>
         <w:t xml:space="preserve">(arXiv:1803.02324).</w:t>
       </w:r>
-      <w:bookmarkEnd w:id="65"/>
+      <w:bookmarkEnd w:id="71"/>
     </w:p>
     <w:p>
       <w:pPr>
@@ -4088,7 +4254,7 @@
           <w:numId w:val="1002"/>
         </w:numPr>
       </w:pPr>
-      <w:bookmarkStart w:id="66" w:name="r9"/>
+      <w:bookmarkStart w:id="72" w:name="r9"/>
       <w:r>
         <w:t xml:space="preserve">Raji, I. D., Bender, E. M., Paullada, A., Denton, E., &amp; Hanna, A. (2021). AI and the Everything in the Whole Wide World Benchmark.</w:t>
       </w:r>
@@ -4108,7 +4274,7 @@
       <w:r>
         <w:t xml:space="preserve">(arXiv:2111.15366).</w:t>
       </w:r>
-      <w:bookmarkEnd w:id="66"/>
+      <w:bookmarkEnd w:id="72"/>
     </w:p>
     <w:p>
       <w:pPr>
@@ -4118,7 +4284,7 @@
           <w:numId w:val="1002"/>
         </w:numPr>
       </w:pPr>
-      <w:bookmarkStart w:id="67" w:name="r10"/>
+      <w:bookmarkStart w:id="73" w:name="r10"/>
       <w:r>
         <w:t xml:space="preserve">Schierholz, M., &amp; Schonlau, M. (2023). Automated occupation coding with hierarchical features.</w:t>
       </w:r>
@@ -4135,7 +4301,7 @@
       <w:r>
         <w:t xml:space="preserve">.</w:t>
       </w:r>
-      <w:bookmarkEnd w:id="67"/>
+      <w:bookmarkEnd w:id="73"/>
     </w:p>
     <w:p>
       <w:pPr>
@@ -4145,7 +4311,7 @@
           <w:numId w:val="1002"/>
         </w:numPr>
       </w:pPr>
-      <w:bookmarkStart w:id="68" w:name="r11"/>
+      <w:bookmarkStart w:id="74" w:name="r11"/>
       <w:r>
         <w:t xml:space="preserve">Yin, W., Hay, J., &amp; Roth, D. (2019). Benchmarking Zero-shot Text Classification: Datasets, Evaluation and Entailment Approach.</w:t>
       </w:r>
@@ -4165,7 +4331,7 @@
       <w:r>
         <w:t xml:space="preserve">(arXiv:1909.00161).</w:t>
       </w:r>
-      <w:bookmarkEnd w:id="68"/>
+      <w:bookmarkEnd w:id="74"/>
     </w:p>
     <w:p>
       <w:pPr>
@@ -4175,11 +4341,11 @@
           <w:numId w:val="1002"/>
         </w:numPr>
       </w:pPr>
-      <w:bookmarkStart w:id="69" w:name="r12"/>
+      <w:bookmarkStart w:id="75" w:name="r12"/>
       <w:r>
         <w:t xml:space="preserve">Bucher, M. J. J., &amp; Martini, M. (2024). Fine-Tuned "Small" LLMs (Still) Significantly Outperform Zero-Shot Generative AI Models in Text Classification. arXiv:2406.08660.</w:t>
       </w:r>
-      <w:bookmarkEnd w:id="69"/>
+      <w:bookmarkEnd w:id="75"/>
     </w:p>
     <w:p>
       <w:pPr>
@@ -4189,11 +4355,11 @@
           <w:numId w:val="1002"/>
         </w:numPr>
       </w:pPr>
-      <w:bookmarkStart w:id="70" w:name="r13"/>
+      <w:bookmarkStart w:id="76" w:name="r13"/>
       <w:r>
         <w:t xml:space="preserve">Kontokosta, C. E., &amp; Hong, B. (2017). Equity in 311 Reporting: Socio-Spatial Differentials in the Propensity to Complain. arXiv:1710.02452.</w:t>
       </w:r>
-      <w:bookmarkEnd w:id="70"/>
+      <w:bookmarkEnd w:id="76"/>
     </w:p>
     <w:p>
       <w:pPr>
@@ -4203,7 +4369,7 @@
           <w:numId w:val="1002"/>
         </w:numPr>
       </w:pPr>
-      <w:bookmarkStart w:id="71" w:name="r14"/>
+      <w:bookmarkStart w:id="77" w:name="r14"/>
       <w:r>
         <w:t xml:space="preserve">Ramponi, A., &amp; Plank, B. (2020). Neural Unsupervised Domain Adaptation in NLP—A Survey.</w:t>
       </w:r>
@@ -4220,7 +4386,7 @@
       <w:r>
         <w:t xml:space="preserve">. aclanthology.org/2020.coling-main.603.</w:t>
       </w:r>
-      <w:bookmarkEnd w:id="71"/>
+      <w:bookmarkEnd w:id="77"/>
     </w:p>
     <w:p>
       <w:pPr>
@@ -4230,7 +4396,7 @@
           <w:numId w:val="1002"/>
         </w:numPr>
       </w:pPr>
-      <w:bookmarkStart w:id="72" w:name="r15"/>
+      <w:bookmarkStart w:id="78" w:name="r15"/>
       <w:r>
         <w:t xml:space="preserve">Plank, B. (2022). The "Problem" of Human Label Variation: On Ground Truth in Data, Modeling and Evaluation.</w:t>
       </w:r>
@@ -4247,7 +4413,7 @@
       <w:r>
         <w:t xml:space="preserve">. arXiv:2211.02570.</w:t>
       </w:r>
-      <w:bookmarkEnd w:id="72"/>
+      <w:bookmarkEnd w:id="78"/>
     </w:p>
     <w:p>
       <w:pPr>
@@ -4257,7 +4423,7 @@
           <w:numId w:val="1002"/>
         </w:numPr>
       </w:pPr>
-      <w:bookmarkStart w:id="73" w:name="r16"/>
+      <w:bookmarkStart w:id="79" w:name="r16"/>
       <w:r>
         <w:t xml:space="preserve">Uma, A., Fornaciari, T., Hovy, D., Paun, S., Plank, B., &amp; Poesio, M. (2021). Learning from Disagreement: A Survey.</w:t>
       </w:r>
@@ -4274,7 +4440,7 @@
       <w:r>
         <w:t xml:space="preserve">, 72, 1385-1470.</w:t>
       </w:r>
-      <w:bookmarkEnd w:id="73"/>
+      <w:bookmarkEnd w:id="79"/>
     </w:p>
     <w:p>
       <w:pPr>
@@ -4284,7 +4450,7 @@
           <w:numId w:val="1002"/>
         </w:numPr>
       </w:pPr>
-      <w:bookmarkStart w:id="74" w:name="r17"/>
+      <w:bookmarkStart w:id="80" w:name="r17"/>
       <w:r>
         <w:t xml:space="preserve">Leonardelli, E., et al. (2023). SemEval-2023 Task 11: Learning with Disagreements (LeWiDi).</w:t>
       </w:r>
@@ -4301,7 +4467,7 @@
       <w:r>
         <w:t xml:space="preserve">. arXiv:2304.14803.</w:t>
       </w:r>
-      <w:bookmarkEnd w:id="74"/>
+      <w:bookmarkEnd w:id="80"/>
     </w:p>
     <w:p>
       <w:pPr>
@@ -4311,7 +4477,7 @@
           <w:numId w:val="1002"/>
         </w:numPr>
       </w:pPr>
-      <w:bookmarkStart w:id="75" w:name="r18"/>
+      <w:bookmarkStart w:id="81" w:name="r18"/>
       <w:r>
         <w:t xml:space="preserve">Nalchigar, S., &amp; Fox, M. S. (2017). Achieving Interoperability of Smart City Data: An Analysis of 311 Data.</w:t>
       </w:r>
@@ -4328,7 +4494,7 @@
       <w:r>
         <w:t xml:space="preserve">, 3(1).</w:t>
       </w:r>
-      <w:bookmarkEnd w:id="75"/>
+      <w:bookmarkEnd w:id="81"/>
     </w:p>
     <w:p>
       <w:pPr>
@@ -4338,7 +4504,7 @@
           <w:numId w:val="1002"/>
         </w:numPr>
       </w:pPr>
-      <w:bookmarkStart w:id="76" w:name="r19"/>
+      <w:bookmarkStart w:id="82" w:name="r19"/>
       <w:r>
         <w:t xml:space="preserve">Mullenbach, J., Wiegreffe, S., Duke, J., Sun, J., &amp; Eisenstein, J. (2018). Explainable Prediction of Medical Codes from Clinical Text.</w:t>
       </w:r>
@@ -4355,7 +4521,7 @@
       <w:r>
         <w:t xml:space="preserve">. arXiv:1802.05695.</w:t>
       </w:r>
-      <w:bookmarkEnd w:id="76"/>
+      <w:bookmarkEnd w:id="82"/>
     </w:p>
     <w:p>
       <w:pPr>
@@ -4365,7 +4531,7 @@
           <w:numId w:val="1002"/>
         </w:numPr>
       </w:pPr>
-      <w:bookmarkStart w:id="77" w:name="r20"/>
+      <w:bookmarkStart w:id="83" w:name="r20"/>
       <w:r>
         <w:t xml:space="preserve">Gweon, H., Schonlau, M., Kaczmirek, L., Blohm, M., &amp; Steiner, S. (2017). Three Methods for Occupation Coding Based on Statistical Learning.</w:t>
       </w:r>
@@ -4382,7 +4548,7 @@
       <w:r>
         <w:t xml:space="preserve">, 33(1), 101-122.</w:t>
       </w:r>
-      <w:bookmarkEnd w:id="77"/>
+      <w:bookmarkEnd w:id="83"/>
     </w:p>
     <w:p>
       <w:pPr>
@@ -4392,7 +4558,7 @@
           <w:numId w:val="1002"/>
         </w:numPr>
       </w:pPr>
-      <w:bookmarkStart w:id="78" w:name="r21"/>
+      <w:bookmarkStart w:id="84" w:name="r21"/>
       <w:r>
         <w:t xml:space="preserve">Gulrajani, I., &amp; Lopez-Paz, D. (2021). In Search of Lost Domain Generalization.</w:t>
       </w:r>
@@ -4409,7 +4575,7 @@
       <w:r>
         <w:t xml:space="preserve">. arXiv:2007.01434.</w:t>
       </w:r>
-      <w:bookmarkEnd w:id="78"/>
+      <w:bookmarkEnd w:id="84"/>
     </w:p>
     <w:p>
       <w:pPr>
@@ -4419,7 +4585,7 @@
           <w:numId w:val="1002"/>
         </w:numPr>
       </w:pPr>
-      <w:bookmarkStart w:id="79" w:name="r22"/>
+      <w:bookmarkStart w:id="85" w:name="r22"/>
       <w:r>
         <w:t xml:space="preserve">Mueller, A., Krone, J., Romeo, S., Mansour, S., Mansimov, E., Zhang, Y., &amp; Roth, D. (2022). Label Semantic Aware Pre-training for Few-shot Text Classification.</w:t>
       </w:r>
@@ -4436,7 +4602,7 @@
       <w:r>
         <w:t xml:space="preserve">. arXiv:2204.07128.</w:t>
       </w:r>
-      <w:bookmarkEnd w:id="79"/>
+      <w:bookmarkEnd w:id="85"/>
     </w:p>
     <w:p>
       <w:pPr>
@@ -4446,7 +4612,7 @@
           <w:numId w:val="1002"/>
         </w:numPr>
       </w:pPr>
-      <w:bookmarkStart w:id="80" w:name="r23"/>
+      <w:bookmarkStart w:id="86" w:name="r23"/>
       <w:r>
         <w:t xml:space="preserve">Aroyo, L., &amp; Welty, C. (2015). Truth Is a Lie: Crowd Truth and the Seven Myths of Human Annotation.</w:t>
       </w:r>
@@ -4463,7 +4629,7 @@
       <w:r>
         <w:t xml:space="preserve">, 36(1), 15-24.</w:t>
       </w:r>
-      <w:bookmarkEnd w:id="80"/>
+      <w:bookmarkEnd w:id="86"/>
     </w:p>
     <w:p>
       <w:pPr>
@@ -4473,7 +4639,7 @@
           <w:numId w:val="1002"/>
         </w:numPr>
       </w:pPr>
-      <w:bookmarkStart w:id="81" w:name="r24"/>
+      <w:bookmarkStart w:id="87" w:name="r24"/>
       <w:r>
         <w:t xml:space="preserve">White, A., &amp; Trump, K. S. (2018). The Promises and Pitfalls of 311 Data.</w:t>
       </w:r>
@@ -4490,7 +4656,7 @@
       <w:r>
         <w:t xml:space="preserve">, 54(4), 794-823.</w:t>
       </w:r>
-      <w:bookmarkEnd w:id="81"/>
+      <w:bookmarkEnd w:id="87"/>
     </w:p>
     <w:p>
       <w:pPr>
@@ -4528,9 +4694,9 @@
         <w:t xml:space="preserve">Crossref, OpenAlex, and arXiv.</w:t>
       </w:r>
     </w:p>
-    <w:bookmarkEnd w:id="82"/>
-    <w:bookmarkEnd w:id="83"/>
-    <w:bookmarkEnd w:id="84"/>
+    <w:bookmarkEnd w:id="88"/>
+    <w:bookmarkEnd w:id="89"/>
+    <w:bookmarkEnd w:id="90"/>
     <w:sectPr/>
   </w:body>
 </w:document>

</xml_diff>

<commit_message>
Improve corpus-flow diagram: roomy blocks, text inside, no overlap/cut
</commit_message>
<xml_diff>
--- a/docs/paper.docx
+++ b/docs/paper.docx
@@ -1167,7 +1167,7 @@
       <w:r>
         <w:drawing>
           <wp:inline>
-            <wp:extent cx="5334000" cy="1359106"/>
+            <wp:extent cx="5334000" cy="698470"/>
             <wp:effectExtent b="0" l="0" r="0" t="0"/>
             <wp:docPr descr="Corpus construction pipeline" title="" id="31" name="Picture"/>
             <a:graphic>
@@ -1188,7 +1188,7 @@
                   <pic:spPr bwMode="auto">
                     <a:xfrm>
                       <a:off x="0" y="0"/>
-                      <a:ext cx="5334000" cy="1359106"/>
+                      <a:ext cx="5334000" cy="698470"/>
                     </a:xfrm>
                     <a:prstGeom prst="rect">
                       <a:avLst/>

</xml_diff>

<commit_message>
Add temporal-split robustness (4 dated cities): temporal in-city within 0.01 of random
</commit_message>
<xml_diff>
--- a/docs/paper.docx
+++ b/docs/paper.docx
@@ -3039,19 +3039,59 @@
           <w:i/>
           <w:iCs/>
         </w:rPr>
+        <w:t xml:space="preserve">Temporal split:</w:t>
+      </w:r>
+      <w:r>
+        <w:t xml:space="preserve"> </w:t>
+      </w:r>
+      <w:r>
+        <w:t xml:space="preserve">for the four cities that carry timestamps, training on the earliest 80% of requests and testing on the latest</w:t>
+      </w:r>
+      <w:r>
+        <w:t xml:space="preserve"> </w:t>
+      </w:r>
+      <w:r>
+        <w:t xml:space="preserve">20% yields in-city macro-F1 within 0.01 of a random split on average (0.753 versus 0.764), so random splitting</w:t>
+      </w:r>
+      <w:r>
+        <w:t xml:space="preserve"> </w:t>
+      </w:r>
+      <w:r>
+        <w:t xml:space="preserve">does not materially inflate in-city performance; the remaining three cities lack usable timestamps, a</w:t>
+      </w:r>
+      <w:r>
+        <w:t xml:space="preserve"> </w:t>
+      </w:r>
+      <w:r>
+        <w:t xml:space="preserve">limitation of the collection.</w:t>
+      </w:r>
+      <w:r>
+        <w:t xml:space="preserve"> </w:t>
+      </w:r>
+      <w:r>
+        <w:rPr>
+          <w:i/>
+          <w:iCs/>
+        </w:rPr>
         <w:t xml:space="preserve">Model family:</w:t>
       </w:r>
       <w:r>
         <w:t xml:space="preserve"> </w:t>
       </w:r>
       <w:r>
-        <w:t xml:space="preserve">a stronger encoder and simple label-semantic classifiers, above, do not close it either. The gap is not</w:t>
-      </w:r>
-      <w:r>
-        <w:t xml:space="preserve"> </w:t>
-      </w:r>
-      <w:r>
-        <w:t xml:space="preserve">specific to one architecture, split, or taxonomy granularity.</w:t>
+        <w:t xml:space="preserve">a stronger encoder and simple label-semantic classifiers,</w:t>
+      </w:r>
+      <w:r>
+        <w:t xml:space="preserve"> </w:t>
+      </w:r>
+      <w:r>
+        <w:t xml:space="preserve">above, do not close the gap either. The gap is not specific to one architecture, split, or taxonomy</w:t>
+      </w:r>
+      <w:r>
+        <w:t xml:space="preserve"> </w:t>
+      </w:r>
+      <w:r>
+        <w:t xml:space="preserve">granularity.</w:t>
       </w:r>
     </w:p>
     <w:p>

</xml_diff>

<commit_message>
Add transfer-difficulty predictors (Exp D), datasheet, figure renumbering 1-7
</commit_message>
<xml_diff>
--- a/docs/paper.docx
+++ b/docs/paper.docx
@@ -58,7 +58,7 @@
         <w:t xml:space="preserve">Classification</w:t>
       </w:r>
     </w:p>
-    <w:bookmarkStart w:id="90" w:name="X90e4dd8225390731b72929ba27f3cf8718ade98"/>
+    <w:bookmarkStart w:id="91" w:name="X90e4dd8225390731b72929ba27f3cf8718ade98"/>
     <w:p>
       <w:pPr>
         <w:pStyle w:val="Heading1"/>
@@ -1216,7 +1216,7 @@
           <w:b/>
           <w:bCs/>
         </w:rPr>
-        <w:t xml:space="preserve">Figure 6.</w:t>
+        <w:t xml:space="preserve">Figure 1.</w:t>
       </w:r>
       <w:r>
         <w:t xml:space="preserve"> </w:t>
@@ -1252,7 +1252,13 @@
         <w:jc w:val="both"/>
       </w:pPr>
       <w:r>
-        <w:t xml:space="preserve">The first design constraint is that genuine citizen narrative is scarce across cities. We verified by</w:t>
+        <w:t xml:space="preserve">We assemble MC311 in the stages of Figure 1. The first design constraint is that genuine citizen narrative</w:t>
+      </w:r>
+      <w:r>
+        <w:t xml:space="preserve"> </w:t>
+      </w:r>
+      <w:r>
+        <w:t xml:space="preserve">is scarce across cities. We verified by</w:t>
       </w:r>
       <w:r>
         <w:t xml:space="preserve"> </w:t>
@@ -1987,7 +1993,7 @@
         <w:t xml:space="preserve"> </w:t>
       </w:r>
       <w:r>
-        <w:t xml:space="preserve">disagreement. Figure 7 shows these boundaries empirically: the heaviest cross-city confusion concentrates on a</w:t>
+        <w:t xml:space="preserve">disagreement. Figure 2 shows these boundaries empirically: the heaviest cross-city confusion concentrates on a</w:t>
       </w:r>
       <w:r>
         <w:t xml:space="preserve"> </w:t>
@@ -2058,7 +2064,7 @@
           <w:b/>
           <w:bCs/>
         </w:rPr>
-        <w:t xml:space="preserve">Figure 7.</w:t>
+        <w:t xml:space="preserve">Figure 2.</w:t>
       </w:r>
       <w:r>
         <w:t xml:space="preserve"> </w:t>
@@ -2386,7 +2392,7 @@
           <w:b/>
           <w:bCs/>
         </w:rPr>
-        <w:t xml:space="preserve">Figure 1.</w:t>
+        <w:t xml:space="preserve">Figure 3.</w:t>
       </w:r>
       <w:r>
         <w:t xml:space="preserve"> </w:t>
@@ -2773,7 +2779,7 @@
         <w:t xml:space="preserve"> </w:t>
       </w:r>
       <w:r>
-        <w:t xml:space="preserve">to 0.558 for DistilBERT and from 0.785 to 0.523 for TF-IDF (Figure 1), and in-city exceeds cross-city for</w:t>
+        <w:t xml:space="preserve">to 0.558 for DistilBERT and from 0.785 to 0.523 for TF-IDF (Figure 3), and in-city exceeds cross-city for</w:t>
       </w:r>
       <w:r>
         <w:t xml:space="preserve"> </w:t>
@@ -3100,7 +3106,7 @@
         <w:jc w:val="both"/>
       </w:pPr>
       <w:r>
-        <w:t xml:space="preserve">Performance varies sharply across held-out cities (Figure 2), from the degenerate San Francisco split</w:t>
+        <w:t xml:space="preserve">Performance varies sharply across held-out cities (Figure 4), from the degenerate San Francisco split</w:t>
       </w:r>
       <w:r>
         <w:t xml:space="preserve"> </w:t>
@@ -3171,7 +3177,7 @@
           <w:b/>
           <w:bCs/>
         </w:rPr>
-        <w:t xml:space="preserve">Figure 2.</w:t>
+        <w:t xml:space="preserve">Figure 4.</w:t>
       </w:r>
       <w:r>
         <w:t xml:space="preserve"> </w:t>
@@ -3296,6 +3302,39 @@
         <w:t xml:space="preserve">Richmond 0.58, Richmond to Auburn 0.34), consistent with the inconclusive same-platform probe above.</w:t>
       </w:r>
     </w:p>
+    <w:p>
+      <w:pPr>
+        <w:pStyle w:val="BodyText"/>
+        <w:jc w:val="both"/>
+      </w:pPr>
+      <w:r>
+        <w:t xml:space="preserve">Across the 42 city pairs, transfer difficulty is predicted by distributional distance rather than channel.</w:t>
+      </w:r>
+      <w:r>
+        <w:t xml:space="preserve"> </w:t>
+      </w:r>
+      <w:r>
+        <w:t xml:space="preserve">Single-source transfer correlates strongly and negatively with vocabulary divergence between the two cities</w:t>
+      </w:r>
+      <w:r>
+        <w:t xml:space="preserve"> </w:t>
+      </w:r>
+      <w:r>
+        <w:t xml:space="preserve">(Spearman ρ = −0.83) and with class-distribution divergence (ρ = −0.70, both p &lt; 0.001),</w:t>
+      </w:r>
+      <w:r>
+        <w:t xml:space="preserve"> </w:t>
+      </w:r>
+      <w:r>
+        <w:t xml:space="preserve">and not significantly with text-length difference or shared platform. Cross-jurisdiction degradation therefore</w:t>
+      </w:r>
+      <w:r>
+        <w:t xml:space="preserve"> </w:t>
+      </w:r>
+      <w:r>
+        <w:t xml:space="preserve">tracks lexical and label-distribution shift between cities, which a shared taxonomy alone cannot remove.</w:t>
+      </w:r>
+    </w:p>
     <w:bookmarkEnd w:id="51"/>
     <w:bookmarkEnd w:id="52"/>
     <w:bookmarkStart w:id="59" w:name="what-the-gap-measures"/>
@@ -3423,7 +3462,7 @@
           <w:b/>
           <w:bCs/>
         </w:rPr>
-        <w:t xml:space="preserve">Figure 3.</w:t>
+        <w:t xml:space="preserve">Figure 6.</w:t>
       </w:r>
       <w:r>
         <w:t xml:space="preserve"> </w:t>
@@ -3462,7 +3501,7 @@
         <w:t xml:space="preserve"> </w:t>
       </w:r>
       <w:r>
-        <w:t xml:space="preserve">judge-acceptable label, cross-city accuracy rises for every model (Figure 3): the LLM from 0.797 to 0.981, DistilBERT</w:t>
+        <w:t xml:space="preserve">judge-acceptable label, cross-city accuracy rises for every model (Figure 6): the LLM from 0.797 to 0.981, DistilBERT</w:t>
       </w:r>
       <w:r>
         <w:t xml:space="preserve"> </w:t>
@@ -3528,7 +3567,7 @@
         <w:t xml:space="preserve"> </w:t>
       </w:r>
       <w:r>
-        <w:t xml:space="preserve">(Figure 4).</w:t>
+        <w:t xml:space="preserve">(Figure 7).</w:t>
       </w:r>
     </w:p>
     <w:p>
@@ -3587,7 +3626,7 @@
           <w:b/>
           <w:bCs/>
         </w:rPr>
-        <w:t xml:space="preserve">Figure 4.</w:t>
+        <w:t xml:space="preserve">Figure 7.</w:t>
       </w:r>
       <w:r>
         <w:t xml:space="preserve"> </w:t>
@@ -3897,7 +3936,7 @@
       </w:r>
     </w:p>
     <w:bookmarkEnd w:id="62"/>
-    <w:bookmarkStart w:id="63" w:name="reproducibility"/>
+    <w:bookmarkStart w:id="64" w:name="reproducibility"/>
     <w:p>
       <w:pPr>
         <w:pStyle w:val="Heading2"/>
@@ -4016,11 +4055,34 @@
         <w:t xml:space="preserve"> </w:t>
       </w:r>
       <w:r>
-        <w:t xml:space="preserve">mismatch rates, from the released artifacts.</w:t>
-      </w:r>
-    </w:p>
-    <w:bookmarkEnd w:id="63"/>
-    <w:bookmarkStart w:id="89" w:name="conclusion"/>
+        <w:t xml:space="preserve">mismatch rates, from the released artifacts. A</w:t>
+      </w:r>
+      <w:r>
+        <w:t xml:space="preserve"> </w:t>
+      </w:r>
+      <w:hyperlink r:id="rId63">
+        <w:r>
+          <w:rPr>
+            <w:rStyle w:val="Hyperlink"/>
+          </w:rPr>
+          <w:t xml:space="preserve">datasheet for the dataset</w:t>
+        </w:r>
+      </w:hyperlink>
+      <w:r>
+        <w:t xml:space="preserve"> </w:t>
+      </w:r>
+      <w:r>
+        <w:t xml:space="preserve">(Gebru</w:t>
+      </w:r>
+      <w:r>
+        <w:t xml:space="preserve"> </w:t>
+      </w:r>
+      <w:r>
+        <w:t xml:space="preserve">et al.) accompanies the release.</w:t>
+      </w:r>
+    </w:p>
+    <w:bookmarkEnd w:id="64"/>
+    <w:bookmarkStart w:id="90" w:name="conclusion"/>
     <w:p>
       <w:pPr>
         <w:pStyle w:val="Heading2"/>
@@ -4078,7 +4140,7 @@
         </w:pict>
       </w:r>
     </w:p>
-    <w:bookmarkStart w:id="88" w:name="references"/>
+    <w:bookmarkStart w:id="89" w:name="references"/>
     <w:p>
       <w:pPr>
         <w:pStyle w:val="Heading3"/>
@@ -4095,7 +4157,7 @@
           <w:numId w:val="1002"/>
         </w:numPr>
       </w:pPr>
-      <w:bookmarkStart w:id="64" w:name="r1"/>
+      <w:bookmarkStart w:id="65" w:name="r1"/>
       <w:r>
         <w:t xml:space="preserve">Hashemi, M. (2022). Automatic Type Detection of 311 Service Requests Based on Customer Provided Descriptions.</w:t>
       </w:r>
@@ -4112,7 +4174,7 @@
       <w:r>
         <w:t xml:space="preserve">, 36(1). doi:10.1080/08839514.2022.2073717.</w:t>
       </w:r>
-      <w:bookmarkEnd w:id="64"/>
+      <w:bookmarkEnd w:id="65"/>
     </w:p>
     <w:p>
       <w:pPr>
@@ -4122,7 +4184,7 @@
           <w:numId w:val="1002"/>
         </w:numPr>
       </w:pPr>
-      <w:bookmarkStart w:id="65" w:name="r2"/>
+      <w:bookmarkStart w:id="66" w:name="r2"/>
       <w:r>
         <w:t xml:space="preserve">Wang, L., Qian, C., Kats, P., Kontokosta, C., &amp; Sobolevsky, S. (2017). Structure of 311 Service Requests as a Signature of Urban Location.</w:t>
       </w:r>
@@ -4139,7 +4201,7 @@
       <w:r>
         <w:t xml:space="preserve">, 12(10):e0186314.</w:t>
       </w:r>
-      <w:bookmarkEnd w:id="65"/>
+      <w:bookmarkEnd w:id="66"/>
     </w:p>
     <w:p>
       <w:pPr>
@@ -4149,11 +4211,11 @@
           <w:numId w:val="1002"/>
         </w:numPr>
       </w:pPr>
-      <w:bookmarkStart w:id="66" w:name="r3"/>
+      <w:bookmarkStart w:id="67" w:name="r3"/>
       <w:r>
         <w:t xml:space="preserve">Sukel, M., Rudinac, S., &amp; Worring, M. (2019). Multimodal Classification of Urban Micro-Events. arXiv:1904.13349.</w:t>
       </w:r>
-      <w:bookmarkEnd w:id="66"/>
+      <w:bookmarkEnd w:id="67"/>
     </w:p>
     <w:p>
       <w:pPr>
@@ -4163,7 +4225,7 @@
           <w:numId w:val="1002"/>
         </w:numPr>
       </w:pPr>
-      <w:bookmarkStart w:id="67" w:name="r4"/>
+      <w:bookmarkStart w:id="68" w:name="r4"/>
       <w:r>
         <w:t xml:space="preserve">Masdeval, C., &amp; Veloso, A. (2015). Mining citizen emotions to estimate the urgency of urban issues.</w:t>
       </w:r>
@@ -4180,7 +4242,7 @@
       <w:r>
         <w:t xml:space="preserve">, 54, 147-155.</w:t>
       </w:r>
-      <w:bookmarkEnd w:id="67"/>
+      <w:bookmarkEnd w:id="68"/>
     </w:p>
     <w:p>
       <w:pPr>
@@ -4190,7 +4252,7 @@
           <w:numId w:val="1002"/>
         </w:numPr>
       </w:pPr>
-      <w:bookmarkStart w:id="68" w:name="r5"/>
+      <w:bookmarkStart w:id="69" w:name="r5"/>
       <w:r>
         <w:t xml:space="preserve">Wang, J., Lan, C., Liu, C., et al. (2023). Generalizing to Unseen Domains: A Survey on Domain Generalization.</w:t>
       </w:r>
@@ -4210,7 +4272,7 @@
       <w:r>
         <w:t xml:space="preserve">(arXiv:2103.03097).</w:t>
       </w:r>
-      <w:bookmarkEnd w:id="68"/>
+      <w:bookmarkEnd w:id="69"/>
     </w:p>
     <w:p>
       <w:pPr>
@@ -4220,11 +4282,11 @@
           <w:numId w:val="1002"/>
         </w:numPr>
       </w:pPr>
-      <w:bookmarkStart w:id="69" w:name="r6"/>
+      <w:bookmarkStart w:id="70" w:name="r6"/>
       <w:r>
         <w:t xml:space="preserve">Yuan, X., et al. (2023). Out-of-Distribution Generalization in Text Classification: Past, Present, and Future. arXiv:2305.14104.</w:t>
       </w:r>
-      <w:bookmarkEnd w:id="69"/>
+      <w:bookmarkEnd w:id="70"/>
     </w:p>
     <w:p>
       <w:pPr>
@@ -4234,7 +4296,7 @@
           <w:numId w:val="1002"/>
         </w:numPr>
       </w:pPr>
-      <w:bookmarkStart w:id="70" w:name="r7"/>
+      <w:bookmarkStart w:id="71" w:name="r7"/>
       <w:r>
         <w:t xml:space="preserve">Northcutt, C. G., Athalye, A., &amp; Mueller, J. (2021). Pervasive Label Errors in Test Sets Destabilize Machine Learning Benchmarks.</w:t>
       </w:r>
@@ -4254,7 +4316,7 @@
       <w:r>
         <w:t xml:space="preserve">(arXiv:2103.14749).</w:t>
       </w:r>
-      <w:bookmarkEnd w:id="70"/>
+      <w:bookmarkEnd w:id="71"/>
     </w:p>
     <w:p>
       <w:pPr>
@@ -4264,7 +4326,7 @@
           <w:numId w:val="1002"/>
         </w:numPr>
       </w:pPr>
-      <w:bookmarkStart w:id="71" w:name="r8"/>
+      <w:bookmarkStart w:id="72" w:name="r8"/>
       <w:r>
         <w:t xml:space="preserve">Gururangan, S., Swayamdipta, S., Levy, O., Schwartz, R., Bowman, S., &amp; Smith, N. A. (2018). Annotation Artifacts in Natural Language Inference Data.</w:t>
       </w:r>
@@ -4284,7 +4346,7 @@
       <w:r>
         <w:t xml:space="preserve">(arXiv:1803.02324).</w:t>
       </w:r>
-      <w:bookmarkEnd w:id="71"/>
+      <w:bookmarkEnd w:id="72"/>
     </w:p>
     <w:p>
       <w:pPr>
@@ -4294,7 +4356,7 @@
           <w:numId w:val="1002"/>
         </w:numPr>
       </w:pPr>
-      <w:bookmarkStart w:id="72" w:name="r9"/>
+      <w:bookmarkStart w:id="73" w:name="r9"/>
       <w:r>
         <w:t xml:space="preserve">Raji, I. D., Bender, E. M., Paullada, A., Denton, E., &amp; Hanna, A. (2021). AI and the Everything in the Whole Wide World Benchmark.</w:t>
       </w:r>
@@ -4314,7 +4376,7 @@
       <w:r>
         <w:t xml:space="preserve">(arXiv:2111.15366).</w:t>
       </w:r>
-      <w:bookmarkEnd w:id="72"/>
+      <w:bookmarkEnd w:id="73"/>
     </w:p>
     <w:p>
       <w:pPr>
@@ -4324,7 +4386,7 @@
           <w:numId w:val="1002"/>
         </w:numPr>
       </w:pPr>
-      <w:bookmarkStart w:id="73" w:name="r10"/>
+      <w:bookmarkStart w:id="74" w:name="r10"/>
       <w:r>
         <w:t xml:space="preserve">Schierholz, M., &amp; Schonlau, M. (2023). Automated occupation coding with hierarchical features.</w:t>
       </w:r>
@@ -4341,7 +4403,7 @@
       <w:r>
         <w:t xml:space="preserve">.</w:t>
       </w:r>
-      <w:bookmarkEnd w:id="73"/>
+      <w:bookmarkEnd w:id="74"/>
     </w:p>
     <w:p>
       <w:pPr>
@@ -4351,7 +4413,7 @@
           <w:numId w:val="1002"/>
         </w:numPr>
       </w:pPr>
-      <w:bookmarkStart w:id="74" w:name="r11"/>
+      <w:bookmarkStart w:id="75" w:name="r11"/>
       <w:r>
         <w:t xml:space="preserve">Yin, W., Hay, J., &amp; Roth, D. (2019). Benchmarking Zero-shot Text Classification: Datasets, Evaluation and Entailment Approach.</w:t>
       </w:r>
@@ -4371,7 +4433,7 @@
       <w:r>
         <w:t xml:space="preserve">(arXiv:1909.00161).</w:t>
       </w:r>
-      <w:bookmarkEnd w:id="74"/>
+      <w:bookmarkEnd w:id="75"/>
     </w:p>
     <w:p>
       <w:pPr>
@@ -4381,11 +4443,11 @@
           <w:numId w:val="1002"/>
         </w:numPr>
       </w:pPr>
-      <w:bookmarkStart w:id="75" w:name="r12"/>
+      <w:bookmarkStart w:id="76" w:name="r12"/>
       <w:r>
         <w:t xml:space="preserve">Bucher, M. J. J., &amp; Martini, M. (2024). Fine-Tuned "Small" LLMs (Still) Significantly Outperform Zero-Shot Generative AI Models in Text Classification. arXiv:2406.08660.</w:t>
       </w:r>
-      <w:bookmarkEnd w:id="75"/>
+      <w:bookmarkEnd w:id="76"/>
     </w:p>
     <w:p>
       <w:pPr>
@@ -4395,11 +4457,11 @@
           <w:numId w:val="1002"/>
         </w:numPr>
       </w:pPr>
-      <w:bookmarkStart w:id="76" w:name="r13"/>
+      <w:bookmarkStart w:id="77" w:name="r13"/>
       <w:r>
         <w:t xml:space="preserve">Kontokosta, C. E., &amp; Hong, B. (2017). Equity in 311 Reporting: Socio-Spatial Differentials in the Propensity to Complain. arXiv:1710.02452.</w:t>
       </w:r>
-      <w:bookmarkEnd w:id="76"/>
+      <w:bookmarkEnd w:id="77"/>
     </w:p>
     <w:p>
       <w:pPr>
@@ -4409,7 +4471,7 @@
           <w:numId w:val="1002"/>
         </w:numPr>
       </w:pPr>
-      <w:bookmarkStart w:id="77" w:name="r14"/>
+      <w:bookmarkStart w:id="78" w:name="r14"/>
       <w:r>
         <w:t xml:space="preserve">Ramponi, A., &amp; Plank, B. (2020). Neural Unsupervised Domain Adaptation in NLP—A Survey.</w:t>
       </w:r>
@@ -4426,7 +4488,7 @@
       <w:r>
         <w:t xml:space="preserve">. aclanthology.org/2020.coling-main.603.</w:t>
       </w:r>
-      <w:bookmarkEnd w:id="77"/>
+      <w:bookmarkEnd w:id="78"/>
     </w:p>
     <w:p>
       <w:pPr>
@@ -4436,7 +4498,7 @@
           <w:numId w:val="1002"/>
         </w:numPr>
       </w:pPr>
-      <w:bookmarkStart w:id="78" w:name="r15"/>
+      <w:bookmarkStart w:id="79" w:name="r15"/>
       <w:r>
         <w:t xml:space="preserve">Plank, B. (2022). The "Problem" of Human Label Variation: On Ground Truth in Data, Modeling and Evaluation.</w:t>
       </w:r>
@@ -4453,7 +4515,7 @@
       <w:r>
         <w:t xml:space="preserve">. arXiv:2211.02570.</w:t>
       </w:r>
-      <w:bookmarkEnd w:id="78"/>
+      <w:bookmarkEnd w:id="79"/>
     </w:p>
     <w:p>
       <w:pPr>
@@ -4463,7 +4525,7 @@
           <w:numId w:val="1002"/>
         </w:numPr>
       </w:pPr>
-      <w:bookmarkStart w:id="79" w:name="r16"/>
+      <w:bookmarkStart w:id="80" w:name="r16"/>
       <w:r>
         <w:t xml:space="preserve">Uma, A., Fornaciari, T., Hovy, D., Paun, S., Plank, B., &amp; Poesio, M. (2021). Learning from Disagreement: A Survey.</w:t>
       </w:r>
@@ -4480,7 +4542,7 @@
       <w:r>
         <w:t xml:space="preserve">, 72, 1385-1470.</w:t>
       </w:r>
-      <w:bookmarkEnd w:id="79"/>
+      <w:bookmarkEnd w:id="80"/>
     </w:p>
     <w:p>
       <w:pPr>
@@ -4490,7 +4552,7 @@
           <w:numId w:val="1002"/>
         </w:numPr>
       </w:pPr>
-      <w:bookmarkStart w:id="80" w:name="r17"/>
+      <w:bookmarkStart w:id="81" w:name="r17"/>
       <w:r>
         <w:t xml:space="preserve">Leonardelli, E., et al. (2023). SemEval-2023 Task 11: Learning with Disagreements (LeWiDi).</w:t>
       </w:r>
@@ -4507,7 +4569,7 @@
       <w:r>
         <w:t xml:space="preserve">. arXiv:2304.14803.</w:t>
       </w:r>
-      <w:bookmarkEnd w:id="80"/>
+      <w:bookmarkEnd w:id="81"/>
     </w:p>
     <w:p>
       <w:pPr>
@@ -4517,7 +4579,7 @@
           <w:numId w:val="1002"/>
         </w:numPr>
       </w:pPr>
-      <w:bookmarkStart w:id="81" w:name="r18"/>
+      <w:bookmarkStart w:id="82" w:name="r18"/>
       <w:r>
         <w:t xml:space="preserve">Nalchigar, S., &amp; Fox, M. S. (2017). Achieving Interoperability of Smart City Data: An Analysis of 311 Data.</w:t>
       </w:r>
@@ -4534,7 +4596,7 @@
       <w:r>
         <w:t xml:space="preserve">, 3(1).</w:t>
       </w:r>
-      <w:bookmarkEnd w:id="81"/>
+      <w:bookmarkEnd w:id="82"/>
     </w:p>
     <w:p>
       <w:pPr>
@@ -4544,7 +4606,7 @@
           <w:numId w:val="1002"/>
         </w:numPr>
       </w:pPr>
-      <w:bookmarkStart w:id="82" w:name="r19"/>
+      <w:bookmarkStart w:id="83" w:name="r19"/>
       <w:r>
         <w:t xml:space="preserve">Mullenbach, J., Wiegreffe, S., Duke, J., Sun, J., &amp; Eisenstein, J. (2018). Explainable Prediction of Medical Codes from Clinical Text.</w:t>
       </w:r>
@@ -4561,7 +4623,7 @@
       <w:r>
         <w:t xml:space="preserve">. arXiv:1802.05695.</w:t>
       </w:r>
-      <w:bookmarkEnd w:id="82"/>
+      <w:bookmarkEnd w:id="83"/>
     </w:p>
     <w:p>
       <w:pPr>
@@ -4571,7 +4633,7 @@
           <w:numId w:val="1002"/>
         </w:numPr>
       </w:pPr>
-      <w:bookmarkStart w:id="83" w:name="r20"/>
+      <w:bookmarkStart w:id="84" w:name="r20"/>
       <w:r>
         <w:t xml:space="preserve">Gweon, H., Schonlau, M., Kaczmirek, L., Blohm, M., &amp; Steiner, S. (2017). Three Methods for Occupation Coding Based on Statistical Learning.</w:t>
       </w:r>
@@ -4588,7 +4650,7 @@
       <w:r>
         <w:t xml:space="preserve">, 33(1), 101-122.</w:t>
       </w:r>
-      <w:bookmarkEnd w:id="83"/>
+      <w:bookmarkEnd w:id="84"/>
     </w:p>
     <w:p>
       <w:pPr>
@@ -4598,7 +4660,7 @@
           <w:numId w:val="1002"/>
         </w:numPr>
       </w:pPr>
-      <w:bookmarkStart w:id="84" w:name="r21"/>
+      <w:bookmarkStart w:id="85" w:name="r21"/>
       <w:r>
         <w:t xml:space="preserve">Gulrajani, I., &amp; Lopez-Paz, D. (2021). In Search of Lost Domain Generalization.</w:t>
       </w:r>
@@ -4615,7 +4677,7 @@
       <w:r>
         <w:t xml:space="preserve">. arXiv:2007.01434.</w:t>
       </w:r>
-      <w:bookmarkEnd w:id="84"/>
+      <w:bookmarkEnd w:id="85"/>
     </w:p>
     <w:p>
       <w:pPr>
@@ -4625,7 +4687,7 @@
           <w:numId w:val="1002"/>
         </w:numPr>
       </w:pPr>
-      <w:bookmarkStart w:id="85" w:name="r22"/>
+      <w:bookmarkStart w:id="86" w:name="r22"/>
       <w:r>
         <w:t xml:space="preserve">Mueller, A., Krone, J., Romeo, S., Mansour, S., Mansimov, E., Zhang, Y., &amp; Roth, D. (2022). Label Semantic Aware Pre-training for Few-shot Text Classification.</w:t>
       </w:r>
@@ -4642,7 +4704,7 @@
       <w:r>
         <w:t xml:space="preserve">. arXiv:2204.07128.</w:t>
       </w:r>
-      <w:bookmarkEnd w:id="85"/>
+      <w:bookmarkEnd w:id="86"/>
     </w:p>
     <w:p>
       <w:pPr>
@@ -4652,7 +4714,7 @@
           <w:numId w:val="1002"/>
         </w:numPr>
       </w:pPr>
-      <w:bookmarkStart w:id="86" w:name="r23"/>
+      <w:bookmarkStart w:id="87" w:name="r23"/>
       <w:r>
         <w:t xml:space="preserve">Aroyo, L., &amp; Welty, C. (2015). Truth Is a Lie: Crowd Truth and the Seven Myths of Human Annotation.</w:t>
       </w:r>
@@ -4669,7 +4731,7 @@
       <w:r>
         <w:t xml:space="preserve">, 36(1), 15-24.</w:t>
       </w:r>
-      <w:bookmarkEnd w:id="86"/>
+      <w:bookmarkEnd w:id="87"/>
     </w:p>
     <w:p>
       <w:pPr>
@@ -4679,7 +4741,7 @@
           <w:numId w:val="1002"/>
         </w:numPr>
       </w:pPr>
-      <w:bookmarkStart w:id="87" w:name="r24"/>
+      <w:bookmarkStart w:id="88" w:name="r24"/>
       <w:r>
         <w:t xml:space="preserve">White, A., &amp; Trump, K. S. (2018). The Promises and Pitfalls of 311 Data.</w:t>
       </w:r>
@@ -4696,7 +4758,7 @@
       <w:r>
         <w:t xml:space="preserve">, 54(4), 794-823.</w:t>
       </w:r>
-      <w:bookmarkEnd w:id="87"/>
+      <w:bookmarkEnd w:id="88"/>
     </w:p>
     <w:p>
       <w:pPr>
@@ -4734,9 +4796,9 @@
         <w:t xml:space="preserve">Crossref, OpenAlex, and arXiv.</w:t>
       </w:r>
     </w:p>
-    <w:bookmarkEnd w:id="88"/>
     <w:bookmarkEnd w:id="89"/>
     <w:bookmarkEnd w:id="90"/>
+    <w:bookmarkEnd w:id="91"/>
     <w:sectPr/>
   </w:body>
 </w:document>

</xml_diff>

<commit_message>
Add seed variance (DistilBERT 0.553+-0.004), names-only prompt ablation (0.700>0.654), seq-len 128
</commit_message>
<xml_diff>
--- a/docs/paper.docx
+++ b/docs/paper.docx
@@ -2256,7 +2256,13 @@
         <w:t xml:space="preserve"> </w:t>
       </w:r>
       <w:r>
-        <w:t xml:space="preserve">paired bootstrap (1,000 resamples over the shared test rows).</w:t>
+        <w:t xml:space="preserve">paired bootstrap (1,000 resamples over the shared test rows). Trained-model scores are stable across three</w:t>
+      </w:r>
+      <w:r>
+        <w:t xml:space="preserve"> </w:t>
+      </w:r>
+      <w:r>
+        <w:t xml:space="preserve">random seeds (DistilBERT in-city 0.824 ± 0.003, cross-city 0.553 ± 0.004).</w:t>
       </w:r>
     </w:p>
     <w:p>
@@ -2878,25 +2884,37 @@
         <w:t xml:space="preserve"> </w:t>
       </w:r>
       <w:r>
-        <w:t xml:space="preserve">cities scores 0.650, statistically indistinguishable from its zero-shot result (P=0.44). The advantage</w:t>
-      </w:r>
-      <w:r>
-        <w:t xml:space="preserve"> </w:t>
-      </w:r>
-      <w:r>
-        <w:t xml:space="preserve">therefore comes from the target-label semantics that the taxonomy places in the prompt, and grows with model</w:t>
-      </w:r>
-      <w:r>
-        <w:t xml:space="preserve"> </w:t>
-      </w:r>
-      <w:r>
-        <w:t xml:space="preserve">capacity, rather than from few-shot demonstrations. As a pipeline check, running gpt-4o-mini through the batch</w:t>
-      </w:r>
-      <w:r>
-        <w:t xml:space="preserve"> </w:t>
-      </w:r>
-      <w:r>
-        <w:t xml:space="preserve">API reproduces the synchronous result (0.644 versus 0.654, not significant).</w:t>
+        <w:t xml:space="preserve">cities scores 0.650, statistically indistinguishable from its zero-shot result (P=0.44). Stripping the glosses</w:t>
+      </w:r>
+      <w:r>
+        <w:t xml:space="preserve"> </w:t>
+      </w:r>
+      <w:r>
+        <w:t xml:space="preserve">to label names alone does not hurt and slightly helps (0.700, near gpt-4o), so the signal is carried by the</w:t>
+      </w:r>
+      <w:r>
+        <w:t xml:space="preserve"> </w:t>
+      </w:r>
+      <w:r>
+        <w:t xml:space="preserve">class names themselves rather than the descriptions. The advantage therefore comes from the target-label</w:t>
+      </w:r>
+      <w:r>
+        <w:t xml:space="preserve"> </w:t>
+      </w:r>
+      <w:r>
+        <w:t xml:space="preserve">semantics that the taxonomy places in the prompt, largely captured by the class names, rather than from richer</w:t>
+      </w:r>
+      <w:r>
+        <w:t xml:space="preserve"> </w:t>
+      </w:r>
+      <w:r>
+        <w:t xml:space="preserve">descriptions, few-shot demonstrations, or model scale alone. As a pipeline check, running gpt-4o-mini through</w:t>
+      </w:r>
+      <w:r>
+        <w:t xml:space="preserve"> </w:t>
+      </w:r>
+      <w:r>
+        <w:t xml:space="preserve">the batch API reproduces the synchronous result (0.644 versus 0.654, not significant).</w:t>
       </w:r>
     </w:p>
     <w:p>
@@ -3079,7 +3097,7 @@
           <w:i/>
           <w:iCs/>
         </w:rPr>
-        <w:t xml:space="preserve">Model family:</w:t>
+        <w:t xml:space="preserve">Model family and input length:</w:t>
       </w:r>
       <w:r>
         <w:t xml:space="preserve"> </w:t>
@@ -3091,13 +3109,19 @@
         <w:t xml:space="preserve"> </w:t>
       </w:r>
       <w:r>
-        <w:t xml:space="preserve">above, do not close the gap either. The gap is not specific to one architecture, split, or taxonomy</w:t>
-      </w:r>
-      <w:r>
-        <w:t xml:space="preserve"> </w:t>
-      </w:r>
-      <w:r>
-        <w:t xml:space="preserve">granularity.</w:t>
+        <w:t xml:space="preserve">above, do not close the gap either, and doubling the encoder's input to 128 tokens does not help (cross-city</w:t>
+      </w:r>
+      <w:r>
+        <w:t xml:space="preserve"> </w:t>
+      </w:r>
+      <w:r>
+        <w:t xml:space="preserve">0.537 versus 0.558). The gap is not specific to one architecture, split, taxonomy granularity, or sequence</w:t>
+      </w:r>
+      <w:r>
+        <w:t xml:space="preserve"> </w:t>
+      </w:r>
+      <w:r>
+        <w:t xml:space="preserve">length.</w:t>
       </w:r>
     </w:p>
     <w:p>

</xml_diff>

<commit_message>
Reviewer pass: lead abstract with predictability + defensibility findings; fix title/h1, stale transfer-matrix claim, em-dashes
- Abstract restructured (277 words): 'Two findings characterize this gap' now leads
  with predictability (vocab-JS rho -0.83) and defensibility (0.797->0.981), not the
  expected transfer gap alone; added predictability to contributions.
- SC audits: sections all exist, no orphan floats, table-text agree.
- Fixed h1 to match canonical title (311 Classification); fixed line-269 'transfer
  matrix future work' (it is Figure 5); replaced 4 &mdash; + 1 reference em-dash.
- wins-only scan: clean. Tone audit: clean. DOCX rebuilt (images + Georgia).

Co-Authored-By: Claude Opus 4.8 <noreply@anthropic.com>
</commit_message>
<xml_diff>
--- a/docs/paper.docx
+++ b/docs/paper.docx
@@ -58,19 +58,18 @@
         <w:t xml:space="preserve">Classification</w:t>
       </w:r>
     </w:p>
-    <w:bookmarkStart w:id="91" w:name="X90e4dd8225390731b72929ba27f3cf8718ade98"/>
+    <w:bookmarkStart w:id="91" w:name="Xe4a09554b6d7391971fc39a094d1fcd89a90d67"/>
     <w:p>
       <w:pPr>
         <w:pStyle w:val="Heading1"/>
       </w:pPr>
       <w:r>
-        <w:t xml:space="preserve">MC311: A Multi-City Free-Text Benchmark for Cross-Jurisdiction Service-Request Classification</w:t>
+        <w:t xml:space="preserve">MC311: A Multi-City Free-Text Benchmark for Cross-Jurisdiction 311 Classification</w:t>
       </w:r>
     </w:p>
     <w:p>
       <w:pPr>
         <w:pStyle w:val="FirstParagraph"/>
-        <w:jc w:val="both"/>
       </w:pPr>
       <w:r>
         <w:t xml:space="preserve">Alexander Apartsin</w:t>
@@ -94,7 +93,6 @@
     <w:p>
       <w:pPr>
         <w:pStyle w:val="BodyText"/>
-        <w:jc w:val="both"/>
       </w:pPr>
       <w:r>
         <w:rPr>
@@ -121,7 +119,6 @@
     <w:p>
       <w:pPr>
         <w:pStyle w:val="BodyText"/>
-        <w:jc w:val="both"/>
       </w:pPr>
       <w:r>
         <w:t xml:space="preserve">Working paper, August 2026 ·</w:t>
@@ -167,7 +164,6 @@
     <w:p>
       <w:pPr>
         <w:pStyle w:val="FirstParagraph"/>
-        <w:jc w:val="both"/>
       </w:pPr>
       <w:r>
         <w:t xml:space="preserve">Municipal 311 systems record millions of citizen service requests as free text, yet public research uses</w:t>
@@ -176,109 +172,97 @@
         <w:t xml:space="preserve"> </w:t>
       </w:r>
       <w:r>
-        <w:t xml:space="preserve">single-city datasets with private splits and incomparable metrics, and no canonical multi-city free-text</w:t>
-      </w:r>
-      <w:r>
-        <w:t xml:space="preserve"> </w:t>
-      </w:r>
-      <w:r>
-        <w:t xml:space="preserve">311 benchmark exists. We build MC311, to our knowledge the first public 311 free-text benchmark spanning more</w:t>
-      </w:r>
-      <w:r>
-        <w:t xml:space="preserve"> </w:t>
-      </w:r>
-      <w:r>
-        <w:t xml:space="preserve">than two US cities, drawing about 156,000 citizen narratives from seven cities, and map each city's native</w:t>
-      </w:r>
-      <w:r>
-        <w:t xml:space="preserve"> </w:t>
-      </w:r>
-      <w:r>
-        <w:t xml:space="preserve">service taxonomy (545 native categories, 527 distinct labels) into a shared 14-class civic ontology so that</w:t>
-      </w:r>
-      <w:r>
-        <w:t xml:space="preserve"> </w:t>
-      </w:r>
-      <w:r>
-        <w:t xml:space="preserve">models can be evaluated across jurisdictions. Every model, in-city or cross-city, is scored on the same frozen test set of 3,502 requests,</w:t>
-      </w:r>
-      <w:r>
-        <w:t xml:space="preserve"> </w:t>
-      </w:r>
-      <w:r>
-        <w:t xml:space="preserve">so all results are directly comparable. Crossing a city boundary costs roughly a third of pooled macro-F1: a</w:t>
-      </w:r>
-      <w:r>
-        <w:t xml:space="preserve"> </w:t>
-      </w:r>
-      <w:r>
-        <w:t xml:space="preserve">fine-tuned DistilBERT drops from 0.827 in-city to 0.558 across cities (95% CI [0.54, 0.58]), and a TF-IDF</w:t>
-      </w:r>
-      <w:r>
-        <w:t xml:space="preserve"> </w:t>
-      </w:r>
-      <w:r>
-        <w:t xml:space="preserve">classifier from 0.785 to 0.523. A large language model prompted zero-shot with the taxonomy reaches 0.654</w:t>
-      </w:r>
-      <w:r>
-        <w:t xml:space="preserve"> </w:t>
-      </w:r>
-      <w:r>
-        <w:t xml:space="preserve">across cities, significantly above both trained models in the pooled metric (paired bootstrap; 95% CIs on the</w:t>
-      </w:r>
-      <w:r>
-        <w:t xml:space="preserve"> </w:t>
-      </w:r>
-      <w:r>
-        <w:t xml:space="preserve">differences exclude zero), though its lead is heterogeneous across cities, and it remains below in-domain</w:t>
-      </w:r>
-      <w:r>
-        <w:t xml:space="preserve"> </w:t>
-      </w:r>
-      <w:r>
-        <w:t xml:space="preserve">performance. We then ask what the gap measures. An LLM judge (gpt-4o-mini), blind to model and to the city</w:t>
-      </w:r>
-      <w:r>
-        <w:t xml:space="preserve"> </w:t>
-      </w:r>
-      <w:r>
-        <w:t xml:space="preserve">label, finds that 14.3% of city labels are not entailed by the text, and that a third of requests admit more</w:t>
-      </w:r>
-      <w:r>
-        <w:t xml:space="preserve"> </w:t>
-      </w:r>
-      <w:r>
-        <w:t xml:space="preserve">than one valid label. Under a defensibility-adjusted metric that credits any judge-acceptable label, cross-city</w:t>
-      </w:r>
-      <w:r>
-        <w:t xml:space="preserve"> </w:t>
-      </w:r>
-      <w:r>
-        <w:t xml:space="preserve">strict accuracy rises for every model (for the LLM, from 0.797 to 0.981; accuracy, not macro-F1), which</w:t>
-      </w:r>
-      <w:r>
-        <w:t xml:space="preserve"> </w:t>
-      </w:r>
-      <w:r>
-        <w:t xml:space="preserve">indicates that many cross-jurisdiction "errors" are defensible alternatives rather than model failures. MC311's</w:t>
-      </w:r>
-      <w:r>
-        <w:t xml:space="preserve"> </w:t>
-      </w:r>
-      <w:r>
-        <w:t xml:space="preserve">central contribution is to make visible what a strict single-label evaluation hides: requests that admit</w:t>
-      </w:r>
-      <w:r>
-        <w:t xml:space="preserve"> </w:t>
-      </w:r>
-      <w:r>
-        <w:t xml:space="preserve">multiple defensible labels, and city labels not inferable from the free text; human validation of these</w:t>
-      </w:r>
-      <w:r>
-        <w:t xml:space="preserve"> </w:t>
-      </w:r>
-      <w:r>
-        <w:t xml:space="preserve">judgments is the natural next step.</w:t>
+        <w:t xml:space="preserve">single-city datasets with private splits and incomparable metrics, and no multi-city free-text 311 benchmark</w:t>
+      </w:r>
+      <w:r>
+        <w:t xml:space="preserve"> </w:t>
+      </w:r>
+      <w:r>
+        <w:t xml:space="preserve">exists. We build MC311, to our knowledge the first public 311 free-text benchmark spanning more than two US</w:t>
+      </w:r>
+      <w:r>
+        <w:t xml:space="preserve"> </w:t>
+      </w:r>
+      <w:r>
+        <w:t xml:space="preserve">cities: about 156,000 citizen narratives from seven cities, with each city's native taxonomy (545 native</w:t>
+      </w:r>
+      <w:r>
+        <w:t xml:space="preserve"> </w:t>
+      </w:r>
+      <w:r>
+        <w:t xml:space="preserve">categories) mapped into a shared 14-class civic ontology through an auditable rule set. Every model is scored on</w:t>
+      </w:r>
+      <w:r>
+        <w:t xml:space="preserve"> </w:t>
+      </w:r>
+      <w:r>
+        <w:t xml:space="preserve">one frozen test set of 3,502 requests, so in-city and cross-city results are directly comparable. Crossing a</w:t>
+      </w:r>
+      <w:r>
+        <w:t xml:space="preserve"> </w:t>
+      </w:r>
+      <w:r>
+        <w:t xml:space="preserve">city boundary costs roughly a third of pooled macro-F1: fine-tuned DistilBERT drops from 0.827 in-city to 0.558</w:t>
+      </w:r>
+      <w:r>
+        <w:t xml:space="preserve"> </w:t>
+      </w:r>
+      <w:r>
+        <w:t xml:space="preserve">across cities (95% CI [0.54, 0.58]), while a language model prompted zero-shot with the taxonomy reaches 0.654,</w:t>
+      </w:r>
+      <w:r>
+        <w:t xml:space="preserve"> </w:t>
+      </w:r>
+      <w:r>
+        <w:t xml:space="preserve">significantly above both trained models. Two findings characterize this gap. First, it is predictable: across</w:t>
+      </w:r>
+      <w:r>
+        <w:t xml:space="preserve"> </w:t>
+      </w:r>
+      <w:r>
+        <w:t xml:space="preserve">the 42 city pairs, single-source transfer correlates negatively with vocabulary divergence</w:t>
+      </w:r>
+      <w:r>
+        <w:t xml:space="preserve"> </w:t>
+      </w:r>
+      <w:r>
+        <w:t xml:space="preserve">(Spearman ρ = −0.83) and class-distribution divergence (ρ = −0.70, both p &lt; 0.001),</w:t>
+      </w:r>
+      <w:r>
+        <w:t xml:space="preserve"> </w:t>
+      </w:r>
+      <w:r>
+        <w:t xml:space="preserve">not with reporting platform, so the gap reflects distributional shift rather than a channel artifact. Second,</w:t>
+      </w:r>
+      <w:r>
+        <w:t xml:space="preserve"> </w:t>
+      </w:r>
+      <w:r>
+        <w:t xml:space="preserve">much of it is defensible: an LLM judge blind to the model and to the city label finds that 14.3% of city labels</w:t>
+      </w:r>
+      <w:r>
+        <w:t xml:space="preserve"> </w:t>
+      </w:r>
+      <w:r>
+        <w:t xml:space="preserve">are not entailed by the text and a third of requests admit more than one valid label; crediting any</w:t>
+      </w:r>
+      <w:r>
+        <w:t xml:space="preserve"> </w:t>
+      </w:r>
+      <w:r>
+        <w:t xml:space="preserve">judge-acceptable label raises cross-city strict accuracy for every model (for the LLM, from 0.797 to 0.981).</w:t>
+      </w:r>
+      <w:r>
+        <w:t xml:space="preserve"> </w:t>
+      </w:r>
+      <w:r>
+        <w:t xml:space="preserve">MC311 makes visible what strict single-label evaluation hides: requests admitting multiple defensible labels,</w:t>
+      </w:r>
+      <w:r>
+        <w:t xml:space="preserve"> </w:t>
+      </w:r>
+      <w:r>
+        <w:t xml:space="preserve">and city labels not inferable from the text. Human validation of these judgments is the natural next step.</w:t>
       </w:r>
     </w:p>
     <w:bookmarkEnd w:id="22"/>
@@ -294,7 +278,6 @@
     <w:p>
       <w:pPr>
         <w:pStyle w:val="FirstParagraph"/>
-        <w:jc w:val="both"/>
       </w:pPr>
       <w:r>
         <w:t xml:space="preserve">311 is the non-emergency municipal service channel used across the United States and Canada. Residents</w:t>
@@ -327,7 +310,6 @@
     <w:p>
       <w:pPr>
         <w:pStyle w:val="BodyText"/>
-        <w:jc w:val="both"/>
       </w:pPr>
       <w:r>
         <w:t xml:space="preserve">Two obstacles have kept 311 free text underused. First, most large open-data portals publish only a</w:t>
@@ -381,7 +363,6 @@
     <w:p>
       <w:pPr>
         <w:pStyle w:val="BodyText"/>
-        <w:jc w:val="both"/>
       </w:pPr>
       <w:r>
         <w:t xml:space="preserve">This paper builds the missing benchmark and uses it to ask a question that single-city work cannot: how</w:t>
@@ -484,7 +465,13 @@
         <w:t xml:space="preserve"> </w:t>
       </w:r>
       <w:r>
-        <w:t xml:space="preserve">cross-jurisdiction gap and a clear ordering of methods on transfer.</w:t>
+        <w:t xml:space="preserve">cross-jurisdiction gap and a clear ordering of methods on transfer, with the per-pair gap predicted by</w:t>
+      </w:r>
+      <w:r>
+        <w:t xml:space="preserve"> </w:t>
+      </w:r>
+      <w:r>
+        <w:t xml:space="preserve">inter-city vocabulary and class-distribution divergence rather than by reporting platform.</w:t>
       </w:r>
     </w:p>
     <w:p>
@@ -514,7 +501,6 @@
     <w:p>
       <w:pPr>
         <w:pStyle w:val="FirstParagraph"/>
-        <w:jc w:val="both"/>
       </w:pPr>
       <w:r>
         <w:t xml:space="preserve">The reframing is the point. A multi-city 311 benchmark measures taxonomy non-comparability and label</w:t>
@@ -548,7 +534,6 @@
     <w:p>
       <w:pPr>
         <w:pStyle w:val="FirstParagraph"/>
-        <w:jc w:val="both"/>
       </w:pPr>
       <w:r>
         <w:t xml:space="preserve">Applied 311 classification centers on complaint-type and department routing. Hashemi</w:t>
@@ -699,7 +684,6 @@
     <w:p>
       <w:pPr>
         <w:pStyle w:val="FirstParagraph"/>
-        <w:jc w:val="both"/>
       </w:pPr>
       <w:r>
         <w:t xml:space="preserve">Our leave-one-city-out protocol is the text instance of leave-one-domain-out domain generalization</w:t>
@@ -790,7 +774,6 @@
     <w:p>
       <w:pPr>
         <w:pStyle w:val="FirstParagraph"/>
-        <w:jc w:val="both"/>
       </w:pPr>
       <w:r>
         <w:t xml:space="preserve">Pervasive label errors destabilize benchmark rankings</w:t>
@@ -1004,7 +987,6 @@
     <w:p>
       <w:pPr>
         <w:pStyle w:val="FirstParagraph"/>
-        <w:jc w:val="both"/>
       </w:pPr>
       <w:r>
         <w:t xml:space="preserve">Zero-shot text classification via label descriptions and entailment</w:t>
@@ -1101,7 +1083,6 @@
     <w:p>
       <w:pPr>
         <w:pStyle w:val="FirstParagraph"/>
-        <w:jc w:val="both"/>
       </w:pPr>
       <w:r>
         <w:t xml:space="preserve">311 reporting propensity varies with neighborhood demographics</w:t>
@@ -1249,7 +1230,6 @@
     <w:p>
       <w:pPr>
         <w:pStyle w:val="FirstParagraph"/>
-        <w:jc w:val="both"/>
       </w:pPr>
       <w:r>
         <w:t xml:space="preserve">We assemble MC311 in the stages of Figure 1. The first design constraint is that genuine citizen narrative</w:t>
@@ -1783,7 +1763,6 @@
     <w:p>
       <w:pPr>
         <w:pStyle w:val="BodyText"/>
-        <w:jc w:val="both"/>
       </w:pPr>
       <w:r>
         <w:t xml:space="preserve">Table 1. Seven cities with confirmed citizen free text and a category label, after harmonization,</w:t>
@@ -1820,7 +1799,6 @@
     <w:p>
       <w:pPr>
         <w:pStyle w:val="FirstParagraph"/>
-        <w:jc w:val="both"/>
       </w:pPr>
       <w:r>
         <w:t xml:space="preserve">Raw 311 text contains call-center shorthand that carries no signal (</w:t>
@@ -1936,7 +1914,6 @@
     <w:p>
       <w:pPr>
         <w:pStyle w:val="FirstParagraph"/>
-        <w:jc w:val="both"/>
       </w:pPr>
       <w:r>
         <w:t xml:space="preserve">The seven cities use 545 native categories (527 distinct labels), from Richmond's nine broad groups to</w:t>
@@ -2098,7 +2075,6 @@
     <w:p>
       <w:pPr>
         <w:pStyle w:val="FirstParagraph"/>
-        <w:jc w:val="both"/>
       </w:pPr>
       <w:r>
         <w:rPr>
@@ -2117,7 +2093,6 @@
     <w:p>
       <w:pPr>
         <w:pStyle w:val="BodyText"/>
-        <w:jc w:val="both"/>
       </w:pPr>
       <w:r>
         <w:rPr>
@@ -2154,7 +2129,6 @@
     <w:p>
       <w:pPr>
         <w:pStyle w:val="BodyText"/>
-        <w:jc w:val="both"/>
       </w:pPr>
       <w:r>
         <w:rPr>
@@ -2213,7 +2187,6 @@
     <w:p>
       <w:pPr>
         <w:pStyle w:val="BodyText"/>
-        <w:jc w:val="both"/>
       </w:pPr>
       <w:r>
         <w:rPr>
@@ -2268,7 +2241,6 @@
     <w:p>
       <w:pPr>
         <w:pStyle w:val="BodyText"/>
-        <w:jc w:val="both"/>
       </w:pPr>
       <w:r>
         <w:rPr>
@@ -2642,7 +2614,7 @@
               <w:jc w:val="left"/>
             </w:pPr>
             <w:r>
-              <w:t xml:space="preserve">—</w:t>
+              <w:t xml:space="preserve">–</w:t>
             </w:r>
           </w:p>
         </w:tc>
@@ -2666,7 +2638,7 @@
               <w:jc w:val="left"/>
             </w:pPr>
             <w:r>
-              <w:t xml:space="preserve">—</w:t>
+              <w:t xml:space="preserve">–</w:t>
             </w:r>
           </w:p>
         </w:tc>
@@ -2704,7 +2676,7 @@
               <w:jc w:val="left"/>
             </w:pPr>
             <w:r>
-              <w:t xml:space="preserve">—</w:t>
+              <w:t xml:space="preserve">–</w:t>
             </w:r>
           </w:p>
         </w:tc>
@@ -2728,7 +2700,7 @@
               <w:jc w:val="left"/>
             </w:pPr>
             <w:r>
-              <w:t xml:space="preserve">—</w:t>
+              <w:t xml:space="preserve">–</w:t>
             </w:r>
           </w:p>
         </w:tc>
@@ -2749,7 +2721,6 @@
     <w:p>
       <w:pPr>
         <w:pStyle w:val="BodyText"/>
-        <w:jc w:val="both"/>
       </w:pPr>
       <w:r>
         <w:t xml:space="preserve">Table 2. Pooled macro-F1 [95% CI] on the frozen test set. Cross-city refers to LOCO for the</w:t>
@@ -2776,7 +2747,6 @@
     <w:p>
       <w:pPr>
         <w:pStyle w:val="BodyText"/>
-        <w:jc w:val="both"/>
       </w:pPr>
       <w:r>
         <w:t xml:space="preserve">Two results are stable across models. Crossing city boundaries costs roughly a third of macro-F1, from 0.827</w:t>
@@ -2845,7 +2815,13 @@
         <w:t xml:space="preserve"> </w:t>
       </w:r>
       <w:r>
-        <w:t xml:space="preserve">(single-source versus multi-source training confounds this cell; a full transfer matrix is future work).</w:t>
+        <w:t xml:space="preserve">(single-source versus multi-source training confounds this cell; the full 7×7 single-source matrix is</w:t>
+      </w:r>
+      <w:r>
+        <w:t xml:space="preserve"> </w:t>
+      </w:r>
+      <w:r>
+        <w:t xml:space="preserve">Figure 5, analyzed in Section 7).</w:t>
       </w:r>
       <w:r>
         <w:t xml:space="preserve"> </w:t>
@@ -2863,7 +2839,6 @@
     <w:p>
       <w:pPr>
         <w:pStyle w:val="BodyText"/>
-        <w:jc w:val="both"/>
       </w:pPr>
       <w:r>
         <w:t xml:space="preserve">To ask what drives the LLM's cross-jurisdiction advantage, we vary the model and the prompt. A stronger</w:t>
@@ -2920,7 +2895,6 @@
     <w:p>
       <w:pPr>
         <w:pStyle w:val="BodyText"/>
-        <w:jc w:val="both"/>
       </w:pPr>
       <w:r>
         <w:t xml:space="preserve">We also widen the model families. A stronger encoder does not help transfer: fine-tuned RoBERTa reaches</w:t>
@@ -2980,7 +2954,6 @@
     <w:p>
       <w:pPr>
         <w:pStyle w:val="FirstParagraph"/>
-        <w:jc w:val="both"/>
       </w:pPr>
       <w:r>
         <w:t xml:space="preserve">Three checks indicate the gap is genuine domain shift rather than an artifact of the split or the taxonomy.</w:t>
@@ -3069,25 +3042,31 @@
         <w:t xml:space="preserve"> </w:t>
       </w:r>
       <w:r>
-        <w:t xml:space="preserve">for the four cities that carry timestamps, training on the earliest 80% of requests and testing on the latest</w:t>
-      </w:r>
-      <w:r>
-        <w:t xml:space="preserve"> </w:t>
-      </w:r>
-      <w:r>
-        <w:t xml:space="preserve">20% yields in-city macro-F1 within 0.01 of a random split on average (0.753 versus 0.764), so random splitting</w:t>
-      </w:r>
-      <w:r>
-        <w:t xml:space="preserve"> </w:t>
-      </w:r>
-      <w:r>
-        <w:t xml:space="preserve">does not materially inflate in-city performance; the remaining three cities lack usable timestamps, a</w:t>
-      </w:r>
-      <w:r>
-        <w:t xml:space="preserve"> </w:t>
-      </w:r>
-      <w:r>
-        <w:t xml:space="preserve">limitation of the collection.</w:t>
+        <w:t xml:space="preserve">for all seven cities, pulling each city's records ordered by its native creation timestamp, training on the</w:t>
+      </w:r>
+      <w:r>
+        <w:t xml:space="preserve"> </w:t>
+      </w:r>
+      <w:r>
+        <w:t xml:space="preserve">earliest 80% of requests and testing on the latest 20% lowers in-city macro-F1 by 0.051 on average (0.740</w:t>
+      </w:r>
+      <w:r>
+        <w:t xml:space="preserve"> </w:t>
+      </w:r>
+      <w:r>
+        <w:t xml:space="preserve">versus 0.791 for a random split on the same rows), with the largest single-city drop 0.12 (Honolulu). This</w:t>
+      </w:r>
+      <w:r>
+        <w:t xml:space="preserve"> </w:t>
+      </w:r>
+      <w:r>
+        <w:t xml:space="preserve">temporal degradation is real but roughly five times smaller than the cross-jurisdiction gap, so the transfer</w:t>
+      </w:r>
+      <w:r>
+        <w:t xml:space="preserve"> </w:t>
+      </w:r>
+      <w:r>
+        <w:t xml:space="preserve">gap is not an artifact of random splitting.</w:t>
       </w:r>
       <w:r>
         <w:t xml:space="preserve"> </w:t>
@@ -3127,7 +3106,6 @@
     <w:p>
       <w:pPr>
         <w:pStyle w:val="BodyText"/>
-        <w:jc w:val="both"/>
       </w:pPr>
       <w:r>
         <w:t xml:space="preserve">Performance varies sharply across held-out cities (Figure 4), from the degenerate San Francisco split</w:t>
@@ -3296,7 +3274,6 @@
     <w:p>
       <w:pPr>
         <w:pStyle w:val="BodyText"/>
-        <w:jc w:val="both"/>
       </w:pPr>
       <w:r>
         <w:t xml:space="preserve">The full city-to-city matrix (Figure 5) makes the multi-source benefit concrete: training on a single</w:t>
@@ -3329,7 +3306,6 @@
     <w:p>
       <w:pPr>
         <w:pStyle w:val="BodyText"/>
-        <w:jc w:val="both"/>
       </w:pPr>
       <w:r>
         <w:t xml:space="preserve">Across the 42 city pairs, transfer difficulty is predicted by distributional distance rather than channel.</w:t>
@@ -3373,7 +3349,6 @@
     <w:p>
       <w:pPr>
         <w:pStyle w:val="FirstParagraph"/>
-        <w:jc w:val="both"/>
       </w:pPr>
       <w:r>
         <w:t xml:space="preserve">A large drop is a strong claim, so we ask how much of the gap is genuine model failure. An independent LLM</w:t>
@@ -3400,7 +3375,6 @@
     <w:p>
       <w:pPr>
         <w:pStyle w:val="BodyText"/>
-        <w:jc w:val="both"/>
       </w:pPr>
       <w:r>
         <w:t xml:space="preserve">The judge also disagrees with the city's own label on 14.3% of requests (from 5.6% in San Francisco to 20%</w:t>
@@ -3510,7 +3484,6 @@
     <w:p>
       <w:pPr>
         <w:pStyle w:val="BodyText"/>
-        <w:jc w:val="both"/>
       </w:pPr>
       <w:r>
         <w:t xml:space="preserve">The acceptable-set judgment is defined per example, so this analysis uses accuracy rather than macro-F1.</w:t>
@@ -3674,7 +3647,6 @@
     <w:p>
       <w:pPr>
         <w:pStyle w:val="BodyText"/>
-        <w:jc w:val="both"/>
       </w:pPr>
       <w:r>
         <w:t xml:space="preserve">The dominant confusions are exactly the service-versus-content boundaries a text model cannot be expected</w:t>
@@ -3732,7 +3704,6 @@
     <w:p>
       <w:pPr>
         <w:pStyle w:val="FirstParagraph"/>
-        <w:jc w:val="both"/>
       </w:pPr>
       <w:r>
         <w:t xml:space="preserve">For civic-technology deployment, the result is a caution and an option. Across the seven jurisdictions</w:t>
@@ -3771,7 +3742,6 @@
     <w:p>
       <w:pPr>
         <w:pStyle w:val="BodyText"/>
-        <w:jc w:val="both"/>
       </w:pPr>
       <w:r>
         <w:t xml:space="preserve">For benchmark builders, the broader lesson is that harmonizing labels across sources imports noise and</w:t>
@@ -3808,7 +3778,6 @@
     <w:p>
       <w:pPr>
         <w:pStyle w:val="FirstParagraph"/>
-        <w:jc w:val="both"/>
       </w:pPr>
       <w:r>
         <w:t xml:space="preserve">The corpus covers seven cities, weighted toward small and mid-size municipalities where free text is openly</w:t>
@@ -3911,7 +3880,6 @@
     <w:p>
       <w:pPr>
         <w:pStyle w:val="FirstParagraph"/>
-        <w:jc w:val="both"/>
       </w:pPr>
       <w:r>
         <w:t xml:space="preserve">311 requests are public records, but their free text contains personal data: street addresses,</w:t>
@@ -3972,7 +3940,6 @@
     <w:p>
       <w:pPr>
         <w:pStyle w:val="FirstParagraph"/>
-        <w:jc w:val="both"/>
       </w:pPr>
       <w:r>
         <w:t xml:space="preserve">The code, the harmonized data, the mapping file, the frozen split, the per-example predictions for every</w:t>
@@ -4118,7 +4085,6 @@
     <w:p>
       <w:pPr>
         <w:pStyle w:val="FirstParagraph"/>
-        <w:jc w:val="both"/>
       </w:pPr>
       <w:r>
         <w:t xml:space="preserve">We built the first public multi-city free-text 311 benchmark and used it to measure cross-jurisdiction</w:t>
@@ -4155,9 +4121,6 @@
       </w:r>
     </w:p>
     <w:p>
-      <w:pPr>
-        <w:jc w:val="both"/>
-      </w:pPr>
       <w:r>
         <w:pict>
           <v:rect style="width:0;height:1.5pt" o:hralign="center" o:hrstd="t" o:hr="t"/>
@@ -4497,7 +4460,7 @@
       </w:pPr>
       <w:bookmarkStart w:id="78" w:name="r14"/>
       <w:r>
-        <w:t xml:space="preserve">Ramponi, A., &amp; Plank, B. (2020). Neural Unsupervised Domain Adaptation in NLP—A Survey.</w:t>
+        <w:t xml:space="preserve">Ramponi, A., &amp; Plank, B. (2020). Neural Unsupervised Domain Adaptation in NLP: A Survey.</w:t>
       </w:r>
       <w:r>
         <w:t xml:space="preserve"> </w:t>
@@ -4787,7 +4750,6 @@
     <w:p>
       <w:pPr>
         <w:pStyle w:val="FirstParagraph"/>
-        <w:jc w:val="both"/>
       </w:pPr>
       <w:r>
         <w:t xml:space="preserve">Working paper. Every reported number is regenerated from the released predictions and</w:t>
@@ -5102,7 +5064,8 @@
     <w:name w:val="Normal"/>
     <w:qFormat/>
     <w:rPr>
-      <w:rFonts w:ascii="Georgia" w:hAnsi="Georgia" w:cs="Georgia"/>
+      <w:rFonts w:ascii="Georgia" w:hAnsi="Georgia"/>
+      <w:sz w:val="21"/>
     </w:rPr>
   </w:style>
   <w:style w:styleId="BodyText" w:type="paragraph">
@@ -5113,18 +5076,12 @@
     <w:pPr>
       <w:spacing w:after="180" w:before="180"/>
     </w:pPr>
-    <w:rPr>
-      <w:rFonts w:ascii="Georgia" w:hAnsi="Georgia" w:cs="Georgia"/>
-    </w:rPr>
   </w:style>
   <w:style w:customStyle="1" w:styleId="FirstParagraph" w:type="paragraph">
     <w:name w:val="First Paragraph"/>
     <w:basedOn w:val="BodyText"/>
     <w:next w:val="BodyText"/>
     <w:qFormat/>
-    <w:rPr>
-      <w:rFonts w:ascii="Georgia" w:hAnsi="Georgia" w:cs="Georgia"/>
-    </w:rPr>
   </w:style>
   <w:style w:customStyle="1" w:styleId="Compact" w:type="paragraph">
     <w:name w:val="Compact"/>
@@ -5133,9 +5090,6 @@
     <w:pPr>
       <w:spacing w:after="36" w:before="36"/>
     </w:pPr>
-    <w:rPr>
-      <w:rFonts w:ascii="Georgia" w:hAnsi="Georgia" w:cs="Georgia"/>
-    </w:rPr>
   </w:style>
   <w:style w:styleId="Title" w:type="paragraph">
     <w:name w:val="Title"/>
@@ -5149,7 +5103,7 @@
       <w:jc w:val="center"/>
     </w:pPr>
     <w:rPr>
-      <w:rFonts w:asciiTheme="majorHAnsi" w:cstheme="majorBidi" w:eastAsiaTheme="majorEastAsia" w:hAnsiTheme="majorHAnsi" w:ascii="Georgia" w:hAnsi="Georgia" w:cs="Georgia"/>
+      <w:rFonts w:asciiTheme="majorHAnsi" w:cstheme="majorBidi" w:eastAsiaTheme="majorEastAsia" w:hAnsiTheme="majorHAnsi"/>
       <w:b/>
       <w:bCs/>
       <w:color w:themeColor="accent1" w:themeShade="B5" w:val="345A8A"/>
@@ -5169,7 +5123,6 @@
       <w:jc w:val="center"/>
     </w:pPr>
     <w:rPr>
-      <w:rFonts w:ascii="Georgia" w:hAnsi="Georgia" w:cs="Georgia"/>
       <w:sz w:val="30"/>
       <w:szCs w:val="30"/>
     </w:rPr>
@@ -5183,9 +5136,6 @@
       <w:keepLines/>
       <w:jc w:val="center"/>
     </w:pPr>
-    <w:rPr>
-      <w:rFonts w:ascii="Georgia" w:hAnsi="Georgia" w:cs="Georgia"/>
-    </w:rPr>
   </w:style>
   <w:style w:styleId="Date" w:type="paragraph">
     <w:name w:val="Date"/>
@@ -5196,9 +5146,6 @@
       <w:keepLines/>
       <w:jc w:val="center"/>
     </w:pPr>
-    <w:rPr>
-      <w:rFonts w:ascii="Georgia" w:hAnsi="Georgia" w:cs="Georgia"/>
-    </w:rPr>
   </w:style>
   <w:style w:customStyle="1" w:styleId="AbstractTitle" w:type="paragraph">
     <w:name w:val="Abstract Title"/>
@@ -5212,7 +5159,6 @@
       <w:jc w:val="center"/>
     </w:pPr>
     <w:rPr>
-      <w:rFonts w:ascii="Georgia" w:hAnsi="Georgia" w:cs="Georgia"/>
       <w:b/>
       <w:color w:val="345A8A"/>
       <w:sz w:val="20"/>
@@ -5230,7 +5176,6 @@
       <w:spacing w:after="300" w:before="100"/>
     </w:pPr>
     <w:rPr>
-      <w:rFonts w:ascii="Georgia" w:hAnsi="Georgia" w:cs="Georgia"/>
       <w:sz w:val="20"/>
       <w:szCs w:val="20"/>
     </w:rPr>
@@ -5241,9 +5186,7 @@
     <w:next w:val="Bibliography"/>
     <w:qFormat/>
     <w:pPr/>
-    <w:rPr>
-      <w:rFonts w:ascii="Georgia" w:hAnsi="Georgia" w:cs="Georgia"/>
-    </w:rPr>
+    <w:rPr/>
   </w:style>
   <w:style w:styleId="Heading1" w:type="paragraph">
     <w:name w:val="Heading 1"/>
@@ -5258,7 +5201,7 @@
       <w:outlineLvl w:val="0"/>
     </w:pPr>
     <w:rPr>
-      <w:rFonts w:asciiTheme="majorHAnsi" w:cstheme="majorBidi" w:eastAsiaTheme="majorEastAsia" w:hAnsiTheme="majorHAnsi" w:ascii="Georgia" w:hAnsi="Georgia" w:cs="Georgia"/>
+      <w:rFonts w:asciiTheme="majorHAnsi" w:cstheme="majorBidi" w:eastAsiaTheme="majorEastAsia" w:hAnsiTheme="majorHAnsi"/>
       <w:b/>
       <w:bCs/>
       <w:color w:themeColor="accent1" w:val="4F81BD"/>
@@ -5280,7 +5223,7 @@
       <w:outlineLvl w:val="1"/>
     </w:pPr>
     <w:rPr>
-      <w:rFonts w:asciiTheme="majorHAnsi" w:cstheme="majorBidi" w:eastAsiaTheme="majorEastAsia" w:hAnsiTheme="majorHAnsi" w:ascii="Georgia" w:hAnsi="Georgia" w:cs="Georgia"/>
+      <w:rFonts w:asciiTheme="majorHAnsi" w:cstheme="majorBidi" w:eastAsiaTheme="majorEastAsia" w:hAnsiTheme="majorHAnsi"/>
       <w:b/>
       <w:bCs/>
       <w:color w:themeColor="accent1" w:val="4F81BD"/>
@@ -5302,7 +5245,7 @@
       <w:outlineLvl w:val="2"/>
     </w:pPr>
     <w:rPr>
-      <w:rFonts w:asciiTheme="majorHAnsi" w:cstheme="majorBidi" w:eastAsiaTheme="majorEastAsia" w:hAnsiTheme="majorHAnsi" w:ascii="Georgia" w:hAnsi="Georgia" w:cs="Georgia"/>
+      <w:rFonts w:asciiTheme="majorHAnsi" w:cstheme="majorBidi" w:eastAsiaTheme="majorEastAsia" w:hAnsiTheme="majorHAnsi"/>
       <w:b/>
       <w:bCs/>
       <w:color w:themeColor="accent1" w:val="4F81BD"/>
@@ -5324,7 +5267,7 @@
       <w:outlineLvl w:val="3"/>
     </w:pPr>
     <w:rPr>
-      <w:rFonts w:asciiTheme="majorHAnsi" w:cstheme="majorBidi" w:eastAsiaTheme="majorEastAsia" w:hAnsiTheme="majorHAnsi" w:ascii="Georgia" w:hAnsi="Georgia" w:cs="Georgia"/>
+      <w:rFonts w:asciiTheme="majorHAnsi" w:cstheme="majorBidi" w:eastAsiaTheme="majorEastAsia" w:hAnsiTheme="majorHAnsi"/>
       <w:bCs/>
       <w:i/>
       <w:color w:themeColor="accent1" w:val="4F81BD"/>
@@ -5346,7 +5289,7 @@
       <w:outlineLvl w:val="4"/>
     </w:pPr>
     <w:rPr>
-      <w:rFonts w:asciiTheme="majorHAnsi" w:cstheme="majorBidi" w:eastAsiaTheme="majorEastAsia" w:hAnsiTheme="majorHAnsi" w:ascii="Georgia" w:hAnsi="Georgia" w:cs="Georgia"/>
+      <w:rFonts w:asciiTheme="majorHAnsi" w:cstheme="majorBidi" w:eastAsiaTheme="majorEastAsia" w:hAnsiTheme="majorHAnsi"/>
       <w:iCs/>
       <w:color w:themeColor="accent1" w:val="4F81BD"/>
       <w:sz w:val="24"/>
@@ -5367,7 +5310,7 @@
       <w:outlineLvl w:val="5"/>
     </w:pPr>
     <w:rPr>
-      <w:rFonts w:asciiTheme="majorHAnsi" w:cstheme="majorBidi" w:eastAsiaTheme="majorEastAsia" w:hAnsiTheme="majorHAnsi" w:ascii="Georgia" w:hAnsi="Georgia" w:cs="Georgia"/>
+      <w:rFonts w:asciiTheme="majorHAnsi" w:cstheme="majorBidi" w:eastAsiaTheme="majorEastAsia" w:hAnsiTheme="majorHAnsi"/>
       <w:color w:themeColor="accent1" w:val="4F81BD"/>
       <w:sz w:val="24"/>
       <w:szCs w:val="24"/>
@@ -5387,7 +5330,7 @@
       <w:outlineLvl w:val="6"/>
     </w:pPr>
     <w:rPr>
-      <w:rFonts w:asciiTheme="majorHAnsi" w:cstheme="majorBidi" w:eastAsiaTheme="majorEastAsia" w:hAnsiTheme="majorHAnsi" w:ascii="Georgia" w:hAnsi="Georgia" w:cs="Georgia"/>
+      <w:rFonts w:asciiTheme="majorHAnsi" w:cstheme="majorBidi" w:eastAsiaTheme="majorEastAsia" w:hAnsiTheme="majorHAnsi"/>
       <w:color w:themeColor="accent1" w:val="4F81BD"/>
       <w:sz w:val="24"/>
       <w:szCs w:val="24"/>
@@ -5407,7 +5350,7 @@
       <w:outlineLvl w:val="7"/>
     </w:pPr>
     <w:rPr>
-      <w:rFonts w:asciiTheme="majorHAnsi" w:cstheme="majorBidi" w:eastAsiaTheme="majorEastAsia" w:hAnsiTheme="majorHAnsi" w:ascii="Georgia" w:hAnsi="Georgia" w:cs="Georgia"/>
+      <w:rFonts w:asciiTheme="majorHAnsi" w:cstheme="majorBidi" w:eastAsiaTheme="majorEastAsia" w:hAnsiTheme="majorHAnsi"/>
       <w:color w:themeColor="accent1" w:val="4F81BD"/>
       <w:sz w:val="24"/>
       <w:szCs w:val="24"/>
@@ -5427,7 +5370,7 @@
       <w:outlineLvl w:val="8"/>
     </w:pPr>
     <w:rPr>
-      <w:rFonts w:asciiTheme="majorHAnsi" w:cstheme="majorBidi" w:eastAsiaTheme="majorEastAsia" w:hAnsiTheme="majorHAnsi" w:ascii="Georgia" w:hAnsi="Georgia" w:cs="Georgia"/>
+      <w:rFonts w:asciiTheme="majorHAnsi" w:cstheme="majorBidi" w:eastAsiaTheme="majorEastAsia" w:hAnsiTheme="majorHAnsi"/>
       <w:color w:themeColor="accent1" w:val="4F81BD"/>
       <w:sz w:val="24"/>
       <w:szCs w:val="24"/>
@@ -5444,9 +5387,6 @@
       <w:spacing w:after="100" w:before="100"/>
       <w:ind w:firstLine="0" w:left="480" w:right="480"/>
     </w:pPr>
-    <w:rPr>
-      <w:rFonts w:ascii="Georgia" w:hAnsi="Georgia" w:cs="Georgia"/>
-    </w:rPr>
   </w:style>
   <w:style w:styleId="FootnoteText" w:type="paragraph">
     <w:name w:val="Footnote Text"/>
@@ -5455,9 +5395,6 @@
     <w:uiPriority w:val="9"/>
     <w:unhideWhenUsed/>
     <w:qFormat/>
-    <w:rPr>
-      <w:rFonts w:ascii="Georgia" w:hAnsi="Georgia" w:cs="Georgia"/>
-    </w:rPr>
   </w:style>
   <w:style w:styleId="FootnoteBlockText" w:type="paragraph">
     <w:name w:val="Footnote Block Text"/>
@@ -5470,17 +5407,11 @@
       <w:spacing w:after="100" w:before="100"/>
       <w:ind w:firstLine="0" w:left="480" w:right="480"/>
     </w:pPr>
-    <w:rPr>
-      <w:rFonts w:ascii="Georgia" w:hAnsi="Georgia" w:cs="Georgia"/>
-    </w:rPr>
   </w:style>
   <w:style w:default="1" w:styleId="DefaultParagraphFont" w:type="character">
     <w:name w:val="Default Paragraph Font"/>
     <w:semiHidden/>
     <w:unhideWhenUsed/>
-    <w:rPr>
-      <w:rFonts w:ascii="Georgia" w:hAnsi="Georgia" w:cs="Georgia"/>
-    </w:rPr>
   </w:style>
   <w:style w:default="1" w:styleId="Table" w:type="table">
     <w:name w:val="Table"/>
@@ -5488,9 +5419,6 @@
     <w:semiHidden/>
     <w:unhideWhenUsed/>
     <w:qFormat/>
-    <w:rPr>
-      <w:rFonts w:ascii="Georgia" w:hAnsi="Georgia" w:cs="Georgia"/>
-    </w:rPr>
     <w:tblPr>
       <w:tblInd w:type="dxa" w:w="0"/>
       <w:tblCellMar>
@@ -5526,16 +5454,12 @@
       <w:spacing w:after="0"/>
     </w:pPr>
     <w:rPr>
-      <w:rFonts w:ascii="Georgia" w:hAnsi="Georgia" w:cs="Georgia"/>
       <w:b/>
     </w:rPr>
   </w:style>
   <w:style w:customStyle="1" w:styleId="Definition" w:type="paragraph">
     <w:name w:val="Definition"/>
     <w:basedOn w:val="Normal"/>
-    <w:rPr>
-      <w:rFonts w:ascii="Georgia" w:hAnsi="Georgia" w:cs="Georgia"/>
-    </w:rPr>
   </w:style>
   <w:style w:styleId="Caption" w:type="paragraph">
     <w:name w:val="Caption"/>
@@ -5545,7 +5469,6 @@
       <w:spacing w:after="120" w:before="0"/>
     </w:pPr>
     <w:rPr>
-      <w:rFonts w:ascii="Georgia" w:hAnsi="Georgia" w:cs="Georgia"/>
       <w:i/>
     </w:rPr>
   </w:style>
@@ -5555,23 +5478,14 @@
     <w:pPr>
       <w:keepNext/>
     </w:pPr>
-    <w:rPr>
-      <w:rFonts w:ascii="Georgia" w:hAnsi="Georgia" w:cs="Georgia"/>
-    </w:rPr>
   </w:style>
   <w:style w:customStyle="1" w:styleId="ImageCaption" w:type="paragraph">
     <w:name w:val="Image Caption"/>
     <w:basedOn w:val="Caption"/>
-    <w:rPr>
-      <w:rFonts w:ascii="Georgia" w:hAnsi="Georgia" w:cs="Georgia"/>
-    </w:rPr>
   </w:style>
   <w:style w:customStyle="1" w:styleId="Figure" w:type="paragraph">
     <w:name w:val="Figure"/>
     <w:basedOn w:val="Normal"/>
-    <w:rPr>
-      <w:rFonts w:ascii="Georgia" w:hAnsi="Georgia" w:cs="Georgia"/>
-    </w:rPr>
   </w:style>
   <w:style w:customStyle="1" w:styleId="CaptionedFigure" w:type="paragraph">
     <w:name w:val="Captioned Figure"/>
@@ -5579,38 +5493,28 @@
     <w:pPr>
       <w:keepNext/>
     </w:pPr>
-    <w:rPr>
-      <w:rFonts w:ascii="Georgia" w:hAnsi="Georgia" w:cs="Georgia"/>
-    </w:rPr>
   </w:style>
   <w:style w:customStyle="1" w:styleId="BodyTextChar" w:type="character">
     <w:name w:val="Body Text Char"/>
     <w:basedOn w:val="DefaultParagraphFont"/>
     <w:link w:val="BodyText"/>
-    <w:rPr>
-      <w:rFonts w:ascii="Georgia" w:hAnsi="Georgia" w:cs="Georgia"/>
-    </w:rPr>
   </w:style>
   <w:style w:customStyle="1" w:styleId="VerbatimChar" w:type="character">
     <w:name w:val="Verbatim Char"/>
     <w:basedOn w:val="BodyTextChar"/>
     <w:rPr>
-      <w:rFonts w:ascii="Georgia" w:hAnsi="Georgia" w:cs="Georgia"/>
+      <w:rFonts w:ascii="Consolas" w:hAnsi="Consolas"/>
       <w:sz w:val="22"/>
     </w:rPr>
   </w:style>
   <w:style w:customStyle="1" w:styleId="SectionNumber" w:type="character">
     <w:name w:val="Section Number"/>
     <w:basedOn w:val="BodyTextChar"/>
-    <w:rPr>
-      <w:rFonts w:ascii="Georgia" w:hAnsi="Georgia" w:cs="Georgia"/>
-    </w:rPr>
   </w:style>
   <w:style w:styleId="FootnoteReference" w:type="character">
     <w:name w:val="Footnote Reference"/>
     <w:basedOn w:val="BodyTextChar"/>
     <w:rPr>
-      <w:rFonts w:ascii="Georgia" w:hAnsi="Georgia" w:cs="Georgia"/>
       <w:vertAlign w:val="superscript"/>
     </w:rPr>
   </w:style>
@@ -5618,7 +5522,6 @@
     <w:name w:val="Hyperlink"/>
     <w:basedOn w:val="BodyTextChar"/>
     <w:rPr>
-      <w:rFonts w:ascii="Georgia" w:hAnsi="Georgia" w:cs="Georgia"/>
       <w:color w:themeColor="accent1" w:val="4F81BD"/>
     </w:rPr>
   </w:style>
@@ -5634,7 +5537,7 @@
       <w:outlineLvl w:val="9"/>
     </w:pPr>
     <w:rPr>
-      <w:rFonts w:asciiTheme="majorHAnsi" w:cstheme="majorBidi" w:eastAsiaTheme="majorEastAsia" w:hAnsiTheme="majorHAnsi" w:ascii="Georgia" w:hAnsi="Georgia" w:cs="Georgia"/>
+      <w:rFonts w:asciiTheme="majorHAnsi" w:cstheme="majorBidi" w:eastAsiaTheme="majorEastAsia" w:hAnsiTheme="majorHAnsi"/>
       <w:b w:val="0"/>
       <w:bCs w:val="0"/>
       <w:color w:themeColor="accent1" w:themeShade="BF" w:val="365F91"/>
@@ -5647,15 +5550,11 @@
     <w:pPr>
       <w:wordWrap w:val="off"/>
     </w:pPr>
-    <w:rPr>
-      <w:rFonts w:ascii="Georgia" w:hAnsi="Georgia" w:cs="Georgia"/>
-    </w:rPr>
   </w:style>
   <w:style w:type="character" w:customStyle="1" w:styleId="KeywordTok">
     <w:name w:val="KeywordTok"/>
     <w:basedOn w:val="VerbatimChar"/>
     <w:rPr>
-      <w:rFonts w:ascii="Georgia" w:hAnsi="Georgia" w:cs="Georgia"/>
       <w:b/>
       <w:color w:val="007020"/>
     </w:rPr>
@@ -5664,7 +5563,6 @@
     <w:name w:val="DataTypeTok"/>
     <w:basedOn w:val="VerbatimChar"/>
     <w:rPr>
-      <w:rFonts w:ascii="Georgia" w:hAnsi="Georgia" w:cs="Georgia"/>
       <w:color w:val="902000"/>
     </w:rPr>
   </w:style>
@@ -5672,7 +5570,6 @@
     <w:name w:val="DecValTok"/>
     <w:basedOn w:val="VerbatimChar"/>
     <w:rPr>
-      <w:rFonts w:ascii="Georgia" w:hAnsi="Georgia" w:cs="Georgia"/>
       <w:color w:val="40a070"/>
     </w:rPr>
   </w:style>
@@ -5680,7 +5577,6 @@
     <w:name w:val="BaseNTok"/>
     <w:basedOn w:val="VerbatimChar"/>
     <w:rPr>
-      <w:rFonts w:ascii="Georgia" w:hAnsi="Georgia" w:cs="Georgia"/>
       <w:color w:val="40a070"/>
     </w:rPr>
   </w:style>
@@ -5688,7 +5584,6 @@
     <w:name w:val="FloatTok"/>
     <w:basedOn w:val="VerbatimChar"/>
     <w:rPr>
-      <w:rFonts w:ascii="Georgia" w:hAnsi="Georgia" w:cs="Georgia"/>
       <w:color w:val="40a070"/>
     </w:rPr>
   </w:style>
@@ -5696,7 +5591,6 @@
     <w:name w:val="ConstantTok"/>
     <w:basedOn w:val="VerbatimChar"/>
     <w:rPr>
-      <w:rFonts w:ascii="Georgia" w:hAnsi="Georgia" w:cs="Georgia"/>
       <w:color w:val="880000"/>
     </w:rPr>
   </w:style>
@@ -5704,7 +5598,6 @@
     <w:name w:val="CharTok"/>
     <w:basedOn w:val="VerbatimChar"/>
     <w:rPr>
-      <w:rFonts w:ascii="Georgia" w:hAnsi="Georgia" w:cs="Georgia"/>
       <w:color w:val="4070a0"/>
     </w:rPr>
   </w:style>
@@ -5712,7 +5605,6 @@
     <w:name w:val="SpecialCharTok"/>
     <w:basedOn w:val="VerbatimChar"/>
     <w:rPr>
-      <w:rFonts w:ascii="Georgia" w:hAnsi="Georgia" w:cs="Georgia"/>
       <w:color w:val="4070a0"/>
     </w:rPr>
   </w:style>
@@ -5720,7 +5612,6 @@
     <w:name w:val="StringTok"/>
     <w:basedOn w:val="VerbatimChar"/>
     <w:rPr>
-      <w:rFonts w:ascii="Georgia" w:hAnsi="Georgia" w:cs="Georgia"/>
       <w:color w:val="4070a0"/>
     </w:rPr>
   </w:style>
@@ -5728,7 +5619,6 @@
     <w:name w:val="VerbatimStringTok"/>
     <w:basedOn w:val="VerbatimChar"/>
     <w:rPr>
-      <w:rFonts w:ascii="Georgia" w:hAnsi="Georgia" w:cs="Georgia"/>
       <w:color w:val="4070a0"/>
     </w:rPr>
   </w:style>
@@ -5736,7 +5626,6 @@
     <w:name w:val="SpecialStringTok"/>
     <w:basedOn w:val="VerbatimChar"/>
     <w:rPr>
-      <w:rFonts w:ascii="Georgia" w:hAnsi="Georgia" w:cs="Georgia"/>
       <w:color w:val="bb6688"/>
     </w:rPr>
   </w:style>
@@ -5744,7 +5633,6 @@
     <w:name w:val="ImportTok"/>
     <w:basedOn w:val="VerbatimChar"/>
     <w:rPr>
-      <w:rFonts w:ascii="Georgia" w:hAnsi="Georgia" w:cs="Georgia"/>
       <w:b/>
       <w:color w:val="008000"/>
     </w:rPr>
@@ -5753,7 +5641,6 @@
     <w:name w:val="CommentTok"/>
     <w:basedOn w:val="VerbatimChar"/>
     <w:rPr>
-      <w:rFonts w:ascii="Georgia" w:hAnsi="Georgia" w:cs="Georgia"/>
       <w:i/>
       <w:color w:val="60a0b0"/>
     </w:rPr>
@@ -5762,7 +5649,6 @@
     <w:name w:val="DocumentationTok"/>
     <w:basedOn w:val="VerbatimChar"/>
     <w:rPr>
-      <w:rFonts w:ascii="Georgia" w:hAnsi="Georgia" w:cs="Georgia"/>
       <w:i/>
       <w:color w:val="ba2121"/>
     </w:rPr>
@@ -5771,7 +5657,6 @@
     <w:name w:val="AnnotationTok"/>
     <w:basedOn w:val="VerbatimChar"/>
     <w:rPr>
-      <w:rFonts w:ascii="Georgia" w:hAnsi="Georgia" w:cs="Georgia"/>
       <w:b/>
       <w:i/>
       <w:color w:val="60a0b0"/>
@@ -5781,7 +5666,6 @@
     <w:name w:val="CommentVarTok"/>
     <w:basedOn w:val="VerbatimChar"/>
     <w:rPr>
-      <w:rFonts w:ascii="Georgia" w:hAnsi="Georgia" w:cs="Georgia"/>
       <w:b/>
       <w:i/>
       <w:color w:val="60a0b0"/>
@@ -5791,7 +5675,6 @@
     <w:name w:val="OtherTok"/>
     <w:basedOn w:val="VerbatimChar"/>
     <w:rPr>
-      <w:rFonts w:ascii="Georgia" w:hAnsi="Georgia" w:cs="Georgia"/>
       <w:color w:val="007020"/>
     </w:rPr>
   </w:style>
@@ -5799,7 +5682,6 @@
     <w:name w:val="FunctionTok"/>
     <w:basedOn w:val="VerbatimChar"/>
     <w:rPr>
-      <w:rFonts w:ascii="Georgia" w:hAnsi="Georgia" w:cs="Georgia"/>
       <w:color w:val="06287e"/>
     </w:rPr>
   </w:style>
@@ -5807,7 +5689,6 @@
     <w:name w:val="VariableTok"/>
     <w:basedOn w:val="VerbatimChar"/>
     <w:rPr>
-      <w:rFonts w:ascii="Georgia" w:hAnsi="Georgia" w:cs="Georgia"/>
       <w:color w:val="19177c"/>
     </w:rPr>
   </w:style>
@@ -5815,7 +5696,6 @@
     <w:name w:val="ControlFlowTok"/>
     <w:basedOn w:val="VerbatimChar"/>
     <w:rPr>
-      <w:rFonts w:ascii="Georgia" w:hAnsi="Georgia" w:cs="Georgia"/>
       <w:b/>
       <w:color w:val="007020"/>
     </w:rPr>
@@ -5824,7 +5704,6 @@
     <w:name w:val="OperatorTok"/>
     <w:basedOn w:val="VerbatimChar"/>
     <w:rPr>
-      <w:rFonts w:ascii="Georgia" w:hAnsi="Georgia" w:cs="Georgia"/>
       <w:color w:val="666666"/>
     </w:rPr>
   </w:style>
@@ -5832,22 +5711,18 @@
     <w:name w:val="BuiltInTok"/>
     <w:basedOn w:val="VerbatimChar"/>
     <w:rPr>
-      <w:rFonts w:ascii="Georgia" w:hAnsi="Georgia" w:cs="Georgia"/>
       <w:color w:val="008000"/>
     </w:rPr>
   </w:style>
   <w:style w:type="character" w:customStyle="1" w:styleId="ExtensionTok">
     <w:name w:val="ExtensionTok"/>
     <w:basedOn w:val="VerbatimChar"/>
-    <w:rPr>
-      <w:rFonts w:ascii="Georgia" w:hAnsi="Georgia" w:cs="Georgia"/>
-    </w:rPr>
+    <w:rPr/>
   </w:style>
   <w:style w:type="character" w:customStyle="1" w:styleId="PreprocessorTok">
     <w:name w:val="PreprocessorTok"/>
     <w:basedOn w:val="VerbatimChar"/>
     <w:rPr>
-      <w:rFonts w:ascii="Georgia" w:hAnsi="Georgia" w:cs="Georgia"/>
       <w:color w:val="bc7a00"/>
     </w:rPr>
   </w:style>
@@ -5855,22 +5730,18 @@
     <w:name w:val="AttributeTok"/>
     <w:basedOn w:val="VerbatimChar"/>
     <w:rPr>
-      <w:rFonts w:ascii="Georgia" w:hAnsi="Georgia" w:cs="Georgia"/>
       <w:color w:val="7d9029"/>
     </w:rPr>
   </w:style>
   <w:style w:type="character" w:customStyle="1" w:styleId="RegionMarkerTok">
     <w:name w:val="RegionMarkerTok"/>
     <w:basedOn w:val="VerbatimChar"/>
-    <w:rPr>
-      <w:rFonts w:ascii="Georgia" w:hAnsi="Georgia" w:cs="Georgia"/>
-    </w:rPr>
+    <w:rPr/>
   </w:style>
   <w:style w:type="character" w:customStyle="1" w:styleId="InformationTok">
     <w:name w:val="InformationTok"/>
     <w:basedOn w:val="VerbatimChar"/>
     <w:rPr>
-      <w:rFonts w:ascii="Georgia" w:hAnsi="Georgia" w:cs="Georgia"/>
       <w:b/>
       <w:i/>
       <w:color w:val="60a0b0"/>
@@ -5880,7 +5751,6 @@
     <w:name w:val="WarningTok"/>
     <w:basedOn w:val="VerbatimChar"/>
     <w:rPr>
-      <w:rFonts w:ascii="Georgia" w:hAnsi="Georgia" w:cs="Georgia"/>
       <w:b/>
       <w:i/>
       <w:color w:val="60a0b0"/>
@@ -5890,7 +5760,6 @@
     <w:name w:val="AlertTok"/>
     <w:basedOn w:val="VerbatimChar"/>
     <w:rPr>
-      <w:rFonts w:ascii="Georgia" w:hAnsi="Georgia" w:cs="Georgia"/>
       <w:b/>
       <w:color w:val="ff0000"/>
     </w:rPr>
@@ -5899,7 +5768,6 @@
     <w:name w:val="ErrorTok"/>
     <w:basedOn w:val="VerbatimChar"/>
     <w:rPr>
-      <w:rFonts w:ascii="Georgia" w:hAnsi="Georgia" w:cs="Georgia"/>
       <w:b/>
       <w:color w:val="ff0000"/>
     </w:rPr>
@@ -5907,9 +5775,7 @@
   <w:style w:type="character" w:customStyle="1" w:styleId="NormalTok">
     <w:name w:val="NormalTok"/>
     <w:basedOn w:val="VerbatimChar"/>
-    <w:rPr>
-      <w:rFonts w:ascii="Georgia" w:hAnsi="Georgia" w:cs="Georgia"/>
-    </w:rPr>
+    <w:rPr/>
   </w:style>
 </w:styles>
 </file>

</xml_diff>

<commit_message>
Add standalone harmonized cross-city database as a first-class contribution
- data/mc311_harmonized.csv: 156,416 rows, 7 cities, shared 14-class label space,
  columns city/source/native_category/harmonized_label/split/text (native label
  retained per row so the mapping travels with the data). A reusable cross-city
  resource independent of the transfer/protocol results.
- Named it explicitly in contribution 2; added to the Zenodo data package.

Co-Authored-By: Claude Opus 4.8 <noreply@anthropic.com>
</commit_message>
<xml_diff>
--- a/docs/paper.docx
+++ b/docs/paper.docx
@@ -447,19 +447,37 @@
         </w:numPr>
       </w:pPr>
       <w:r>
-        <w:t xml:space="preserve">MC311, to our knowledge the first public multi-city free-text 311 benchmark (seven US cities, ~156k</w:t>
-      </w:r>
-      <w:r>
-        <w:t xml:space="preserve"> </w:t>
-      </w:r>
-      <w:r>
-        <w:t xml:space="preserve">citizen narratives) with an auditable 14-class harmonization of 545 native categories and one frozen aligned</w:t>
-      </w:r>
-      <w:r>
-        <w:t xml:space="preserve"> </w:t>
-      </w:r>
-      <w:r>
-        <w:t xml:space="preserve">test set, together with a verified survey of which portals expose free text at all.</w:t>
+        <w:t xml:space="preserve">MC311, to our knowledge the first public multi-city free-text 311 resource: about 156,000 citizen</w:t>
+      </w:r>
+      <w:r>
+        <w:t xml:space="preserve"> </w:t>
+      </w:r>
+      <w:r>
+        <w:t xml:space="preserve">narratives from seven US cities, released as a single harmonized cross-city database in a shared 14-class label</w:t>
+      </w:r>
+      <w:r>
+        <w:t xml:space="preserve"> </w:t>
+      </w:r>
+      <w:r>
+        <w:t xml:space="preserve">space (each of 545 native categories mapped to a common class by an auditable rule set, with the native label</w:t>
+      </w:r>
+      <w:r>
+        <w:t xml:space="preserve"> </w:t>
+      </w:r>
+      <w:r>
+        <w:t xml:space="preserve">retained per row), plus one frozen aligned test split and a verified survey of which portals expose free text.</w:t>
+      </w:r>
+      <w:r>
+        <w:t xml:space="preserve"> </w:t>
+      </w:r>
+      <w:r>
+        <w:t xml:space="preserve">The harmonized common-label-space corpus is a reusable resource independent of the transfer and protocol</w:t>
+      </w:r>
+      <w:r>
+        <w:t xml:space="preserve"> </w:t>
+      </w:r>
+      <w:r>
+        <w:t xml:space="preserve">results below.</w:t>
       </w:r>
     </w:p>
     <w:p>

</xml_diff>

<commit_message>
Fold E1 training payoff into paper (scoped): judge-repaired labels improve transfer
Full E1 (7 folds, judge-relabeled training pools, DistilBERT on RunPod, $0.10):
- POOLED cross-city macro-F1 raw 0.559 -> judge-relabel 0.615 (+0.055, 95% CI
  [0.029,0.080]); vs random-relabel control +0.041 ([0.018,0.063]); judge beats
  random on 6/7 folds. Both CIs exclude zero.
- Honestly scoped: pooled/common-class effect, heterogeneous across cities
  (4/7 improve). Added as a new Section 7 subsection 'Repairing labels for
  training'; abstract, contributions, conclusion updated. results/e1_result.json.
- e1_full.py: partial-download support for cancelled batches (the 42.6k-row
  judge batch had a stuck 1% tail; cancelled + collected 99.96%).

wins-only scan: clean. Abstract <=280, no em-dashes. DOCX rebuilt.

Co-Authored-By: Claude Opus 4.8 <noreply@anthropic.com>
</commit_message>
<xml_diff>
--- a/docs/paper.docx
+++ b/docs/paper.docx
@@ -70,7 +70,7 @@
         <w:t xml:space="preserve">Classification</w:t>
       </w:r>
     </w:p>
-    <w:bookmarkStart w:id="91" w:name="Xd0ff751f9cc4ffed3c040c4067b835a612520f4"/>
+    <w:bookmarkStart w:id="92" w:name="Xd0ff751f9cc4ffed3c040c4067b835a612520f4"/>
     <w:p>
       <w:pPr>
         <w:pStyle w:val="Heading1"/>
@@ -250,25 +250,31 @@
         <w:t xml:space="preserve"> </w:t>
       </w:r>
       <w:r>
-        <w:t xml:space="preserve">annotators treat as interchangeable are the pairs models confuse (Spearman 0.75), and an ambiguity-derived</w:t>
-      </w:r>
-      <w:r>
-        <w:t xml:space="preserve"> </w:t>
-      </w:r>
-      <w:r>
-        <w:t xml:space="preserve">taxonomy removes more residual ambiguity than any equal-size random merge. Run as an audit, the same protocol</w:t>
-      </w:r>
-      <w:r>
-        <w:t xml:space="preserve"> </w:t>
-      </w:r>
-      <w:r>
-        <w:t xml:space="preserve">located five real mapping errors in the corpus. MC311 and the protocol are released so that other</w:t>
-      </w:r>
-      <w:r>
-        <w:t xml:space="preserve"> </w:t>
-      </w:r>
-      <w:r>
-        <w:t xml:space="preserve">administrative-label benchmarks can measure the distance between their labels and their text.</w:t>
+        <w:t xml:space="preserve">annotators treat as interchangeable are the pairs models confuse (Spearman 0.75). Used as a training</w:t>
+      </w:r>
+      <w:r>
+        <w:t xml:space="preserve"> </w:t>
+      </w:r>
+      <w:r>
+        <w:t xml:space="preserve">signal, the protocol improves pooled cross-jurisdiction transfer: relabeling judge-rejected rows lifts macro-F1</w:t>
+      </w:r>
+      <w:r>
+        <w:t xml:space="preserve"> </w:t>
+      </w:r>
+      <w:r>
+        <w:t xml:space="preserve">by 0.055 over raw labels and 0.041 over a random-relabel control (95% CIs exclude zero). Run as an audit, it</w:t>
+      </w:r>
+      <w:r>
+        <w:t xml:space="preserve"> </w:t>
+      </w:r>
+      <w:r>
+        <w:t xml:space="preserve">located five real mapping errors in the corpus. MC311 and the protocol are released so other</w:t>
+      </w:r>
+      <w:r>
+        <w:t xml:space="preserve"> </w:t>
+      </w:r>
+      <w:r>
+        <w:t xml:space="preserve">administrative-label benchmarks can measure the label-text gap.</w:t>
       </w:r>
     </w:p>
     <w:bookmarkEnd w:id="22"/>
@@ -495,13 +501,25 @@
         <w:t xml:space="preserve"> </w:t>
       </w:r>
       <w:r>
-        <w:t xml:space="preserve">text, 91% of the strongest model's cross-city errors are judge-defensible, and a significant strict-accuracy gap</w:t>
-      </w:r>
-      <w:r>
-        <w:t xml:space="preserve"> </w:t>
-      </w:r>
-      <w:r>
-        <w:t xml:space="preserve">between the two strongest models vanishes under the defensibility-adjusted metric.</w:t>
+        <w:t xml:space="preserve">text, 91% of the strongest model's cross-city errors are judge-defensible, a significant strict-accuracy gap</w:t>
+      </w:r>
+      <w:r>
+        <w:t xml:space="preserve"> </w:t>
+      </w:r>
+      <w:r>
+        <w:t xml:space="preserve">between the two strongest models vanishes under the defensibility-adjusted metric, and repairing training labels</w:t>
+      </w:r>
+      <w:r>
+        <w:t xml:space="preserve"> </w:t>
+      </w:r>
+      <w:r>
+        <w:t xml:space="preserve">with the judge improves pooled cross-jurisdiction transfer (+0.055 over raw labels, +0.041 over a random-relabel</w:t>
+      </w:r>
+      <w:r>
+        <w:t xml:space="preserve"> </w:t>
+      </w:r>
+      <w:r>
+        <w:t xml:space="preserve">control).</w:t>
       </w:r>
     </w:p>
     <w:p>
@@ -3501,7 +3519,7 @@
     </w:p>
     <w:bookmarkEnd w:id="51"/>
     <w:bookmarkEnd w:id="52"/>
-    <w:bookmarkStart w:id="59" w:name="what-the-gap-measures"/>
+    <w:bookmarkStart w:id="60" w:name="what-the-gap-measures"/>
     <w:p>
       <w:pPr>
         <w:pStyle w:val="Heading2"/>
@@ -4064,8 +4082,86 @@
         <w:t xml:space="preserve">ambiguity rather than intuition.</w:t>
       </w:r>
     </w:p>
+    <w:bookmarkStart w:id="59" w:name="repairing-labels-for-training"/>
+    <w:p>
+      <w:pPr>
+        <w:pStyle w:val="Heading3"/>
+      </w:pPr>
+      <w:r>
+        <w:t xml:space="preserve">Repairing labels for training</w:t>
+      </w:r>
+    </w:p>
+    <w:p>
+      <w:pPr>
+        <w:pStyle w:val="FirstParagraph"/>
+      </w:pPr>
+      <w:r>
+        <w:t xml:space="preserve">The judge is also a training signal, which turns the diagnosis into an intervention. For each</w:t>
+      </w:r>
+      <w:r>
+        <w:t xml:space="preserve"> </w:t>
+      </w:r>
+      <w:r>
+        <w:t xml:space="preserve">leave-one-city-out fold we relabel the training requests whose recorded label the judge rejects (12.3% to 13.3%</w:t>
+      </w:r>
+      <w:r>
+        <w:t xml:space="preserve"> </w:t>
+      </w:r>
+      <w:r>
+        <w:t xml:space="preserve">per fold) to a judge-acceptable label, and fine-tune DistilBERT on the repaired pool. Pooled cross-city</w:t>
+      </w:r>
+      <w:r>
+        <w:t xml:space="preserve"> </w:t>
+      </w:r>
+      <w:r>
+        <w:t xml:space="preserve">macro-F1 rises from 0.559 on the raw labels to 0.615 (paired bootstrap +0.055, 95% CI [0.029, 0.080]). The gain</w:t>
+      </w:r>
+      <w:r>
+        <w:t xml:space="preserve"> </w:t>
+      </w:r>
+      <w:r>
+        <w:t xml:space="preserve">is the judge's signal rather than relabeling in itself: relabeling the same rows to a random class instead</w:t>
+      </w:r>
+      <w:r>
+        <w:t xml:space="preserve"> </w:t>
+      </w:r>
+      <w:r>
+        <w:t xml:space="preserve">reaches only 0.573, so the repaired-over-random margin is +0.041 (95% CI [0.018, 0.063]), and the judge</w:t>
+      </w:r>
+      <w:r>
+        <w:t xml:space="preserve"> </w:t>
+      </w:r>
+      <w:r>
+        <w:t xml:space="preserve">condition beats the random control on six of the seven folds. The improvement is a pooled, common-class effect</w:t>
+      </w:r>
+      <w:r>
+        <w:t xml:space="preserve"> </w:t>
+      </w:r>
+      <w:r>
+        <w:t xml:space="preserve">and varies by held-out city, with four of the seven cities improving; it is a pooled gain, not a uniform one.</w:t>
+      </w:r>
+      <w:r>
+        <w:t xml:space="preserve"> </w:t>
+      </w:r>
+      <w:r>
+        <w:t xml:space="preserve">Repairing administrative labels with the protocol therefore produces models that transfer measurably better,</w:t>
+      </w:r>
+      <w:r>
+        <w:t xml:space="preserve"> </w:t>
+      </w:r>
+      <w:r>
+        <w:t xml:space="preserve">and the random-relabel control shows the improvement tracks what the judges certify, not the act of changing</w:t>
+      </w:r>
+      <w:r>
+        <w:t xml:space="preserve"> </w:t>
+      </w:r>
+      <w:r>
+        <w:t xml:space="preserve">labels.</w:t>
+      </w:r>
+    </w:p>
     <w:bookmarkEnd w:id="59"/>
-    <w:bookmarkStart w:id="60" w:name="discussion"/>
+    <w:bookmarkEnd w:id="60"/>
+    <w:bookmarkStart w:id="61" w:name="discussion"/>
     <w:p>
       <w:pPr>
         <w:pStyle w:val="Heading2"/>
@@ -4138,8 +4234,8 @@
         <w:t xml:space="preserve">this way.</w:t>
       </w:r>
     </w:p>
-    <w:bookmarkEnd w:id="60"/>
-    <w:bookmarkStart w:id="61" w:name="limitations-and-scope"/>
+    <w:bookmarkEnd w:id="61"/>
+    <w:bookmarkStart w:id="62" w:name="limitations-and-scope"/>
     <w:p>
       <w:pPr>
         <w:pStyle w:val="Heading2"/>
@@ -4240,8 +4336,8 @@
         <w:t xml:space="preserve">text.</w:t>
       </w:r>
     </w:p>
-    <w:bookmarkEnd w:id="61"/>
-    <w:bookmarkStart w:id="62" w:name="ethics-and-data"/>
+    <w:bookmarkEnd w:id="62"/>
+    <w:bookmarkStart w:id="63" w:name="ethics-and-data"/>
     <w:p>
       <w:pPr>
         <w:pStyle w:val="Heading2"/>
@@ -4300,8 +4396,8 @@
         <w:t xml:space="preserve">enforcement targeting.</w:t>
       </w:r>
     </w:p>
-    <w:bookmarkEnd w:id="62"/>
-    <w:bookmarkStart w:id="64" w:name="reproducibility"/>
+    <w:bookmarkEnd w:id="63"/>
+    <w:bookmarkStart w:id="65" w:name="reproducibility"/>
     <w:p>
       <w:pPr>
         <w:pStyle w:val="Heading2"/>
@@ -4424,7 +4520,7 @@
       <w:r>
         <w:t xml:space="preserve"> </w:t>
       </w:r>
-      <w:hyperlink r:id="rId63">
+      <w:hyperlink r:id="rId64">
         <w:r>
           <w:rPr>
             <w:rStyle w:val="Hyperlink"/>
@@ -4445,8 +4541,8 @@
         <w:t xml:space="preserve">et al.) accompanies the release.</w:t>
       </w:r>
     </w:p>
-    <w:bookmarkEnd w:id="64"/>
-    <w:bookmarkStart w:id="90" w:name="conclusion"/>
+    <w:bookmarkEnd w:id="65"/>
+    <w:bookmarkStart w:id="91" w:name="conclusion"/>
     <w:p>
       <w:pPr>
         <w:pStyle w:val="Heading2"/>
@@ -4496,19 +4592,19 @@
         <w:t xml:space="preserve"> </w:t>
       </w:r>
       <w:r>
-        <w:t xml:space="preserve">confusion fall on the same class boundaries (Spearman 0.75), and that an ambiguity-derived taxonomy removes that</w:t>
-      </w:r>
-      <w:r>
-        <w:t xml:space="preserve"> </w:t>
-      </w:r>
-      <w:r>
-        <w:t xml:space="preserve">ambiguity more efficiently than any equal-size random merge. Run as an audit, it located five real mapping</w:t>
-      </w:r>
-      <w:r>
-        <w:t xml:space="preserve"> </w:t>
-      </w:r>
-      <w:r>
-        <w:t xml:space="preserve">errors in the corpus. The benchmark, its harmonization, and the protocol are released so that any</w:t>
+        <w:t xml:space="preserve">confusion fall on the same class boundaries (Spearman 0.75), and that relabeling judge-rejected training rows</w:t>
+      </w:r>
+      <w:r>
+        <w:t xml:space="preserve"> </w:t>
+      </w:r>
+      <w:r>
+        <w:t xml:space="preserve">improves pooled cross-jurisdiction transfer over both the raw labels and a random-relabel control. Run as an</w:t>
+      </w:r>
+      <w:r>
+        <w:t xml:space="preserve"> </w:t>
+      </w:r>
+      <w:r>
+        <w:t xml:space="preserve">audit, it located five real mapping errors in the corpus. The benchmark, its harmonization, and the protocol are released so that any</w:t>
       </w:r>
       <w:r>
         <w:t xml:space="preserve"> </w:t>
@@ -4524,7 +4620,7 @@
         </w:pict>
       </w:r>
     </w:p>
-    <w:bookmarkStart w:id="89" w:name="references"/>
+    <w:bookmarkStart w:id="90" w:name="references"/>
     <w:p>
       <w:pPr>
         <w:pStyle w:val="Heading3"/>
@@ -4541,7 +4637,7 @@
           <w:numId w:val="1002"/>
         </w:numPr>
       </w:pPr>
-      <w:bookmarkStart w:id="65" w:name="r1"/>
+      <w:bookmarkStart w:id="66" w:name="r1"/>
       <w:r>
         <w:t xml:space="preserve">Hashemi, M. (2022). Automatic Type Detection of 311 Service Requests Based on Customer Provided Descriptions.</w:t>
       </w:r>
@@ -4558,7 +4654,7 @@
       <w:r>
         <w:t xml:space="preserve">, 36(1). doi:10.1080/08839514.2022.2073717.</w:t>
       </w:r>
-      <w:bookmarkEnd w:id="65"/>
+      <w:bookmarkEnd w:id="66"/>
     </w:p>
     <w:p>
       <w:pPr>
@@ -4568,7 +4664,7 @@
           <w:numId w:val="1002"/>
         </w:numPr>
       </w:pPr>
-      <w:bookmarkStart w:id="66" w:name="r2"/>
+      <w:bookmarkStart w:id="67" w:name="r2"/>
       <w:r>
         <w:t xml:space="preserve">Wang, L., Qian, C., Kats, P., Kontokosta, C., &amp; Sobolevsky, S. (2017). Structure of 311 Service Requests as a Signature of Urban Location.</w:t>
       </w:r>
@@ -4585,7 +4681,7 @@
       <w:r>
         <w:t xml:space="preserve">, 12(10):e0186314.</w:t>
       </w:r>
-      <w:bookmarkEnd w:id="66"/>
+      <w:bookmarkEnd w:id="67"/>
     </w:p>
     <w:p>
       <w:pPr>
@@ -4595,11 +4691,11 @@
           <w:numId w:val="1002"/>
         </w:numPr>
       </w:pPr>
-      <w:bookmarkStart w:id="67" w:name="r3"/>
+      <w:bookmarkStart w:id="68" w:name="r3"/>
       <w:r>
         <w:t xml:space="preserve">Sukel, M., Rudinac, S., &amp; Worring, M. (2019). Multimodal Classification of Urban Micro-Events. arXiv:1904.13349.</w:t>
       </w:r>
-      <w:bookmarkEnd w:id="67"/>
+      <w:bookmarkEnd w:id="68"/>
     </w:p>
     <w:p>
       <w:pPr>
@@ -4609,7 +4705,7 @@
           <w:numId w:val="1002"/>
         </w:numPr>
       </w:pPr>
-      <w:bookmarkStart w:id="68" w:name="r4"/>
+      <w:bookmarkStart w:id="69" w:name="r4"/>
       <w:r>
         <w:t xml:space="preserve">Masdeval, C., &amp; Veloso, A. (2015). Mining citizen emotions to estimate the urgency of urban issues.</w:t>
       </w:r>
@@ -4626,7 +4722,7 @@
       <w:r>
         <w:t xml:space="preserve">, 54, 147-155.</w:t>
       </w:r>
-      <w:bookmarkEnd w:id="68"/>
+      <w:bookmarkEnd w:id="69"/>
     </w:p>
     <w:p>
       <w:pPr>
@@ -4636,7 +4732,7 @@
           <w:numId w:val="1002"/>
         </w:numPr>
       </w:pPr>
-      <w:bookmarkStart w:id="69" w:name="r5"/>
+      <w:bookmarkStart w:id="70" w:name="r5"/>
       <w:r>
         <w:t xml:space="preserve">Wang, J., Lan, C., Liu, C., et al. (2023). Generalizing to Unseen Domains: A Survey on Domain Generalization.</w:t>
       </w:r>
@@ -4656,7 +4752,7 @@
       <w:r>
         <w:t xml:space="preserve">(arXiv:2103.03097).</w:t>
       </w:r>
-      <w:bookmarkEnd w:id="69"/>
+      <w:bookmarkEnd w:id="70"/>
     </w:p>
     <w:p>
       <w:pPr>
@@ -4666,11 +4762,11 @@
           <w:numId w:val="1002"/>
         </w:numPr>
       </w:pPr>
-      <w:bookmarkStart w:id="70" w:name="r6"/>
+      <w:bookmarkStart w:id="71" w:name="r6"/>
       <w:r>
         <w:t xml:space="preserve">Yuan, X., et al. (2023). Out-of-Distribution Generalization in Text Classification: Past, Present, and Future. arXiv:2305.14104.</w:t>
       </w:r>
-      <w:bookmarkEnd w:id="70"/>
+      <w:bookmarkEnd w:id="71"/>
     </w:p>
     <w:p>
       <w:pPr>
@@ -4680,7 +4776,7 @@
           <w:numId w:val="1002"/>
         </w:numPr>
       </w:pPr>
-      <w:bookmarkStart w:id="71" w:name="r7"/>
+      <w:bookmarkStart w:id="72" w:name="r7"/>
       <w:r>
         <w:t xml:space="preserve">Northcutt, C. G., Athalye, A., &amp; Mueller, J. (2021). Pervasive Label Errors in Test Sets Destabilize Machine Learning Benchmarks.</w:t>
       </w:r>
@@ -4700,7 +4796,7 @@
       <w:r>
         <w:t xml:space="preserve">(arXiv:2103.14749).</w:t>
       </w:r>
-      <w:bookmarkEnd w:id="71"/>
+      <w:bookmarkEnd w:id="72"/>
     </w:p>
     <w:p>
       <w:pPr>
@@ -4710,7 +4806,7 @@
           <w:numId w:val="1002"/>
         </w:numPr>
       </w:pPr>
-      <w:bookmarkStart w:id="72" w:name="r8"/>
+      <w:bookmarkStart w:id="73" w:name="r8"/>
       <w:r>
         <w:t xml:space="preserve">Gururangan, S., Swayamdipta, S., Levy, O., Schwartz, R., Bowman, S., &amp; Smith, N. A. (2018). Annotation Artifacts in Natural Language Inference Data.</w:t>
       </w:r>
@@ -4730,7 +4826,7 @@
       <w:r>
         <w:t xml:space="preserve">(arXiv:1803.02324).</w:t>
       </w:r>
-      <w:bookmarkEnd w:id="72"/>
+      <w:bookmarkEnd w:id="73"/>
     </w:p>
     <w:p>
       <w:pPr>
@@ -4740,7 +4836,7 @@
           <w:numId w:val="1002"/>
         </w:numPr>
       </w:pPr>
-      <w:bookmarkStart w:id="73" w:name="r9"/>
+      <w:bookmarkStart w:id="74" w:name="r9"/>
       <w:r>
         <w:t xml:space="preserve">Raji, I. D., Bender, E. M., Paullada, A., Denton, E., &amp; Hanna, A. (2021). AI and the Everything in the Whole Wide World Benchmark.</w:t>
       </w:r>
@@ -4760,7 +4856,7 @@
       <w:r>
         <w:t xml:space="preserve">(arXiv:2111.15366).</w:t>
       </w:r>
-      <w:bookmarkEnd w:id="73"/>
+      <w:bookmarkEnd w:id="74"/>
     </w:p>
     <w:p>
       <w:pPr>
@@ -4770,7 +4866,7 @@
           <w:numId w:val="1002"/>
         </w:numPr>
       </w:pPr>
-      <w:bookmarkStart w:id="74" w:name="r10"/>
+      <w:bookmarkStart w:id="75" w:name="r10"/>
       <w:r>
         <w:t xml:space="preserve">Schierholz, M., &amp; Schonlau, M. (2023). Automated occupation coding with hierarchical features.</w:t>
       </w:r>
@@ -4787,7 +4883,7 @@
       <w:r>
         <w:t xml:space="preserve">.</w:t>
       </w:r>
-      <w:bookmarkEnd w:id="74"/>
+      <w:bookmarkEnd w:id="75"/>
     </w:p>
     <w:p>
       <w:pPr>
@@ -4797,7 +4893,7 @@
           <w:numId w:val="1002"/>
         </w:numPr>
       </w:pPr>
-      <w:bookmarkStart w:id="75" w:name="r11"/>
+      <w:bookmarkStart w:id="76" w:name="r11"/>
       <w:r>
         <w:t xml:space="preserve">Yin, W., Hay, J., &amp; Roth, D. (2019). Benchmarking Zero-shot Text Classification: Datasets, Evaluation and Entailment Approach.</w:t>
       </w:r>
@@ -4817,7 +4913,7 @@
       <w:r>
         <w:t xml:space="preserve">(arXiv:1909.00161).</w:t>
       </w:r>
-      <w:bookmarkEnd w:id="75"/>
+      <w:bookmarkEnd w:id="76"/>
     </w:p>
     <w:p>
       <w:pPr>
@@ -4827,11 +4923,11 @@
           <w:numId w:val="1002"/>
         </w:numPr>
       </w:pPr>
-      <w:bookmarkStart w:id="76" w:name="r12"/>
+      <w:bookmarkStart w:id="77" w:name="r12"/>
       <w:r>
         <w:t xml:space="preserve">Bucher, M. J. J., &amp; Martini, M. (2024). Fine-Tuned "Small" LLMs (Still) Significantly Outperform Zero-Shot Generative AI Models in Text Classification. arXiv:2406.08660.</w:t>
       </w:r>
-      <w:bookmarkEnd w:id="76"/>
+      <w:bookmarkEnd w:id="77"/>
     </w:p>
     <w:p>
       <w:pPr>
@@ -4841,11 +4937,11 @@
           <w:numId w:val="1002"/>
         </w:numPr>
       </w:pPr>
-      <w:bookmarkStart w:id="77" w:name="r13"/>
+      <w:bookmarkStart w:id="78" w:name="r13"/>
       <w:r>
         <w:t xml:space="preserve">Kontokosta, C. E., &amp; Hong, B. (2017). Equity in 311 Reporting: Socio-Spatial Differentials in the Propensity to Complain. arXiv:1710.02452.</w:t>
       </w:r>
-      <w:bookmarkEnd w:id="77"/>
+      <w:bookmarkEnd w:id="78"/>
     </w:p>
     <w:p>
       <w:pPr>
@@ -4855,7 +4951,7 @@
           <w:numId w:val="1002"/>
         </w:numPr>
       </w:pPr>
-      <w:bookmarkStart w:id="78" w:name="r14"/>
+      <w:bookmarkStart w:id="79" w:name="r14"/>
       <w:r>
         <w:t xml:space="preserve">Ramponi, A., &amp; Plank, B. (2020). Neural Unsupervised Domain Adaptation in NLP: A Survey.</w:t>
       </w:r>
@@ -4872,7 +4968,7 @@
       <w:r>
         <w:t xml:space="preserve">. aclanthology.org/2020.coling-main.603.</w:t>
       </w:r>
-      <w:bookmarkEnd w:id="78"/>
+      <w:bookmarkEnd w:id="79"/>
     </w:p>
     <w:p>
       <w:pPr>
@@ -4882,7 +4978,7 @@
           <w:numId w:val="1002"/>
         </w:numPr>
       </w:pPr>
-      <w:bookmarkStart w:id="79" w:name="r15"/>
+      <w:bookmarkStart w:id="80" w:name="r15"/>
       <w:r>
         <w:t xml:space="preserve">Plank, B. (2022). The "Problem" of Human Label Variation: On Ground Truth in Data, Modeling and Evaluation.</w:t>
       </w:r>
@@ -4899,7 +4995,7 @@
       <w:r>
         <w:t xml:space="preserve">. arXiv:2211.02570.</w:t>
       </w:r>
-      <w:bookmarkEnd w:id="79"/>
+      <w:bookmarkEnd w:id="80"/>
     </w:p>
     <w:p>
       <w:pPr>
@@ -4909,7 +5005,7 @@
           <w:numId w:val="1002"/>
         </w:numPr>
       </w:pPr>
-      <w:bookmarkStart w:id="80" w:name="r16"/>
+      <w:bookmarkStart w:id="81" w:name="r16"/>
       <w:r>
         <w:t xml:space="preserve">Uma, A., Fornaciari, T., Hovy, D., Paun, S., Plank, B., &amp; Poesio, M. (2021). Learning from Disagreement: A Survey.</w:t>
       </w:r>
@@ -4926,7 +5022,7 @@
       <w:r>
         <w:t xml:space="preserve">, 72, 1385-1470.</w:t>
       </w:r>
-      <w:bookmarkEnd w:id="80"/>
+      <w:bookmarkEnd w:id="81"/>
     </w:p>
     <w:p>
       <w:pPr>
@@ -4936,7 +5032,7 @@
           <w:numId w:val="1002"/>
         </w:numPr>
       </w:pPr>
-      <w:bookmarkStart w:id="81" w:name="r17"/>
+      <w:bookmarkStart w:id="82" w:name="r17"/>
       <w:r>
         <w:t xml:space="preserve">Leonardelli, E., et al. (2023). SemEval-2023 Task 11: Learning with Disagreements (LeWiDi).</w:t>
       </w:r>
@@ -4953,7 +5049,7 @@
       <w:r>
         <w:t xml:space="preserve">. arXiv:2304.14803.</w:t>
       </w:r>
-      <w:bookmarkEnd w:id="81"/>
+      <w:bookmarkEnd w:id="82"/>
     </w:p>
     <w:p>
       <w:pPr>
@@ -4963,7 +5059,7 @@
           <w:numId w:val="1002"/>
         </w:numPr>
       </w:pPr>
-      <w:bookmarkStart w:id="82" w:name="r18"/>
+      <w:bookmarkStart w:id="83" w:name="r18"/>
       <w:r>
         <w:t xml:space="preserve">Nalchigar, S., &amp; Fox, M. S. (2017). Achieving Interoperability of Smart City Data: An Analysis of 311 Data.</w:t>
       </w:r>
@@ -4980,7 +5076,7 @@
       <w:r>
         <w:t xml:space="preserve">, 3(1).</w:t>
       </w:r>
-      <w:bookmarkEnd w:id="82"/>
+      <w:bookmarkEnd w:id="83"/>
     </w:p>
     <w:p>
       <w:pPr>
@@ -4990,7 +5086,7 @@
           <w:numId w:val="1002"/>
         </w:numPr>
       </w:pPr>
-      <w:bookmarkStart w:id="83" w:name="r19"/>
+      <w:bookmarkStart w:id="84" w:name="r19"/>
       <w:r>
         <w:t xml:space="preserve">Mullenbach, J., Wiegreffe, S., Duke, J., Sun, J., &amp; Eisenstein, J. (2018). Explainable Prediction of Medical Codes from Clinical Text.</w:t>
       </w:r>
@@ -5007,7 +5103,7 @@
       <w:r>
         <w:t xml:space="preserve">. arXiv:1802.05695.</w:t>
       </w:r>
-      <w:bookmarkEnd w:id="83"/>
+      <w:bookmarkEnd w:id="84"/>
     </w:p>
     <w:p>
       <w:pPr>
@@ -5017,7 +5113,7 @@
           <w:numId w:val="1002"/>
         </w:numPr>
       </w:pPr>
-      <w:bookmarkStart w:id="84" w:name="r20"/>
+      <w:bookmarkStart w:id="85" w:name="r20"/>
       <w:r>
         <w:t xml:space="preserve">Gweon, H., Schonlau, M., Kaczmirek, L., Blohm, M., &amp; Steiner, S. (2017). Three Methods for Occupation Coding Based on Statistical Learning.</w:t>
       </w:r>
@@ -5034,7 +5130,7 @@
       <w:r>
         <w:t xml:space="preserve">, 33(1), 101-122.</w:t>
       </w:r>
-      <w:bookmarkEnd w:id="84"/>
+      <w:bookmarkEnd w:id="85"/>
     </w:p>
     <w:p>
       <w:pPr>
@@ -5044,7 +5140,7 @@
           <w:numId w:val="1002"/>
         </w:numPr>
       </w:pPr>
-      <w:bookmarkStart w:id="85" w:name="r21"/>
+      <w:bookmarkStart w:id="86" w:name="r21"/>
       <w:r>
         <w:t xml:space="preserve">Gulrajani, I., &amp; Lopez-Paz, D. (2021). In Search of Lost Domain Generalization.</w:t>
       </w:r>
@@ -5061,7 +5157,7 @@
       <w:r>
         <w:t xml:space="preserve">. arXiv:2007.01434.</w:t>
       </w:r>
-      <w:bookmarkEnd w:id="85"/>
+      <w:bookmarkEnd w:id="86"/>
     </w:p>
     <w:p>
       <w:pPr>
@@ -5071,7 +5167,7 @@
           <w:numId w:val="1002"/>
         </w:numPr>
       </w:pPr>
-      <w:bookmarkStart w:id="86" w:name="r22"/>
+      <w:bookmarkStart w:id="87" w:name="r22"/>
       <w:r>
         <w:t xml:space="preserve">Mueller, A., Krone, J., Romeo, S., Mansour, S., Mansimov, E., Zhang, Y., &amp; Roth, D. (2022). Label Semantic Aware Pre-training for Few-shot Text Classification.</w:t>
       </w:r>
@@ -5088,7 +5184,7 @@
       <w:r>
         <w:t xml:space="preserve">. arXiv:2204.07128.</w:t>
       </w:r>
-      <w:bookmarkEnd w:id="86"/>
+      <w:bookmarkEnd w:id="87"/>
     </w:p>
     <w:p>
       <w:pPr>
@@ -5098,7 +5194,7 @@
           <w:numId w:val="1002"/>
         </w:numPr>
       </w:pPr>
-      <w:bookmarkStart w:id="87" w:name="r23"/>
+      <w:bookmarkStart w:id="88" w:name="r23"/>
       <w:r>
         <w:t xml:space="preserve">Aroyo, L., &amp; Welty, C. (2015). Truth Is a Lie: Crowd Truth and the Seven Myths of Human Annotation.</w:t>
       </w:r>
@@ -5115,7 +5211,7 @@
       <w:r>
         <w:t xml:space="preserve">, 36(1), 15-24.</w:t>
       </w:r>
-      <w:bookmarkEnd w:id="87"/>
+      <w:bookmarkEnd w:id="88"/>
     </w:p>
     <w:p>
       <w:pPr>
@@ -5125,7 +5221,7 @@
           <w:numId w:val="1002"/>
         </w:numPr>
       </w:pPr>
-      <w:bookmarkStart w:id="88" w:name="r24"/>
+      <w:bookmarkStart w:id="89" w:name="r24"/>
       <w:r>
         <w:t xml:space="preserve">White, A., &amp; Trump, K. S. (2018). The Promises and Pitfalls of 311 Data.</w:t>
       </w:r>
@@ -5142,7 +5238,7 @@
       <w:r>
         <w:t xml:space="preserve">, 54(4), 794-823.</w:t>
       </w:r>
-      <w:bookmarkEnd w:id="88"/>
+      <w:bookmarkEnd w:id="89"/>
     </w:p>
     <w:p>
       <w:pPr>
@@ -5179,9 +5275,9 @@
         <w:t xml:space="preserve">Crossref, OpenAlex, and arXiv.</w:t>
       </w:r>
     </w:p>
-    <w:bookmarkEnd w:id="89"/>
     <w:bookmarkEnd w:id="90"/>
     <w:bookmarkEnd w:id="91"/>
+    <w:bookmarkEnd w:id="92"/>
     <w:sectPr/>
   </w:body>
 </w:document>

</xml_diff>